<commit_message>
[docs] Uproszcz onboarding.docx - mniej kroków dla usera, prostszy język
- Tylko 6 kroków ręcznych zamiast 9 (usunięto nvm, Homebrew, gh, jq, gh auth login)
- Windsurf + Node.js (ze strony, bez terminala) + jedna komenda npm + claude + prompt
- Homebrew, gh, jq, gh auth login przeniesione do handoff prompta (Claude ogarnie)
- Język przepisany na zrozumiały dla osoby bez wiedzy technicznej
- Zaktualizowany prompt z podziałem: Część A (instalacja narzędzi) + Część B (konfiguracja)

Co-Authored-By: Claude Sonnet 4.6 <noreply@anthropic.com>
</commit_message>
<xml_diff>
--- a/docs/output/onboarding.docx
+++ b/docs/output/onboarding.docx
@@ -42,7 +42,7 @@
           <w:b w:val="0"/>
           <w:sz w:val="20"/>
         </w:rPr>
-        <w:t>Ten dokument przeprowadza przez instalację środowiska pracy z Claude Code. Część 1 to kroki ręczne — wykonaj je samodzielnie. Po dotarciu do Kroku 9 przekazujesz sterowanie Claude, który przeprowadzi Cię przez resztę konfiguracji.</w:t>
+        <w:t>Masz przed sobą 6 kroków. Pierwsze 5 robisz sam — to proste rzeczy: pobranie programów i wpisanie jednej komendy. W kroku 6 wklejasz gotowy tekst do Claude i od tej chwili asystent AI przeprowadza Cię przez wszystko sam.</w:t>
       </w:r>
     </w:p>
     <w:p/>
@@ -60,7 +60,7 @@
           <w:color w:val="1F497D"/>
           <w:sz w:val="28"/>
         </w:rPr>
-        <w:t>Część 1 — Instalacja  (wykonaj ręcznie)</w:t>
+        <w:t>Część 1 — Zrób to sam  (6 prostych kroków)</w:t>
       </w:r>
     </w:p>
     <w:p>
@@ -118,7 +118,7 @@
           <w:color w:val="505050"/>
           <w:sz w:val="20"/>
         </w:rPr>
-        <w:t>Windsurf to edytor kodu (IDE). Pobierz instalator, uruchom i zainstaluj.</w:t>
+        <w:t>Windsurf to program, w którym będziesz pracować z asystentem AI. Wejdź na poniższą stronę, pobierz plik instalacyjny i zainstaluj go tak jak każdy inny program na Macu (kliknij, przeciągnij do Applications).</w:t>
       </w:r>
     </w:p>
     <w:p>
@@ -133,7 +133,7 @@
           <w:b w:val="0"/>
           <w:sz w:val="18"/>
         </w:rPr>
-        <w:t>https://windsurf.com/download</w:t>
+        <w:t>windsurf.com/download</w:t>
       </w:r>
     </w:p>
     <w:p>
@@ -176,7 +176,7 @@
           <w:b/>
           <w:sz w:val="24"/>
         </w:rPr>
-        <w:t>Krok 2 — Zainstaluj nvm i Node.js</w:t>
+        <w:t>Krok 2 — Pobierz i zainstaluj Node.js</w:t>
       </w:r>
     </w:p>
     <w:p>
@@ -191,7 +191,7 @@
           <w:color w:val="505050"/>
           <w:sz w:val="20"/>
         </w:rPr>
-        <w:t>nvm to menedżer wersji Node.js. Uruchom w terminalu systemowym (nie w Windsurf). Po instalacji ZAMKNIJ terminal i otwórz ponownie.</w:t>
+        <w:t>Node.js to silnik, którego Claude potrzebuje żeby w ogóle ruszyć. Wejdź na stronę poniżej, kliknij zielony przycisk "LTS" i zainstaluj pobrany plik tak jak poprzednio.</w:t>
       </w:r>
     </w:p>
     <w:p>
@@ -206,52 +206,7 @@
           <w:b w:val="0"/>
           <w:sz w:val="18"/>
         </w:rPr>
-        <w:t>curl -o- https://raw.githubusercontent.com/nvm-sh/nvm/v0.39.7/install.sh | bash</w:t>
-      </w:r>
-    </w:p>
-    <w:p>
-      <w:pPr>
-        <w:spacing w:before="20" w:after="20"/>
-        <w:ind w:left="680"/>
-        <w:shd w:val="clear" w:color="auto" w:fill="F0F0F0"/>
-      </w:pPr>
-      <w:r>
-        <w:rPr>
-          <w:rFonts w:ascii="Courier New" w:hAnsi="Courier New"/>
-          <w:b w:val="0"/>
-          <w:sz w:val="18"/>
-        </w:rPr>
-        <w:t># Po ponownym otwarciu terminala:</w:t>
-      </w:r>
-    </w:p>
-    <w:p>
-      <w:pPr>
-        <w:spacing w:before="20" w:after="20"/>
-        <w:ind w:left="680"/>
-        <w:shd w:val="clear" w:color="auto" w:fill="F0F0F0"/>
-      </w:pPr>
-      <w:r>
-        <w:rPr>
-          <w:rFonts w:ascii="Courier New" w:hAnsi="Courier New"/>
-          <w:b w:val="0"/>
-          <w:sz w:val="18"/>
-        </w:rPr>
-        <w:t>nvm install --lts</w:t>
-      </w:r>
-    </w:p>
-    <w:p>
-      <w:pPr>
-        <w:spacing w:before="20" w:after="20"/>
-        <w:ind w:left="680"/>
-        <w:shd w:val="clear" w:color="auto" w:fill="F0F0F0"/>
-      </w:pPr>
-      <w:r>
-        <w:rPr>
-          <w:rFonts w:ascii="Courier New" w:hAnsi="Courier New"/>
-          <w:b w:val="0"/>
-          <w:sz w:val="18"/>
-        </w:rPr>
-        <w:t>node --version    # powinien pokazać v22.x.x lub wyżej</w:t>
+        <w:t>nodejs.org  →  kliknij zielony przycisk LTS</w:t>
       </w:r>
     </w:p>
     <w:p>
@@ -294,7 +249,7 @@
           <w:b/>
           <w:sz w:val="24"/>
         </w:rPr>
-        <w:t>Krok 3 — Zainstaluj Homebrew</w:t>
+        <w:t>Krok 3 — Otwórz Windsurf i wpisz jedną komendę</w:t>
       </w:r>
     </w:p>
     <w:p>
@@ -309,153 +264,7 @@
           <w:color w:val="505050"/>
           <w:sz w:val="20"/>
         </w:rPr>
-        <w:t>Homebrew to menedżer pakietów dla macOS. Potrzebny do instalacji gh i jq.</w:t>
-      </w:r>
-    </w:p>
-    <w:p>
-      <w:pPr>
-        <w:spacing w:before="20" w:after="20"/>
-        <w:ind w:left="680"/>
-        <w:shd w:val="clear" w:color="auto" w:fill="F0F0F0"/>
-      </w:pPr>
-      <w:r>
-        <w:rPr>
-          <w:rFonts w:ascii="Courier New" w:hAnsi="Courier New"/>
-          <w:b w:val="0"/>
-          <w:sz w:val="18"/>
-        </w:rPr>
-        <w:t>/bin/bash -c "$(curl -fsSL https://raw.githubusercontent.com/Homebrew/install/HEAD/install.sh)"</w:t>
-      </w:r>
-    </w:p>
-    <w:p>
-      <w:pPr>
-        <w:spacing w:before="200" w:after="40"/>
-        <w:ind w:left="0"/>
-      </w:pPr>
-      <w:r>
-        <w:fldChar w:fldCharType="begin">
-          <w:ffData>
-            <w:name w:val=""/>
-            <w:enabled/>
-            <w:calcOnExit w:val="0"/>
-            <w:checkBox>
-              <w:sizeAuto/>
-              <w:default w:val="0"/>
-              <w:checked w:val="0"/>
-            </w:checkBox>
-          </w:ffData>
-        </w:fldChar>
-      </w:r>
-      <w:r>
-        <w:instrText xml:space="preserve"> FORMCHECKBOX </w:instrText>
-      </w:r>
-      <w:r>
-        <w:fldChar w:fldCharType="separate"/>
-      </w:r>
-      <w:r>
-        <w:fldChar w:fldCharType="end"/>
-      </w:r>
-      <w:r>
-        <w:rPr>
-          <w:sz w:val="22"/>
-        </w:rPr>
-        <w:t xml:space="preserve">  </w:t>
-      </w:r>
-      <w:r>
-        <w:rPr>
-          <w:rFonts w:ascii="Calibri" w:hAnsi="Calibri"/>
-          <w:b/>
-          <w:sz w:val="24"/>
-        </w:rPr>
-        <w:t>Krok 4 — Zainstaluj gh i jq</w:t>
-      </w:r>
-    </w:p>
-    <w:p>
-      <w:pPr>
-        <w:spacing w:before="40" w:after="40"/>
-        <w:ind w:left="680"/>
-      </w:pPr>
-      <w:r>
-        <w:rPr>
-          <w:rFonts w:ascii="Calibri" w:hAnsi="Calibri"/>
-          <w:b w:val="0"/>
-          <w:color w:val="505050"/>
-          <w:sz w:val="20"/>
-        </w:rPr>
-        <w:t>gh = GitHub CLI (tworzenie repozytoriów). jq = narzędzie do JSON (status line Claude).</w:t>
-      </w:r>
-    </w:p>
-    <w:p>
-      <w:pPr>
-        <w:spacing w:before="20" w:after="20"/>
-        <w:ind w:left="680"/>
-        <w:shd w:val="clear" w:color="auto" w:fill="F0F0F0"/>
-      </w:pPr>
-      <w:r>
-        <w:rPr>
-          <w:rFonts w:ascii="Courier New" w:hAnsi="Courier New"/>
-          <w:b w:val="0"/>
-          <w:sz w:val="18"/>
-        </w:rPr>
-        <w:t>brew install gh jq</w:t>
-      </w:r>
-    </w:p>
-    <w:p>
-      <w:pPr>
-        <w:spacing w:before="200" w:after="40"/>
-        <w:ind w:left="0"/>
-      </w:pPr>
-      <w:r>
-        <w:fldChar w:fldCharType="begin">
-          <w:ffData>
-            <w:name w:val=""/>
-            <w:enabled/>
-            <w:calcOnExit w:val="0"/>
-            <w:checkBox>
-              <w:sizeAuto/>
-              <w:default w:val="0"/>
-              <w:checked w:val="0"/>
-            </w:checkBox>
-          </w:ffData>
-        </w:fldChar>
-      </w:r>
-      <w:r>
-        <w:instrText xml:space="preserve"> FORMCHECKBOX </w:instrText>
-      </w:r>
-      <w:r>
-        <w:fldChar w:fldCharType="separate"/>
-      </w:r>
-      <w:r>
-        <w:fldChar w:fldCharType="end"/>
-      </w:r>
-      <w:r>
-        <w:rPr>
-          <w:sz w:val="22"/>
-        </w:rPr>
-        <w:t xml:space="preserve">  </w:t>
-      </w:r>
-      <w:r>
-        <w:rPr>
-          <w:rFonts w:ascii="Calibri" w:hAnsi="Calibri"/>
-          <w:b/>
-          <w:sz w:val="24"/>
-        </w:rPr>
-        <w:t>Krok 5 — Zainstaluj Claude Code CLI</w:t>
-      </w:r>
-    </w:p>
-    <w:p>
-      <w:pPr>
-        <w:spacing w:before="40" w:after="40"/>
-        <w:ind w:left="680"/>
-      </w:pPr>
-      <w:r>
-        <w:rPr>
-          <w:rFonts w:ascii="Calibri" w:hAnsi="Calibri"/>
-          <w:b w:val="0"/>
-          <w:color w:val="505050"/>
-          <w:sz w:val="20"/>
-        </w:rPr>
-        <w:t>Claude Code to asystent AI działający w terminalu. Instalacja przez npm.</w:t>
+        <w:t>Uruchom Windsurf. Na dole ekranu zobaczysz czarne okienko — to "terminal", miejsce gdzie wpisujesz polecenia. Kliknij w to okienko, wpisz poniższe i naciśnij Enter. Poczekaj aż skończy (może chwilę potrwać).</w:t>
       </w:r>
     </w:p>
     <w:p>
@@ -513,7 +322,7 @@
           <w:b/>
           <w:sz w:val="24"/>
         </w:rPr>
-        <w:t>Krok 6 — Otwórz folder Onboarding w Windsurf</w:t>
+        <w:t>Krok 4 — Otwórz folder Onboarding w Windsurf</w:t>
       </w:r>
     </w:p>
     <w:p>
@@ -528,7 +337,7 @@
           <w:color w:val="505050"/>
           <w:sz w:val="20"/>
         </w:rPr>
-        <w:t>W Windsurf: File → Open Folder → wybierz folder Onboarding (ten który właśnie czytasz).</w:t>
+        <w:t>W Windsurf kliknij u góry: File → Open Folder, a potem wskaż folder Onboarding — ten, który właśnie masz.</w:t>
       </w:r>
     </w:p>
     <w:p>
@@ -571,7 +380,7 @@
           <w:b/>
           <w:sz w:val="24"/>
         </w:rPr>
-        <w:t>Krok 7 — Uruchom Claude Code i zaloguj się</w:t>
+        <w:t>Krok 5 — Uruchom Claude i zaloguj się</w:t>
       </w:r>
     </w:p>
     <w:p>
@@ -586,7 +395,7 @@
           <w:color w:val="505050"/>
           <w:sz w:val="20"/>
         </w:rPr>
-        <w:t>Otwórz terminal w Windsurf: Ctrl+` (backtick). Uruchom claude — otworzy przeglądarkę do logowania przez konto Anthropic.</w:t>
+        <w:t>W czarnym okienku (terminal) wpisz claude i naciśnij Enter. Otworzy się przeglądarka — zaloguj się przez swoje konto Anthropic. Wróć do Windsurf. Claude czeka na Ciebie w terminalu.</w:t>
       </w:r>
     </w:p>
     <w:p>
@@ -644,7 +453,7 @@
           <w:b/>
           <w:sz w:val="24"/>
         </w:rPr>
-        <w:t>Krok 8 — Zaloguj się do GitHub CLI</w:t>
+        <w:t>Krok 6 — Wklej prompt z Części 2 — i gotowe!</w:t>
       </w:r>
     </w:p>
     <w:p>
@@ -659,80 +468,7 @@
           <w:color w:val="505050"/>
           <w:sz w:val="20"/>
         </w:rPr>
-        <w:t>Potrzebne do tworzenia repozytoriów przez /setup-new-project. Wybierz: GitHub.com → HTTPS → zaloguj przez przeglądarkę.</w:t>
-      </w:r>
-    </w:p>
-    <w:p>
-      <w:pPr>
-        <w:spacing w:before="20" w:after="20"/>
-        <w:ind w:left="680"/>
-        <w:shd w:val="clear" w:color="auto" w:fill="F0F0F0"/>
-      </w:pPr>
-      <w:r>
-        <w:rPr>
-          <w:rFonts w:ascii="Courier New" w:hAnsi="Courier New"/>
-          <w:b w:val="0"/>
-          <w:sz w:val="18"/>
-        </w:rPr>
-        <w:t>gh auth login</w:t>
-      </w:r>
-    </w:p>
-    <w:p>
-      <w:pPr>
-        <w:spacing w:before="200" w:after="40"/>
-        <w:ind w:left="0"/>
-      </w:pPr>
-      <w:r>
-        <w:fldChar w:fldCharType="begin">
-          <w:ffData>
-            <w:name w:val=""/>
-            <w:enabled/>
-            <w:calcOnExit w:val="0"/>
-            <w:checkBox>
-              <w:sizeAuto/>
-              <w:default w:val="0"/>
-              <w:checked w:val="0"/>
-            </w:checkBox>
-          </w:ffData>
-        </w:fldChar>
-      </w:r>
-      <w:r>
-        <w:instrText xml:space="preserve"> FORMCHECKBOX </w:instrText>
-      </w:r>
-      <w:r>
-        <w:fldChar w:fldCharType="separate"/>
-      </w:r>
-      <w:r>
-        <w:fldChar w:fldCharType="end"/>
-      </w:r>
-      <w:r>
-        <w:rPr>
-          <w:sz w:val="22"/>
-        </w:rPr>
-        <w:t xml:space="preserve">  </w:t>
-      </w:r>
-      <w:r>
-        <w:rPr>
-          <w:rFonts w:ascii="Calibri" w:hAnsi="Calibri"/>
-          <w:b/>
-          <w:sz w:val="24"/>
-        </w:rPr>
-        <w:t>Krok 9 — Wklej prompt do Claude — resztą zajmie się AI</w:t>
-      </w:r>
-    </w:p>
-    <w:p>
-      <w:pPr>
-        <w:spacing w:before="40" w:after="40"/>
-        <w:ind w:left="680"/>
-      </w:pPr>
-      <w:r>
-        <w:rPr>
-          <w:rFonts w:ascii="Calibri" w:hAnsi="Calibri"/>
-          <w:b w:val="0"/>
-          <w:color w:val="505050"/>
-          <w:sz w:val="20"/>
-        </w:rPr>
-        <w:t>Skopiuj prompt z Części 2 poniżej i wklej go do terminala Windsurf gdzie działa Claude. Claude przeprowadzi Cię przez całą konfigurację.</w:t>
+        <w:t>To ostatni krok który robisz sam. Skopiuj cały tekst z niebieskiej ramki na następnej stronie, wklej go do terminala w Windsurf (Ctrl+V lub kliknij prawym → Paste) i naciśnij Enter. Od tej chwili Claude przejmuje stery i przeprowadza Cię przez całą resztę krok po kroku.</w:t>
       </w:r>
     </w:p>
     <w:p>
@@ -755,7 +491,7 @@
           <w:color w:val="1F497D"/>
           <w:sz w:val="28"/>
         </w:rPr>
-        <w:t>Część 2 — Prompt dla Claude</w:t>
+        <w:t>Część 2 — Tekst do wklejenia do Claude</w:t>
       </w:r>
     </w:p>
     <w:p>
@@ -765,7 +501,7 @@
           <w:b w:val="0"/>
           <w:sz w:val="20"/>
         </w:rPr>
-        <w:t>Skopiuj poniższy prompt i wklej do terminala Windsurf gdzie działa Claude Code (Ctrl+V lub kliknij prawym → Paste). Od tego momentu Claude przeprowadza Cię przez całą konfigurację interaktywnie.</w:t>
+        <w:t>Zaznacz cały tekst w niebieskiej ramce poniżej (kliknij i Ctrl+A lub zaznacz myszką), skopiuj (Ctrl+C), a potem wklej do czarnego okienka w Windsurf gdzie działa Claude (Ctrl+V lub kliknij prawym → Paste). Naciśnij Enter. Claude zacznie rozmawiać z Tobą i przeprowadzi Cię przez całą resztę konfiguracji — krok po kroku, po polsku.</w:t>
       </w:r>
     </w:p>
     <w:p/>
@@ -792,49 +528,82 @@
         <w:br/>
         <w:t>Jestem nowym użytkownikiem. Właśnie zainstalowałem Windsurf i Claude Code CLI,</w:t>
         <w:br/>
-        <w:t>jestem zalogowany i pracuję w folderze Onboarding który zawiera setup/ z plikami</w:t>
+        <w:t>jestem zalogowany. Pracuję w folderze Onboarding — zawiera podfolder setup/</w:t>
         <w:br/>
-        <w:t>do skopiowania.</w:t>
+        <w:t>z gotowymi plikami do skopiowania.</w:t>
         <w:br/>
         <w:br/>
-        <w:t>Przeprowadź mnie kolejno przez każdy krok. Na każdym kroku:</w:t>
+        <w:t>Zasady dla każdego kroku:</w:t>
         <w:br/>
-        <w:t>- wyjaśnij krótko co robimy i dlaczego</w:t>
+        <w:t>- Tłumacz prosto, bez żargonu technicznego — jakbyś mówił do osoby która</w:t>
         <w:br/>
-        <w:t>- podaj dokładną komendę</w:t>
+        <w:t xml:space="preserve">  nigdy nie programowała</w:t>
         <w:br/>
-        <w:t>- poczekaj aż powiem "gotowe" zanim przejdziesz dalej</w:t>
+        <w:t>- Podawaj JEDNĄ komendę na raz</w:t>
         <w:br/>
-        <w:t>- sprawdź że krok się powiódł</w:t>
+        <w:t>- Czekaj aż powiem "gotowe" zanim przejdziesz do następnego kroku</w:t>
+        <w:br/>
+        <w:t>- Po każdym kroku sprawdź czy zadziałało</w:t>
         <w:br/>
         <w:br/>
-        <w:t>Kroki:</w:t>
-        <w:br/>
-        <w:t>1. Utwórz strukturę ~/.claude/skills/, ~/.claude/hooks/, ~/.claude/memory/</w:t>
-        <w:br/>
-        <w:t>2. Skopiuj foldery setup/skills/ do ~/.claude/skills/ (state-start, catchup, setup-new-project)</w:t>
-        <w:br/>
-        <w:t>3. Skopiuj setup/hooks/security-scan.py do ~/.claude/hooks/ i chmod +x</w:t>
-        <w:br/>
-        <w:t>4. Skopiuj setup/statusline-command.sh do ~/.claude/ i chmod +x</w:t>
-        <w:br/>
-        <w:t>5. Wygeneruj ~/.claude/settings.json z konfiguracją hooka i status line (użyj $HOME)</w:t>
-        <w:br/>
-        <w:t>6. Zapytaj mnie o: język pracy z AI, GitHub username, ścieżkę do projektów.</w:t>
-        <w:br/>
-        <w:t xml:space="preserve">   Skopiuj setup/global-claude-template.md do ~/.claude/CLAUDE.md i wypełnij wartości.</w:t>
-        <w:br/>
-        <w:t>7. W ~/.claude/skills/setup-new-project/SKILL.md zamień GITHUB_USERNAME na mój username.</w:t>
-        <w:br/>
-        <w:t>8. Zweryfikuj setup: sprawdź pliki, cat ~/.claude/settings.json, test /state-start.</w:t>
+        <w:t>CZĘŚĆ A — Instalacja brakujących narzędzi</w:t>
         <w:br/>
         <w:br/>
-        <w:t>Na końcu powiedz jak skopiować folder Onboarding jako template dla pierwszego projektu</w:t>
+        <w:t>1. Sprawdź czy mam Homebrew (brew --version). Jeśli nie — zainstaluj.</w:t>
         <w:br/>
-        <w:t>i uruchomić /setup-new-project.</w:t>
+        <w:t xml:space="preserve">   (Homebrew to sklep z narzędziami dla Maca, będzie potrzebny za chwilę)</w:t>
+        <w:br/>
+        <w:t>2. Zainstaluj gh i jq: brew install gh jq</w:t>
+        <w:br/>
+        <w:t xml:space="preserve">   (gh = logowanie do GitHub, jq = pomocnik do plików konfiguracyjnych)</w:t>
+        <w:br/>
+        <w:t>3. Zaloguj mnie do GitHub: gh auth login</w:t>
+        <w:br/>
+        <w:t xml:space="preserve">   Wybierz: GitHub.com → HTTPS → zaloguj przez przeglądarkę</w:t>
         <w:br/>
         <w:br/>
-        <w:t>Pełny prompt z opisem kroków: setup/onboarding-prompt.md</w:t>
+        <w:t>CZĘŚĆ B — Konfiguracja Claude</w:t>
+        <w:br/>
+        <w:br/>
+        <w:t>4. Utwórz foldery: ~/.claude/skills/  ~/.claude/hooks/  ~/.claude/memory/</w:t>
+        <w:br/>
+        <w:t>5. Skopiuj skille z setup/skills/ do ~/.claude/skills/</w:t>
+        <w:br/>
+        <w:t xml:space="preserve">   (state-start, catchup, setup-new-project)</w:t>
+        <w:br/>
+        <w:t>6. Skopiuj security hook: setup/hooks/security-scan.py → ~/.claude/hooks/ + chmod +x</w:t>
+        <w:br/>
+        <w:t>7. Skopiuj status line: setup/statusline-command.sh → ~/.claude/ + chmod +x</w:t>
+        <w:br/>
+        <w:t>8. Wygeneruj ~/.claude/settings.json z konfiguracją hooka i status line</w:t>
+        <w:br/>
+        <w:t xml:space="preserve">   (użyj $HOME zamiast ~ przy ścieżkach — to ważne)</w:t>
+        <w:br/>
+        <w:t>9. Zapytaj mnie o:</w:t>
+        <w:br/>
+        <w:t xml:space="preserve">   - język pracy z AI (np. polski / angielski)</w:t>
+        <w:br/>
+        <w:t xml:space="preserve">   - mój GitHub username</w:t>
+        <w:br/>
+        <w:t xml:space="preserve">   - gdzie trzymam projekty (np. ~/Projects/)</w:t>
+        <w:br/>
+        <w:t xml:space="preserve">   Skopiuj setup/global-claude-template.md → ~/.claude/CLAUDE.md</w:t>
+        <w:br/>
+        <w:t xml:space="preserve">   i zastąp wszystkie znaczniki [[...]] moimi danymi</w:t>
+        <w:br/>
+        <w:t>10. W ~/.claude/skills/setup-new-project/SKILL.md zamień GITHUB_USERNAME</w:t>
+        <w:br/>
+        <w:t xml:space="preserve">    na mój GitHub username</w:t>
+        <w:br/>
+        <w:t>11. Weryfikacja: pokaż listę plików, wyświetl settings.json, przetestuj /state-start</w:t>
+        <w:br/>
+        <w:br/>
+        <w:t>Na końcu powiedz mi jak stworzyć swój pierwszy projekt korzystając z tego folderu</w:t>
+        <w:br/>
+        <w:t>jako szablonu i jak uruchomić /setup-new-project.</w:t>
+        <w:br/>
+        <w:br/>
+        <w:t>Pełny opis każdego kroku znajdziesz w: setup/onboarding-prompt.md</w:t>
       </w:r>
     </w:p>
     <w:p>
@@ -848,7 +617,7 @@
           <w:color w:val="808080"/>
           <w:sz w:val="18"/>
         </w:rPr>
-        <w:t>Pełna wersja prompta z opisem każdego kroku: setup/onboarding-prompt.md</w:t>
+        <w:t>Szczegółowy opis każdego kroku konfiguracji: setup/onboarding-prompt.md</w:t>
       </w:r>
     </w:p>
     <w:sectPr>

</xml_diff>

<commit_message>
[docs] Przepisz onboarding.docx - screenshoty, mockupy, język dla dzieci
- Realne screenshoty windsurf.com i nodejs.org (robione przy generowaniu)
- Mockup Windsurf IDE pokazujący gdzie jest terminal (z czerwoną strzałką)
- Mockup terminala z komendami npm install i claude
- Każdy krok rozbity na szczegółowe pod-punkty (bez żargonu)
- Język: "ciemne okienko" zamiast "terminal", "silnik" zamiast "runtime" itp.
- Czerwone banery z adnotacjami na screenshotach
- Pillow auto-instaluje się przy pierwszym uruchomieniu

Co-Authored-By: Claude Sonnet 4.6 <noreply@anthropic.com>
</commit_message>
<xml_diff>
--- a/docs/output/onboarding.docx
+++ b/docs/output/onboarding.docx
@@ -11,6 +11,7 @@
         <w:rPr>
           <w:rFonts w:ascii="Calibri" w:hAnsi="Calibri"/>
           <w:b/>
+          <w:i w:val="0"/>
           <w:color w:val="1F497D"/>
           <w:sz w:val="40"/>
         </w:rPr>
@@ -19,13 +20,14 @@
     </w:p>
     <w:p>
       <w:pPr>
-        <w:spacing w:after="320"/>
+        <w:spacing w:after="280"/>
         <w:jc w:val="center"/>
       </w:pPr>
       <w:r>
         <w:rPr>
           <w:rFonts w:ascii="Calibri" w:hAnsi="Calibri"/>
           <w:b w:val="0"/>
+          <w:i w:val="0"/>
           <w:color w:val="808080"/>
           <w:sz w:val="22"/>
         </w:rPr>
@@ -34,21 +36,22 @@
     </w:p>
     <w:p>
       <w:pPr>
-        <w:spacing w:after="80"/>
+        <w:spacing w:after="120"/>
       </w:pPr>
       <w:r>
         <w:rPr>
           <w:rFonts w:ascii="Calibri" w:hAnsi="Calibri"/>
           <w:b w:val="0"/>
+          <w:i w:val="0"/>
           <w:sz w:val="20"/>
         </w:rPr>
-        <w:t>Masz przed sobą 6 kroków. Pierwsze 5 robisz sam — to proste rzeczy: pobranie programów i wpisanie jednej komendy. W kroku 6 wklejasz gotowy tekst do Claude i od tej chwili asystent AI przeprowadza Cię przez wszystko sam.</w:t>
+        <w:t>Masz przed sobą 6 prostych kroków. Nie musisz wiedzieć nic o programowaniu — wystarczy klikać i wpisywać dokładnie to co widzisz. Po 6. kroku Claude (asystent AI) przejmuje i prowadzi Cię przez resztę po polsku.</w:t>
       </w:r>
     </w:p>
     <w:p/>
     <w:p>
       <w:pPr>
-        <w:spacing w:before="320" w:after="120"/>
+        <w:spacing w:before="280" w:after="120"/>
         <w:pBdr>
           <w:bottom w:val="single" w:sz="6" w:space="1" w:color="1F497D"/>
         </w:pBdr>
@@ -57,16 +60,16 @@
         <w:rPr>
           <w:rFonts w:ascii="Calibri" w:hAnsi="Calibri"/>
           <w:b/>
+          <w:i w:val="0"/>
           <w:color w:val="1F497D"/>
           <w:sz w:val="28"/>
         </w:rPr>
-        <w:t>Część 1 — Zrób to sam  (6 prostych kroków)</w:t>
+        <w:t>Część 1 — Zrób to sam  (6 kroków)</w:t>
       </w:r>
     </w:p>
     <w:p>
       <w:pPr>
-        <w:spacing w:before="200" w:after="40"/>
-        <w:ind w:left="0"/>
+        <w:spacing w:before="240" w:after="60"/>
       </w:pPr>
       <w:r>
         <w:fldChar w:fldCharType="begin">
@@ -92,54 +95,294 @@
         <w:fldChar w:fldCharType="end"/>
       </w:r>
       <w:r>
-        <w:rPr>
-          <w:sz w:val="22"/>
-        </w:rPr>
         <w:t xml:space="preserve">  </w:t>
       </w:r>
       <w:r>
         <w:rPr>
           <w:rFonts w:ascii="Calibri" w:hAnsi="Calibri"/>
           <w:b/>
+          <w:i w:val="0"/>
           <w:sz w:val="24"/>
         </w:rPr>
-        <w:t>Krok 1 — Pobierz i zainstaluj Windsurf</w:t>
+        <w:t>Krok 1 — Zainstaluj Windsurf</w:t>
       </w:r>
     </w:p>
     <w:p>
       <w:pPr>
-        <w:spacing w:before="40" w:after="40"/>
+        <w:spacing w:before="40" w:after="80"/>
         <w:ind w:left="680"/>
       </w:pPr>
       <w:r>
         <w:rPr>
           <w:rFonts w:ascii="Calibri" w:hAnsi="Calibri"/>
           <w:b w:val="0"/>
-          <w:color w:val="505050"/>
+          <w:i w:val="0"/>
+          <w:color w:val="464646"/>
           <w:sz w:val="20"/>
         </w:rPr>
-        <w:t>Windsurf to program, w którym będziesz pracować z asystentem AI. Wejdź na poniższą stronę, pobierz plik instalacyjny i zainstaluj go tak jak każdy inny program na Macu (kliknij, przeciągnij do Applications).</w:t>
+        <w:t>Windsurf to program, w którym będziesz pracować razem z asystentem AI. Musisz go zainstalować jak każdy inny program na Macu.</w:t>
       </w:r>
     </w:p>
     <w:p>
       <w:pPr>
-        <w:spacing w:before="20" w:after="20"/>
-        <w:ind w:left="680"/>
-        <w:shd w:val="clear" w:color="auto" w:fill="F0F0F0"/>
+        <w:spacing w:before="20" w:after="40"/>
+        <w:ind w:left="850" w:hanging="227"/>
       </w:pPr>
       <w:r>
         <w:rPr>
-          <w:rFonts w:ascii="Courier New" w:hAnsi="Courier New"/>
+          <w:rFonts w:ascii="Calibri" w:hAnsi="Calibri"/>
+          <w:b/>
+          <w:i w:val="0"/>
+          <w:color w:val="1F497D"/>
+          <w:sz w:val="20"/>
+        </w:rPr>
+        <w:t xml:space="preserve">1.  </w:t>
+      </w:r>
+      <w:r>
+        <w:rPr>
+          <w:rFonts w:ascii="Calibri" w:hAnsi="Calibri"/>
           <w:b w:val="0"/>
-          <w:sz w:val="18"/>
+          <w:i w:val="0"/>
+          <w:sz w:val="20"/>
         </w:rPr>
-        <w:t>windsurf.com/download</w:t>
+        <w:t>Otwórz przeglądarkę na Macu (Safari, Chrome — cokolwiek masz).</w:t>
       </w:r>
     </w:p>
     <w:p>
       <w:pPr>
-        <w:spacing w:before="200" w:after="40"/>
-        <w:ind w:left="0"/>
+        <w:spacing w:before="20" w:after="40"/>
+        <w:ind w:left="850" w:hanging="227"/>
+      </w:pPr>
+      <w:r>
+        <w:rPr>
+          <w:rFonts w:ascii="Calibri" w:hAnsi="Calibri"/>
+          <w:b/>
+          <w:i w:val="0"/>
+          <w:color w:val="1F497D"/>
+          <w:sz w:val="20"/>
+        </w:rPr>
+        <w:t xml:space="preserve">2.  </w:t>
+      </w:r>
+      <w:r>
+        <w:rPr>
+          <w:rFonts w:ascii="Calibri" w:hAnsi="Calibri"/>
+          <w:b w:val="0"/>
+          <w:i w:val="0"/>
+          <w:sz w:val="20"/>
+        </w:rPr>
+        <w:t>W pasku adresu u góry wpisz: windsurf.com  i naciśnij Enter.</w:t>
+      </w:r>
+    </w:p>
+    <w:p>
+      <w:pPr>
+        <w:spacing w:before="20" w:after="40"/>
+        <w:ind w:left="850" w:hanging="227"/>
+      </w:pPr>
+      <w:r>
+        <w:rPr>
+          <w:rFonts w:ascii="Calibri" w:hAnsi="Calibri"/>
+          <w:b/>
+          <w:i w:val="0"/>
+          <w:color w:val="1F497D"/>
+          <w:sz w:val="20"/>
+        </w:rPr>
+        <w:t xml:space="preserve">3.  </w:t>
+      </w:r>
+      <w:r>
+        <w:rPr>
+          <w:rFonts w:ascii="Calibri" w:hAnsi="Calibri"/>
+          <w:b w:val="0"/>
+          <w:i w:val="0"/>
+          <w:sz w:val="20"/>
+        </w:rPr>
+        <w:t>Na stronie zobaczysz przycisk do pobierania — kliknij go (może się nazywać "Download for macOS" lub "Download for Mac").</w:t>
+      </w:r>
+    </w:p>
+    <w:p>
+      <w:pPr>
+        <w:spacing w:before="20" w:after="40"/>
+        <w:ind w:left="850" w:hanging="227"/>
+      </w:pPr>
+      <w:r>
+        <w:rPr>
+          <w:rFonts w:ascii="Calibri" w:hAnsi="Calibri"/>
+          <w:b/>
+          <w:i w:val="0"/>
+          <w:color w:val="1F497D"/>
+          <w:sz w:val="20"/>
+        </w:rPr>
+        <w:t xml:space="preserve">4.  </w:t>
+      </w:r>
+      <w:r>
+        <w:rPr>
+          <w:rFonts w:ascii="Calibri" w:hAnsi="Calibri"/>
+          <w:b w:val="0"/>
+          <w:i w:val="0"/>
+          <w:sz w:val="20"/>
+        </w:rPr>
+        <w:t>Poczekaj chwilę — plik pobierze się do folderu Pobrane (Downloads). Zobaczysz go na dole okna przeglądarki lub w Finderze → Pobrane.</w:t>
+      </w:r>
+    </w:p>
+    <w:p>
+      <w:pPr>
+        <w:spacing w:before="20" w:after="40"/>
+        <w:ind w:left="850" w:hanging="227"/>
+      </w:pPr>
+      <w:r>
+        <w:rPr>
+          <w:rFonts w:ascii="Calibri" w:hAnsi="Calibri"/>
+          <w:b/>
+          <w:i w:val="0"/>
+          <w:color w:val="1F497D"/>
+          <w:sz w:val="20"/>
+        </w:rPr>
+        <w:t xml:space="preserve">5.  </w:t>
+      </w:r>
+      <w:r>
+        <w:rPr>
+          <w:rFonts w:ascii="Calibri" w:hAnsi="Calibri"/>
+          <w:b w:val="0"/>
+          <w:i w:val="0"/>
+          <w:sz w:val="20"/>
+        </w:rPr>
+        <w:t>Kliknij dwukrotnie na pobrany plik (kończy się na .dmg).</w:t>
+      </w:r>
+    </w:p>
+    <w:p>
+      <w:pPr>
+        <w:spacing w:before="20" w:after="40"/>
+        <w:ind w:left="850" w:hanging="227"/>
+      </w:pPr>
+      <w:r>
+        <w:rPr>
+          <w:rFonts w:ascii="Calibri" w:hAnsi="Calibri"/>
+          <w:b/>
+          <w:i w:val="0"/>
+          <w:color w:val="1F497D"/>
+          <w:sz w:val="20"/>
+        </w:rPr>
+        <w:t xml:space="preserve">6.  </w:t>
+      </w:r>
+      <w:r>
+        <w:rPr>
+          <w:rFonts w:ascii="Calibri" w:hAnsi="Calibri"/>
+          <w:b w:val="0"/>
+          <w:i w:val="0"/>
+          <w:sz w:val="20"/>
+        </w:rPr>
+        <w:t>Pojawi się okienko — przeciągnij ikonę Windsurf do folderu Applications.</w:t>
+      </w:r>
+    </w:p>
+    <w:p>
+      <w:pPr>
+        <w:spacing w:before="20" w:after="40"/>
+        <w:ind w:left="850" w:hanging="227"/>
+      </w:pPr>
+      <w:r>
+        <w:rPr>
+          <w:rFonts w:ascii="Calibri" w:hAnsi="Calibri"/>
+          <w:b/>
+          <w:i w:val="0"/>
+          <w:color w:val="1F497D"/>
+          <w:sz w:val="20"/>
+        </w:rPr>
+        <w:t xml:space="preserve">7.  </w:t>
+      </w:r>
+      <w:r>
+        <w:rPr>
+          <w:rFonts w:ascii="Calibri" w:hAnsi="Calibri"/>
+          <w:b w:val="0"/>
+          <w:i w:val="0"/>
+          <w:sz w:val="20"/>
+        </w:rPr>
+        <w:t>Poczekaj aż się skopiuje i zamknij to okienko.</w:t>
+      </w:r>
+    </w:p>
+    <w:p>
+      <w:pPr>
+        <w:spacing w:before="20" w:after="40"/>
+        <w:ind w:left="850" w:hanging="227"/>
+      </w:pPr>
+      <w:r>
+        <w:rPr>
+          <w:rFonts w:ascii="Calibri" w:hAnsi="Calibri"/>
+          <w:b/>
+          <w:i w:val="0"/>
+          <w:color w:val="1F497D"/>
+          <w:sz w:val="20"/>
+        </w:rPr>
+        <w:t xml:space="preserve">8.  </w:t>
+      </w:r>
+      <w:r>
+        <w:rPr>
+          <w:rFonts w:ascii="Calibri" w:hAnsi="Calibri"/>
+          <w:b w:val="0"/>
+          <w:i w:val="0"/>
+          <w:sz w:val="20"/>
+        </w:rPr>
+        <w:t>Otwórz Windsurf: kliknij ikonę rakiety w Docku (Launchpad) lub naciśnij Cmd+Spacja, wpisz "Windsurf" i kliknij.</w:t>
+      </w:r>
+    </w:p>
+    <w:p>
+      <w:pPr>
+        <w:spacing w:before="120" w:after="40"/>
+        <w:ind w:left="680"/>
+        <w:jc w:val="center"/>
+      </w:pPr>
+      <w:r>
+        <w:drawing>
+          <wp:inline xmlns:a="http://schemas.openxmlformats.org/drawingml/2006/main" xmlns:pic="http://schemas.openxmlformats.org/drawingml/2006/picture">
+            <wp:extent cx="4572000" cy="1424354"/>
+            <wp:docPr id="1" name="Picture 1"/>
+            <wp:cNvGraphicFramePr>
+              <a:graphicFrameLocks noChangeAspect="1"/>
+            </wp:cNvGraphicFramePr>
+            <a:graphic>
+              <a:graphicData uri="http://schemas.openxmlformats.org/drawingml/2006/picture">
+                <pic:pic>
+                  <pic:nvPicPr>
+                    <pic:cNvPr id="0" name="tmpypzgk0_x.png"/>
+                    <pic:cNvPicPr/>
+                  </pic:nvPicPr>
+                  <pic:blipFill>
+                    <a:blip r:embed="rId9"/>
+                    <a:stretch>
+                      <a:fillRect/>
+                    </a:stretch>
+                  </pic:blipFill>
+                  <pic:spPr>
+                    <a:xfrm>
+                      <a:off x="0" y="0"/>
+                      <a:ext cx="4572000" cy="1424354"/>
+                    </a:xfrm>
+                    <a:prstGeom prst="rect"/>
+                  </pic:spPr>
+                </pic:pic>
+              </a:graphicData>
+            </a:graphic>
+          </wp:inline>
+        </w:drawing>
+      </w:r>
+    </w:p>
+    <w:p>
+      <w:pPr>
+        <w:spacing w:before="40" w:after="120"/>
+        <w:ind w:left="680"/>
+      </w:pPr>
+      <w:r>
+        <w:rPr>
+          <w:rFonts w:ascii="Calibri" w:hAnsi="Calibri"/>
+          <w:b w:val="0"/>
+          <w:i/>
+          <w:color w:val="646464"/>
+          <w:sz w:val="18"/>
+        </w:rPr>
+        <w:t xml:space="preserve">  Tak wygląda strona Windsurf — kliknij duży przycisk pobierania.</w:t>
+      </w:r>
+    </w:p>
+    <w:p>
+      <w:pPr>
+        <w:spacing w:before="240" w:after="60"/>
       </w:pPr>
       <w:r>
         <w:fldChar w:fldCharType="begin">
@@ -165,54 +408,294 @@
         <w:fldChar w:fldCharType="end"/>
       </w:r>
       <w:r>
-        <w:rPr>
-          <w:sz w:val="22"/>
-        </w:rPr>
         <w:t xml:space="preserve">  </w:t>
       </w:r>
       <w:r>
         <w:rPr>
           <w:rFonts w:ascii="Calibri" w:hAnsi="Calibri"/>
           <w:b/>
+          <w:i w:val="0"/>
           <w:sz w:val="24"/>
         </w:rPr>
-        <w:t>Krok 2 — Pobierz i zainstaluj Node.js</w:t>
+        <w:t>Krok 2 — Zainstaluj Node.js</w:t>
       </w:r>
     </w:p>
     <w:p>
       <w:pPr>
-        <w:spacing w:before="40" w:after="40"/>
+        <w:spacing w:before="40" w:after="80"/>
         <w:ind w:left="680"/>
       </w:pPr>
       <w:r>
         <w:rPr>
           <w:rFonts w:ascii="Calibri" w:hAnsi="Calibri"/>
           <w:b w:val="0"/>
-          <w:color w:val="505050"/>
+          <w:i w:val="0"/>
+          <w:color w:val="464646"/>
           <w:sz w:val="20"/>
         </w:rPr>
-        <w:t>Node.js to silnik, którego Claude potrzebuje żeby w ogóle ruszyć. Wejdź na stronę poniżej, kliknij zielony przycisk "LTS" i zainstaluj pobrany plik tak jak poprzednio.</w:t>
+        <w:t>Node.js to silnik, bez którego Claude nie uruchomi się. Instaluje się jak każdy normalny program — kilka kliknięć.</w:t>
       </w:r>
     </w:p>
     <w:p>
       <w:pPr>
-        <w:spacing w:before="20" w:after="20"/>
-        <w:ind w:left="680"/>
-        <w:shd w:val="clear" w:color="auto" w:fill="F0F0F0"/>
+        <w:spacing w:before="20" w:after="40"/>
+        <w:ind w:left="850" w:hanging="227"/>
       </w:pPr>
       <w:r>
         <w:rPr>
-          <w:rFonts w:ascii="Courier New" w:hAnsi="Courier New"/>
+          <w:rFonts w:ascii="Calibri" w:hAnsi="Calibri"/>
+          <w:b/>
+          <w:i w:val="0"/>
+          <w:color w:val="1F497D"/>
+          <w:sz w:val="20"/>
+        </w:rPr>
+        <w:t xml:space="preserve">1.  </w:t>
+      </w:r>
+      <w:r>
+        <w:rPr>
+          <w:rFonts w:ascii="Calibri" w:hAnsi="Calibri"/>
           <w:b w:val="0"/>
-          <w:sz w:val="18"/>
+          <w:i w:val="0"/>
+          <w:sz w:val="20"/>
         </w:rPr>
-        <w:t>nodejs.org  →  kliknij zielony przycisk LTS</w:t>
+        <w:t>Otwórz przeglądarkę (albo użyj tej samej co przed chwilą).</w:t>
       </w:r>
     </w:p>
     <w:p>
       <w:pPr>
-        <w:spacing w:before="200" w:after="40"/>
-        <w:ind w:left="0"/>
+        <w:spacing w:before="20" w:after="40"/>
+        <w:ind w:left="850" w:hanging="227"/>
+      </w:pPr>
+      <w:r>
+        <w:rPr>
+          <w:rFonts w:ascii="Calibri" w:hAnsi="Calibri"/>
+          <w:b/>
+          <w:i w:val="0"/>
+          <w:color w:val="1F497D"/>
+          <w:sz w:val="20"/>
+        </w:rPr>
+        <w:t xml:space="preserve">2.  </w:t>
+      </w:r>
+      <w:r>
+        <w:rPr>
+          <w:rFonts w:ascii="Calibri" w:hAnsi="Calibri"/>
+          <w:b w:val="0"/>
+          <w:i w:val="0"/>
+          <w:sz w:val="20"/>
+        </w:rPr>
+        <w:t>Wejdź na stronę: nodejs.org</w:t>
+      </w:r>
+    </w:p>
+    <w:p>
+      <w:pPr>
+        <w:spacing w:before="20" w:after="40"/>
+        <w:ind w:left="850" w:hanging="227"/>
+      </w:pPr>
+      <w:r>
+        <w:rPr>
+          <w:rFonts w:ascii="Calibri" w:hAnsi="Calibri"/>
+          <w:b/>
+          <w:i w:val="0"/>
+          <w:color w:val="1F497D"/>
+          <w:sz w:val="20"/>
+        </w:rPr>
+        <w:t xml:space="preserve">3.  </w:t>
+      </w:r>
+      <w:r>
+        <w:rPr>
+          <w:rFonts w:ascii="Calibri" w:hAnsi="Calibri"/>
+          <w:b w:val="0"/>
+          <w:i w:val="0"/>
+          <w:sz w:val="20"/>
+        </w:rPr>
+        <w:t>Zobaczysz dwa przyciski. Kliknij ten zielony — ma napis "Download Node.js (LTS)" i podpis "Recommended for most users". NIE klikaj drugiego (Current).</w:t>
+      </w:r>
+    </w:p>
+    <w:p>
+      <w:pPr>
+        <w:spacing w:before="20" w:after="40"/>
+        <w:ind w:left="850" w:hanging="227"/>
+      </w:pPr>
+      <w:r>
+        <w:rPr>
+          <w:rFonts w:ascii="Calibri" w:hAnsi="Calibri"/>
+          <w:b/>
+          <w:i w:val="0"/>
+          <w:color w:val="1F497D"/>
+          <w:sz w:val="20"/>
+        </w:rPr>
+        <w:t xml:space="preserve">4.  </w:t>
+      </w:r>
+      <w:r>
+        <w:rPr>
+          <w:rFonts w:ascii="Calibri" w:hAnsi="Calibri"/>
+          <w:b w:val="0"/>
+          <w:i w:val="0"/>
+          <w:sz w:val="20"/>
+        </w:rPr>
+        <w:t>Plik .pkg pobierze się — poczekaj aż skończy.</w:t>
+      </w:r>
+    </w:p>
+    <w:p>
+      <w:pPr>
+        <w:spacing w:before="20" w:after="40"/>
+        <w:ind w:left="850" w:hanging="227"/>
+      </w:pPr>
+      <w:r>
+        <w:rPr>
+          <w:rFonts w:ascii="Calibri" w:hAnsi="Calibri"/>
+          <w:b/>
+          <w:i w:val="0"/>
+          <w:color w:val="1F497D"/>
+          <w:sz w:val="20"/>
+        </w:rPr>
+        <w:t xml:space="preserve">5.  </w:t>
+      </w:r>
+      <w:r>
+        <w:rPr>
+          <w:rFonts w:ascii="Calibri" w:hAnsi="Calibri"/>
+          <w:b w:val="0"/>
+          <w:i w:val="0"/>
+          <w:sz w:val="20"/>
+        </w:rPr>
+        <w:t>Otwórz pobrany plik (kliknij dwukrotnie).</w:t>
+      </w:r>
+    </w:p>
+    <w:p>
+      <w:pPr>
+        <w:spacing w:before="20" w:after="40"/>
+        <w:ind w:left="850" w:hanging="227"/>
+      </w:pPr>
+      <w:r>
+        <w:rPr>
+          <w:rFonts w:ascii="Calibri" w:hAnsi="Calibri"/>
+          <w:b/>
+          <w:i w:val="0"/>
+          <w:color w:val="1F497D"/>
+          <w:sz w:val="20"/>
+        </w:rPr>
+        <w:t xml:space="preserve">6.  </w:t>
+      </w:r>
+      <w:r>
+        <w:rPr>
+          <w:rFonts w:ascii="Calibri" w:hAnsi="Calibri"/>
+          <w:b w:val="0"/>
+          <w:i w:val="0"/>
+          <w:sz w:val="20"/>
+        </w:rPr>
+        <w:t>Pojawi się instalator. Klikaj "Kontynuuj" (Continue) przez każdy ekran — nie musisz nic zmieniać.</w:t>
+      </w:r>
+    </w:p>
+    <w:p>
+      <w:pPr>
+        <w:spacing w:before="20" w:after="40"/>
+        <w:ind w:left="850" w:hanging="227"/>
+      </w:pPr>
+      <w:r>
+        <w:rPr>
+          <w:rFonts w:ascii="Calibri" w:hAnsi="Calibri"/>
+          <w:b/>
+          <w:i w:val="0"/>
+          <w:color w:val="1F497D"/>
+          <w:sz w:val="20"/>
+        </w:rPr>
+        <w:t xml:space="preserve">7.  </w:t>
+      </w:r>
+      <w:r>
+        <w:rPr>
+          <w:rFonts w:ascii="Calibri" w:hAnsi="Calibri"/>
+          <w:b w:val="0"/>
+          <w:i w:val="0"/>
+          <w:sz w:val="20"/>
+        </w:rPr>
+        <w:t>Na końcu kliknij "Zainstaluj" (Install). Mac może zapytać o hasło — wpisz swoje hasło do komputera.</w:t>
+      </w:r>
+    </w:p>
+    <w:p>
+      <w:pPr>
+        <w:spacing w:before="20" w:after="40"/>
+        <w:ind w:left="850" w:hanging="227"/>
+      </w:pPr>
+      <w:r>
+        <w:rPr>
+          <w:rFonts w:ascii="Calibri" w:hAnsi="Calibri"/>
+          <w:b/>
+          <w:i w:val="0"/>
+          <w:color w:val="1F497D"/>
+          <w:sz w:val="20"/>
+        </w:rPr>
+        <w:t xml:space="preserve">8.  </w:t>
+      </w:r>
+      <w:r>
+        <w:rPr>
+          <w:rFonts w:ascii="Calibri" w:hAnsi="Calibri"/>
+          <w:b w:val="0"/>
+          <w:i w:val="0"/>
+          <w:sz w:val="20"/>
+        </w:rPr>
+        <w:t>Gotowe! Możesz zamknąć instalator.</w:t>
+      </w:r>
+    </w:p>
+    <w:p>
+      <w:pPr>
+        <w:spacing w:before="120" w:after="40"/>
+        <w:ind w:left="680"/>
+        <w:jc w:val="center"/>
+      </w:pPr>
+      <w:r>
+        <w:drawing>
+          <wp:inline xmlns:a="http://schemas.openxmlformats.org/drawingml/2006/main" xmlns:pic="http://schemas.openxmlformats.org/drawingml/2006/picture">
+            <wp:extent cx="4572000" cy="1424354"/>
+            <wp:docPr id="2" name="Picture 2"/>
+            <wp:cNvGraphicFramePr>
+              <a:graphicFrameLocks noChangeAspect="1"/>
+            </wp:cNvGraphicFramePr>
+            <a:graphic>
+              <a:graphicData uri="http://schemas.openxmlformats.org/drawingml/2006/picture">
+                <pic:pic>
+                  <pic:nvPicPr>
+                    <pic:cNvPr id="0" name="tmpzskc2fkn.png"/>
+                    <pic:cNvPicPr/>
+                  </pic:nvPicPr>
+                  <pic:blipFill>
+                    <a:blip r:embed="rId10"/>
+                    <a:stretch>
+                      <a:fillRect/>
+                    </a:stretch>
+                  </pic:blipFill>
+                  <pic:spPr>
+                    <a:xfrm>
+                      <a:off x="0" y="0"/>
+                      <a:ext cx="4572000" cy="1424354"/>
+                    </a:xfrm>
+                    <a:prstGeom prst="rect"/>
+                  </pic:spPr>
+                </pic:pic>
+              </a:graphicData>
+            </a:graphic>
+          </wp:inline>
+        </w:drawing>
+      </w:r>
+    </w:p>
+    <w:p>
+      <w:pPr>
+        <w:spacing w:before="40" w:after="120"/>
+        <w:ind w:left="680"/>
+      </w:pPr>
+      <w:r>
+        <w:rPr>
+          <w:rFonts w:ascii="Calibri" w:hAnsi="Calibri"/>
+          <w:b w:val="0"/>
+          <w:i/>
+          <w:color w:val="646464"/>
+          <w:sz w:val="18"/>
+        </w:rPr>
+        <w:t xml:space="preserve">  Strona nodejs.org — kliknij zielony przycisk LTS (ten po lewej).</w:t>
+      </w:r>
+    </w:p>
+    <w:p>
+      <w:pPr>
+        <w:spacing w:before="240" w:after="60"/>
       </w:pPr>
       <w:r>
         <w:fldChar w:fldCharType="begin">
@@ -238,54 +721,244 @@
         <w:fldChar w:fldCharType="end"/>
       </w:r>
       <w:r>
-        <w:rPr>
-          <w:sz w:val="22"/>
-        </w:rPr>
         <w:t xml:space="preserve">  </w:t>
       </w:r>
       <w:r>
         <w:rPr>
           <w:rFonts w:ascii="Calibri" w:hAnsi="Calibri"/>
           <w:b/>
+          <w:i w:val="0"/>
           <w:sz w:val="24"/>
         </w:rPr>
-        <w:t>Krok 3 — Otwórz Windsurf i wpisz jedną komendę</w:t>
+        <w:t>Krok 3 — Otwórz terminal w Windsurf i wpisz jedną komendę</w:t>
       </w:r>
     </w:p>
     <w:p>
       <w:pPr>
-        <w:spacing w:before="40" w:after="40"/>
+        <w:spacing w:before="40" w:after="80"/>
         <w:ind w:left="680"/>
       </w:pPr>
       <w:r>
         <w:rPr>
           <w:rFonts w:ascii="Calibri" w:hAnsi="Calibri"/>
           <w:b w:val="0"/>
-          <w:color w:val="505050"/>
+          <w:i w:val="0"/>
+          <w:color w:val="464646"/>
           <w:sz w:val="20"/>
         </w:rPr>
-        <w:t>Uruchom Windsurf. Na dole ekranu zobaczysz czarne okienko — to "terminal", miejsce gdzie wpisujesz polecenia. Kliknij w to okienko, wpisz poniższe i naciśnij Enter. Poczekaj aż skończy (może chwilę potrwać).</w:t>
+        <w:t>Terminal to czarne okienko, w którym wpisujesz polecenia. W Windsurf jest ukryte na dole ekranu — pokażemy Ci jak je otworzyć.</w:t>
       </w:r>
     </w:p>
     <w:p>
       <w:pPr>
-        <w:spacing w:before="20" w:after="20"/>
-        <w:ind w:left="680"/>
-        <w:shd w:val="clear" w:color="auto" w:fill="F0F0F0"/>
+        <w:spacing w:before="20" w:after="40"/>
+        <w:ind w:left="850" w:hanging="227"/>
       </w:pPr>
       <w:r>
         <w:rPr>
-          <w:rFonts w:ascii="Courier New" w:hAnsi="Courier New"/>
+          <w:rFonts w:ascii="Calibri" w:hAnsi="Calibri"/>
+          <w:b/>
+          <w:i w:val="0"/>
+          <w:color w:val="1F497D"/>
+          <w:sz w:val="20"/>
+        </w:rPr>
+        <w:t xml:space="preserve">1.  </w:t>
+      </w:r>
+      <w:r>
+        <w:rPr>
+          <w:rFonts w:ascii="Calibri" w:hAnsi="Calibri"/>
           <w:b w:val="0"/>
-          <w:sz w:val="18"/>
+          <w:i w:val="0"/>
+          <w:sz w:val="20"/>
         </w:rPr>
-        <w:t>npm install -g @anthropic-ai/claude-code</w:t>
+        <w:t>Uruchom Windsurf (jeśli jeszcze nie jest otwarty).</w:t>
       </w:r>
     </w:p>
     <w:p>
       <w:pPr>
-        <w:spacing w:before="200" w:after="40"/>
-        <w:ind w:left="0"/>
+        <w:spacing w:before="20" w:after="40"/>
+        <w:ind w:left="850" w:hanging="227"/>
+      </w:pPr>
+      <w:r>
+        <w:rPr>
+          <w:rFonts w:ascii="Calibri" w:hAnsi="Calibri"/>
+          <w:b/>
+          <w:i w:val="0"/>
+          <w:color w:val="1F497D"/>
+          <w:sz w:val="20"/>
+        </w:rPr>
+        <w:t xml:space="preserve">2.  </w:t>
+      </w:r>
+      <w:r>
+        <w:rPr>
+          <w:rFonts w:ascii="Calibri" w:hAnsi="Calibri"/>
+          <w:b w:val="0"/>
+          <w:i w:val="0"/>
+          <w:sz w:val="20"/>
+        </w:rPr>
+        <w:t>W górnym menu kliknij "Terminal" a potem "New Terminal". Ewentualnie naciśnij klawisze Ctrl + ` (tylni apostrof — klawisz obok cyfry 1 na klawiaturze).</w:t>
+      </w:r>
+    </w:p>
+    <w:p>
+      <w:pPr>
+        <w:spacing w:before="20" w:after="40"/>
+        <w:ind w:left="850" w:hanging="227"/>
+      </w:pPr>
+      <w:r>
+        <w:rPr>
+          <w:rFonts w:ascii="Calibri" w:hAnsi="Calibri"/>
+          <w:b/>
+          <w:i w:val="0"/>
+          <w:color w:val="1F497D"/>
+          <w:sz w:val="20"/>
+        </w:rPr>
+        <w:t xml:space="preserve">3.  </w:t>
+      </w:r>
+      <w:r>
+        <w:rPr>
+          <w:rFonts w:ascii="Calibri" w:hAnsi="Calibri"/>
+          <w:b w:val="0"/>
+          <w:i w:val="0"/>
+          <w:sz w:val="20"/>
+        </w:rPr>
+        <w:t>Na dole ekranu pojawi się ciemne okienko z kursorem — to terminal.</w:t>
+      </w:r>
+    </w:p>
+    <w:p>
+      <w:pPr>
+        <w:spacing w:before="20" w:after="40"/>
+        <w:ind w:left="850" w:hanging="227"/>
+      </w:pPr>
+      <w:r>
+        <w:rPr>
+          <w:rFonts w:ascii="Calibri" w:hAnsi="Calibri"/>
+          <w:b/>
+          <w:i w:val="0"/>
+          <w:color w:val="1F497D"/>
+          <w:sz w:val="20"/>
+        </w:rPr>
+        <w:t xml:space="preserve">4.  </w:t>
+      </w:r>
+      <w:r>
+        <w:rPr>
+          <w:rFonts w:ascii="Calibri" w:hAnsi="Calibri"/>
+          <w:b w:val="0"/>
+          <w:i w:val="0"/>
+          <w:sz w:val="20"/>
+        </w:rPr>
+        <w:t>Kliknij w to ciemne okienko żeby je zaznaczyć.</w:t>
+      </w:r>
+    </w:p>
+    <w:p>
+      <w:pPr>
+        <w:spacing w:before="20" w:after="40"/>
+        <w:ind w:left="850" w:hanging="227"/>
+      </w:pPr>
+      <w:r>
+        <w:rPr>
+          <w:rFonts w:ascii="Calibri" w:hAnsi="Calibri"/>
+          <w:b/>
+          <w:i w:val="0"/>
+          <w:color w:val="1F497D"/>
+          <w:sz w:val="20"/>
+        </w:rPr>
+        <w:t xml:space="preserve">5.  </w:t>
+      </w:r>
+      <w:r>
+        <w:rPr>
+          <w:rFonts w:ascii="Calibri" w:hAnsi="Calibri"/>
+          <w:b w:val="0"/>
+          <w:i w:val="0"/>
+          <w:sz w:val="20"/>
+        </w:rPr>
+        <w:t>Wpisz poniższą komendę i naciśnij Enter. Poczekaj — może trwać 1-3 minuty (coś się będzie instalować).</w:t>
+      </w:r>
+    </w:p>
+    <w:p>
+      <w:pPr>
+        <w:spacing w:before="20" w:after="40"/>
+        <w:ind w:left="850" w:hanging="227"/>
+      </w:pPr>
+      <w:r>
+        <w:rPr>
+          <w:rFonts w:ascii="Calibri" w:hAnsi="Calibri"/>
+          <w:b/>
+          <w:i w:val="0"/>
+          <w:color w:val="1F497D"/>
+          <w:sz w:val="20"/>
+        </w:rPr>
+        <w:t xml:space="preserve">6.  </w:t>
+      </w:r>
+      <w:r>
+        <w:rPr>
+          <w:rFonts w:ascii="Calibri" w:hAnsi="Calibri"/>
+          <w:b w:val="0"/>
+          <w:i w:val="0"/>
+          <w:sz w:val="20"/>
+        </w:rPr>
+        <w:t>Gdy skończy, w terminalu pojawi się nowa linia z kursorem — to znak że gotowe.</w:t>
+      </w:r>
+    </w:p>
+    <w:p>
+      <w:pPr>
+        <w:spacing w:before="120" w:after="40"/>
+        <w:ind w:left="680"/>
+        <w:jc w:val="center"/>
+      </w:pPr>
+      <w:r>
+        <w:drawing>
+          <wp:inline xmlns:a="http://schemas.openxmlformats.org/drawingml/2006/main" xmlns:pic="http://schemas.openxmlformats.org/drawingml/2006/picture">
+            <wp:extent cx="4572000" cy="2637692"/>
+            <wp:docPr id="3" name="Picture 3"/>
+            <wp:cNvGraphicFramePr>
+              <a:graphicFrameLocks noChangeAspect="1"/>
+            </wp:cNvGraphicFramePr>
+            <a:graphic>
+              <a:graphicData uri="http://schemas.openxmlformats.org/drawingml/2006/picture">
+                <pic:pic>
+                  <pic:nvPicPr>
+                    <pic:cNvPr id="0" name="tmptdib9ivi.png"/>
+                    <pic:cNvPicPr/>
+                  </pic:nvPicPr>
+                  <pic:blipFill>
+                    <a:blip r:embed="rId11"/>
+                    <a:stretch>
+                      <a:fillRect/>
+                    </a:stretch>
+                  </pic:blipFill>
+                  <pic:spPr>
+                    <a:xfrm>
+                      <a:off x="0" y="0"/>
+                      <a:ext cx="4572000" cy="2637692"/>
+                    </a:xfrm>
+                    <a:prstGeom prst="rect"/>
+                  </pic:spPr>
+                </pic:pic>
+              </a:graphicData>
+            </a:graphic>
+          </wp:inline>
+        </w:drawing>
+      </w:r>
+    </w:p>
+    <w:p>
+      <w:pPr>
+        <w:spacing w:before="40" w:after="120"/>
+        <w:ind w:left="680"/>
+      </w:pPr>
+      <w:r>
+        <w:rPr>
+          <w:rFonts w:ascii="Calibri" w:hAnsi="Calibri"/>
+          <w:b w:val="0"/>
+          <w:i/>
+          <w:color w:val="646464"/>
+          <w:sz w:val="18"/>
+        </w:rPr>
+        <w:t xml:space="preserve">  Windsurf — Terminal otworzysz przez menu Terminal → New Terminal.</w:t>
+      </w:r>
+    </w:p>
+    <w:p>
+      <w:pPr>
+        <w:spacing w:before="240" w:after="60"/>
       </w:pPr>
       <w:r>
         <w:fldChar w:fldCharType="begin">
@@ -311,15 +984,13 @@
         <w:fldChar w:fldCharType="end"/>
       </w:r>
       <w:r>
-        <w:rPr>
-          <w:sz w:val="22"/>
-        </w:rPr>
         <w:t xml:space="preserve">  </w:t>
       </w:r>
       <w:r>
         <w:rPr>
           <w:rFonts w:ascii="Calibri" w:hAnsi="Calibri"/>
           <w:b/>
+          <w:i w:val="0"/>
           <w:sz w:val="24"/>
         </w:rPr>
         <w:t>Krok 4 — Otwórz folder Onboarding w Windsurf</w:t>
@@ -327,23 +998,148 @@
     </w:p>
     <w:p>
       <w:pPr>
-        <w:spacing w:before="40" w:after="40"/>
+        <w:spacing w:before="40" w:after="80"/>
         <w:ind w:left="680"/>
       </w:pPr>
       <w:r>
         <w:rPr>
           <w:rFonts w:ascii="Calibri" w:hAnsi="Calibri"/>
           <w:b w:val="0"/>
-          <w:color w:val="505050"/>
+          <w:i w:val="0"/>
+          <w:color w:val="464646"/>
           <w:sz w:val="20"/>
         </w:rPr>
-        <w:t>W Windsurf kliknij u góry: File → Open Folder, a potem wskaż folder Onboarding — ten, który właśnie masz.</w:t>
+        <w:t>Musisz wskazać Windsurfowi folder z plikami onboardingowymi — ten sam folder, z którego czytasz ten dokument.</w:t>
       </w:r>
     </w:p>
     <w:p>
       <w:pPr>
-        <w:spacing w:before="200" w:after="40"/>
-        <w:ind w:left="0"/>
+        <w:spacing w:before="20" w:after="40"/>
+        <w:ind w:left="850" w:hanging="227"/>
+      </w:pPr>
+      <w:r>
+        <w:rPr>
+          <w:rFonts w:ascii="Calibri" w:hAnsi="Calibri"/>
+          <w:b/>
+          <w:i w:val="0"/>
+          <w:color w:val="1F497D"/>
+          <w:sz w:val="20"/>
+        </w:rPr>
+        <w:t xml:space="preserve">1.  </w:t>
+      </w:r>
+      <w:r>
+        <w:rPr>
+          <w:rFonts w:ascii="Calibri" w:hAnsi="Calibri"/>
+          <w:b w:val="0"/>
+          <w:i w:val="0"/>
+          <w:sz w:val="20"/>
+        </w:rPr>
+        <w:t>W Windsurf kliknij "File" w górnym menu.</w:t>
+      </w:r>
+    </w:p>
+    <w:p>
+      <w:pPr>
+        <w:spacing w:before="20" w:after="40"/>
+        <w:ind w:left="850" w:hanging="227"/>
+      </w:pPr>
+      <w:r>
+        <w:rPr>
+          <w:rFonts w:ascii="Calibri" w:hAnsi="Calibri"/>
+          <w:b/>
+          <w:i w:val="0"/>
+          <w:color w:val="1F497D"/>
+          <w:sz w:val="20"/>
+        </w:rPr>
+        <w:t xml:space="preserve">2.  </w:t>
+      </w:r>
+      <w:r>
+        <w:rPr>
+          <w:rFonts w:ascii="Calibri" w:hAnsi="Calibri"/>
+          <w:b w:val="0"/>
+          <w:i w:val="0"/>
+          <w:sz w:val="20"/>
+        </w:rPr>
+        <w:t>Kliknij "Open Folder..." (Otwórz folder).</w:t>
+      </w:r>
+    </w:p>
+    <w:p>
+      <w:pPr>
+        <w:spacing w:before="20" w:after="40"/>
+        <w:ind w:left="850" w:hanging="227"/>
+      </w:pPr>
+      <w:r>
+        <w:rPr>
+          <w:rFonts w:ascii="Calibri" w:hAnsi="Calibri"/>
+          <w:b/>
+          <w:i w:val="0"/>
+          <w:color w:val="1F497D"/>
+          <w:sz w:val="20"/>
+        </w:rPr>
+        <w:t xml:space="preserve">3.  </w:t>
+      </w:r>
+      <w:r>
+        <w:rPr>
+          <w:rFonts w:ascii="Calibri" w:hAnsi="Calibri"/>
+          <w:b w:val="0"/>
+          <w:i w:val="0"/>
+          <w:sz w:val="20"/>
+        </w:rPr>
+        <w:t>Pojawi się okienko do wyboru folderu — znajdź i zaznacz folder "Onboarding".</w:t>
+      </w:r>
+    </w:p>
+    <w:p>
+      <w:pPr>
+        <w:spacing w:before="20" w:after="40"/>
+        <w:ind w:left="850" w:hanging="227"/>
+      </w:pPr>
+      <w:r>
+        <w:rPr>
+          <w:rFonts w:ascii="Calibri" w:hAnsi="Calibri"/>
+          <w:b/>
+          <w:i w:val="0"/>
+          <w:color w:val="1F497D"/>
+          <w:sz w:val="20"/>
+        </w:rPr>
+        <w:t xml:space="preserve">4.  </w:t>
+      </w:r>
+      <w:r>
+        <w:rPr>
+          <w:rFonts w:ascii="Calibri" w:hAnsi="Calibri"/>
+          <w:b w:val="0"/>
+          <w:i w:val="0"/>
+          <w:sz w:val="20"/>
+        </w:rPr>
+        <w:t>Kliknij przycisk "Open" (lub "Otwórz") na dole okienka.</w:t>
+      </w:r>
+    </w:p>
+    <w:p>
+      <w:pPr>
+        <w:spacing w:before="20" w:after="40"/>
+        <w:ind w:left="850" w:hanging="227"/>
+      </w:pPr>
+      <w:r>
+        <w:rPr>
+          <w:rFonts w:ascii="Calibri" w:hAnsi="Calibri"/>
+          <w:b/>
+          <w:i w:val="0"/>
+          <w:color w:val="1F497D"/>
+          <w:sz w:val="20"/>
+        </w:rPr>
+        <w:t xml:space="preserve">5.  </w:t>
+      </w:r>
+      <w:r>
+        <w:rPr>
+          <w:rFonts w:ascii="Calibri" w:hAnsi="Calibri"/>
+          <w:b w:val="0"/>
+          <w:i w:val="0"/>
+          <w:sz w:val="20"/>
+        </w:rPr>
+        <w:t>Po lewej stronie Windsurf pojawi się lista plików z folderu Onboarding — to znak że zadziałało.</w:t>
+      </w:r>
+    </w:p>
+    <w:p>
+      <w:pPr>
+        <w:spacing w:before="240" w:after="60"/>
       </w:pPr>
       <w:r>
         <w:fldChar w:fldCharType="begin">
@@ -369,15 +1165,13 @@
         <w:fldChar w:fldCharType="end"/>
       </w:r>
       <w:r>
-        <w:rPr>
-          <w:sz w:val="22"/>
-        </w:rPr>
         <w:t xml:space="preserve">  </w:t>
       </w:r>
       <w:r>
         <w:rPr>
           <w:rFonts w:ascii="Calibri" w:hAnsi="Calibri"/>
           <w:b/>
+          <w:i w:val="0"/>
           <w:sz w:val="24"/>
         </w:rPr>
         <w:t>Krok 5 — Uruchom Claude i zaloguj się</w:t>
@@ -385,38 +1179,230 @@
     </w:p>
     <w:p>
       <w:pPr>
-        <w:spacing w:before="40" w:after="40"/>
+        <w:spacing w:before="40" w:after="80"/>
         <w:ind w:left="680"/>
       </w:pPr>
       <w:r>
         <w:rPr>
           <w:rFonts w:ascii="Calibri" w:hAnsi="Calibri"/>
           <w:b w:val="0"/>
-          <w:color w:val="505050"/>
+          <w:i w:val="0"/>
+          <w:color w:val="464646"/>
           <w:sz w:val="20"/>
         </w:rPr>
-        <w:t>W czarnym okienku (terminal) wpisz claude i naciśnij Enter. Otworzy się przeglądarka — zaloguj się przez swoje konto Anthropic. Wróć do Windsurf. Claude czeka na Ciebie w terminalu.</w:t>
+        <w:t>Teraz uruchamiamy samego Claude — asystenta AI. Przy pierwszym uruchomieniu otworzy się przeglądarka żebyś się zalogował.</w:t>
       </w:r>
     </w:p>
     <w:p>
       <w:pPr>
-        <w:spacing w:before="20" w:after="20"/>
-        <w:ind w:left="680"/>
-        <w:shd w:val="clear" w:color="auto" w:fill="F0F0F0"/>
+        <w:spacing w:before="20" w:after="40"/>
+        <w:ind w:left="850" w:hanging="227"/>
       </w:pPr>
       <w:r>
         <w:rPr>
-          <w:rFonts w:ascii="Courier New" w:hAnsi="Courier New"/>
+          <w:rFonts w:ascii="Calibri" w:hAnsi="Calibri"/>
+          <w:b/>
+          <w:i w:val="0"/>
+          <w:color w:val="1F497D"/>
+          <w:sz w:val="20"/>
+        </w:rPr>
+        <w:t xml:space="preserve">1.  </w:t>
+      </w:r>
+      <w:r>
+        <w:rPr>
+          <w:rFonts w:ascii="Calibri" w:hAnsi="Calibri"/>
           <w:b w:val="0"/>
-          <w:sz w:val="18"/>
+          <w:i w:val="0"/>
+          <w:sz w:val="20"/>
         </w:rPr>
-        <w:t>claude</w:t>
+        <w:t>W ciemnym okienku (terminal) na dole Windsurf kliknij żeby je zaznaczyć.</w:t>
       </w:r>
     </w:p>
     <w:p>
       <w:pPr>
-        <w:spacing w:before="200" w:after="40"/>
-        <w:ind w:left="0"/>
+        <w:spacing w:before="20" w:after="40"/>
+        <w:ind w:left="850" w:hanging="227"/>
+      </w:pPr>
+      <w:r>
+        <w:rPr>
+          <w:rFonts w:ascii="Calibri" w:hAnsi="Calibri"/>
+          <w:b/>
+          <w:i w:val="0"/>
+          <w:color w:val="1F497D"/>
+          <w:sz w:val="20"/>
+        </w:rPr>
+        <w:t xml:space="preserve">2.  </w:t>
+      </w:r>
+      <w:r>
+        <w:rPr>
+          <w:rFonts w:ascii="Calibri" w:hAnsi="Calibri"/>
+          <w:b w:val="0"/>
+          <w:i w:val="0"/>
+          <w:sz w:val="20"/>
+        </w:rPr>
+        <w:t>Wpisz: claude  i naciśnij Enter.</w:t>
+      </w:r>
+    </w:p>
+    <w:p>
+      <w:pPr>
+        <w:spacing w:before="20" w:after="40"/>
+        <w:ind w:left="850" w:hanging="227"/>
+      </w:pPr>
+      <w:r>
+        <w:rPr>
+          <w:rFonts w:ascii="Calibri" w:hAnsi="Calibri"/>
+          <w:b/>
+          <w:i w:val="0"/>
+          <w:color w:val="1F497D"/>
+          <w:sz w:val="20"/>
+        </w:rPr>
+        <w:t xml:space="preserve">3.  </w:t>
+      </w:r>
+      <w:r>
+        <w:rPr>
+          <w:rFonts w:ascii="Calibri" w:hAnsi="Calibri"/>
+          <w:b w:val="0"/>
+          <w:i w:val="0"/>
+          <w:sz w:val="20"/>
+        </w:rPr>
+        <w:t>Claude może zapytać o zgodę — jeśli zobaczysz pytanie, wpisz Y i Enter.</w:t>
+      </w:r>
+    </w:p>
+    <w:p>
+      <w:pPr>
+        <w:spacing w:before="20" w:after="40"/>
+        <w:ind w:left="850" w:hanging="227"/>
+      </w:pPr>
+      <w:r>
+        <w:rPr>
+          <w:rFonts w:ascii="Calibri" w:hAnsi="Calibri"/>
+          <w:b/>
+          <w:i w:val="0"/>
+          <w:color w:val="1F497D"/>
+          <w:sz w:val="20"/>
+        </w:rPr>
+        <w:t xml:space="preserve">4.  </w:t>
+      </w:r>
+      <w:r>
+        <w:rPr>
+          <w:rFonts w:ascii="Calibri" w:hAnsi="Calibri"/>
+          <w:b w:val="0"/>
+          <w:i w:val="0"/>
+          <w:sz w:val="20"/>
+        </w:rPr>
+        <w:t>Automatycznie otworzy się przeglądarka z prośbą o zalogowanie.</w:t>
+      </w:r>
+    </w:p>
+    <w:p>
+      <w:pPr>
+        <w:spacing w:before="20" w:after="40"/>
+        <w:ind w:left="850" w:hanging="227"/>
+      </w:pPr>
+      <w:r>
+        <w:rPr>
+          <w:rFonts w:ascii="Calibri" w:hAnsi="Calibri"/>
+          <w:b/>
+          <w:i w:val="0"/>
+          <w:color w:val="1F497D"/>
+          <w:sz w:val="20"/>
+        </w:rPr>
+        <w:t xml:space="preserve">5.  </w:t>
+      </w:r>
+      <w:r>
+        <w:rPr>
+          <w:rFonts w:ascii="Calibri" w:hAnsi="Calibri"/>
+          <w:b w:val="0"/>
+          <w:i w:val="0"/>
+          <w:sz w:val="20"/>
+        </w:rPr>
+        <w:t>Zaloguj się przez swoje konto Anthropic (lub utwórz konto jeśli nie masz).</w:t>
+      </w:r>
+    </w:p>
+    <w:p>
+      <w:pPr>
+        <w:spacing w:before="20" w:after="40"/>
+        <w:ind w:left="850" w:hanging="227"/>
+      </w:pPr>
+      <w:r>
+        <w:rPr>
+          <w:rFonts w:ascii="Calibri" w:hAnsi="Calibri"/>
+          <w:b/>
+          <w:i w:val="0"/>
+          <w:color w:val="1F497D"/>
+          <w:sz w:val="20"/>
+        </w:rPr>
+        <w:t xml:space="preserve">6.  </w:t>
+      </w:r>
+      <w:r>
+        <w:rPr>
+          <w:rFonts w:ascii="Calibri" w:hAnsi="Calibri"/>
+          <w:b w:val="0"/>
+          <w:i w:val="0"/>
+          <w:sz w:val="20"/>
+        </w:rPr>
+        <w:t>Wróć do Windsurf — w terminalu zobaczysz że Claude czeka na Twój tekst. Zobaczysz coś w stylu: "Claude Code &gt; "</w:t>
+      </w:r>
+    </w:p>
+    <w:p>
+      <w:pPr>
+        <w:spacing w:before="120" w:after="40"/>
+        <w:ind w:left="680"/>
+        <w:jc w:val="center"/>
+      </w:pPr>
+      <w:r>
+        <w:drawing>
+          <wp:inline xmlns:a="http://schemas.openxmlformats.org/drawingml/2006/main" xmlns:pic="http://schemas.openxmlformats.org/drawingml/2006/picture">
+            <wp:extent cx="4572000" cy="1178169"/>
+            <wp:docPr id="4" name="Picture 4"/>
+            <wp:cNvGraphicFramePr>
+              <a:graphicFrameLocks noChangeAspect="1"/>
+            </wp:cNvGraphicFramePr>
+            <a:graphic>
+              <a:graphicData uri="http://schemas.openxmlformats.org/drawingml/2006/picture">
+                <pic:pic>
+                  <pic:nvPicPr>
+                    <pic:cNvPr id="0" name="tmptef885a8.png"/>
+                    <pic:cNvPicPr/>
+                  </pic:nvPicPr>
+                  <pic:blipFill>
+                    <a:blip r:embed="rId12"/>
+                    <a:stretch>
+                      <a:fillRect/>
+                    </a:stretch>
+                  </pic:blipFill>
+                  <pic:spPr>
+                    <a:xfrm>
+                      <a:off x="0" y="0"/>
+                      <a:ext cx="4572000" cy="1178169"/>
+                    </a:xfrm>
+                    <a:prstGeom prst="rect"/>
+                  </pic:spPr>
+                </pic:pic>
+              </a:graphicData>
+            </a:graphic>
+          </wp:inline>
+        </w:drawing>
+      </w:r>
+    </w:p>
+    <w:p>
+      <w:pPr>
+        <w:spacing w:before="40" w:after="120"/>
+        <w:ind w:left="680"/>
+      </w:pPr>
+      <w:r>
+        <w:rPr>
+          <w:rFonts w:ascii="Calibri" w:hAnsi="Calibri"/>
+          <w:b w:val="0"/>
+          <w:i/>
+          <w:color w:val="646464"/>
+          <w:sz w:val="18"/>
+        </w:rPr>
+        <w:t xml:space="preserve">  Tak wygląda uruchomiony Claude w terminalu Windsurf.</w:t>
+      </w:r>
+    </w:p>
+    <w:p>
+      <w:pPr>
+        <w:spacing w:before="240" w:after="60"/>
       </w:pPr>
       <w:r>
         <w:fldChar w:fldCharType="begin">
@@ -442,33 +1428,207 @@
         <w:fldChar w:fldCharType="end"/>
       </w:r>
       <w:r>
-        <w:rPr>
-          <w:sz w:val="22"/>
-        </w:rPr>
         <w:t xml:space="preserve">  </w:t>
       </w:r>
       <w:r>
         <w:rPr>
           <w:rFonts w:ascii="Calibri" w:hAnsi="Calibri"/>
           <w:b/>
+          <w:i w:val="0"/>
           <w:sz w:val="24"/>
         </w:rPr>
-        <w:t>Krok 6 — Wklej prompt z Części 2 — i gotowe!</w:t>
+        <w:t>Krok 6 — Wklej prompt z Części 2 — Claude zajmie się resztą!</w:t>
       </w:r>
     </w:p>
     <w:p>
       <w:pPr>
-        <w:spacing w:before="40" w:after="40"/>
+        <w:spacing w:before="40" w:after="80"/>
         <w:ind w:left="680"/>
       </w:pPr>
       <w:r>
         <w:rPr>
           <w:rFonts w:ascii="Calibri" w:hAnsi="Calibri"/>
           <w:b w:val="0"/>
-          <w:color w:val="505050"/>
+          <w:i w:val="0"/>
+          <w:color w:val="464646"/>
           <w:sz w:val="20"/>
         </w:rPr>
-        <w:t>To ostatni krok który robisz sam. Skopiuj cały tekst z niebieskiej ramki na następnej stronie, wklej go do terminala w Windsurf (Ctrl+V lub kliknij prawym → Paste) i naciśnij Enter. Od tej chwili Claude przejmuje stery i przeprowadza Cię przez całą resztę krok po kroku.</w:t>
+        <w:t>To ostatni krok który robisz sam. Dajesz Claude instrukcje i od tej chwili on prowadzi Cię przez całą konfigurację — po polsku, krok po kroku, czekając aż każdy krok zrobisz.</w:t>
+      </w:r>
+    </w:p>
+    <w:p>
+      <w:pPr>
+        <w:spacing w:before="20" w:after="40"/>
+        <w:ind w:left="850" w:hanging="227"/>
+      </w:pPr>
+      <w:r>
+        <w:rPr>
+          <w:rFonts w:ascii="Calibri" w:hAnsi="Calibri"/>
+          <w:b/>
+          <w:i w:val="0"/>
+          <w:color w:val="1F497D"/>
+          <w:sz w:val="20"/>
+        </w:rPr>
+        <w:t xml:space="preserve">1.  </w:t>
+      </w:r>
+      <w:r>
+        <w:rPr>
+          <w:rFonts w:ascii="Calibri" w:hAnsi="Calibri"/>
+          <w:b w:val="0"/>
+          <w:i w:val="0"/>
+          <w:sz w:val="20"/>
+        </w:rPr>
+        <w:t>Przejdź na następną stronę tego dokumentu.</w:t>
+      </w:r>
+    </w:p>
+    <w:p>
+      <w:pPr>
+        <w:spacing w:before="20" w:after="40"/>
+        <w:ind w:left="850" w:hanging="227"/>
+      </w:pPr>
+      <w:r>
+        <w:rPr>
+          <w:rFonts w:ascii="Calibri" w:hAnsi="Calibri"/>
+          <w:b/>
+          <w:i w:val="0"/>
+          <w:color w:val="1F497D"/>
+          <w:sz w:val="20"/>
+        </w:rPr>
+        <w:t xml:space="preserve">2.  </w:t>
+      </w:r>
+      <w:r>
+        <w:rPr>
+          <w:rFonts w:ascii="Calibri" w:hAnsi="Calibri"/>
+          <w:b w:val="0"/>
+          <w:i w:val="0"/>
+          <w:sz w:val="20"/>
+        </w:rPr>
+        <w:t>Zaznacz CAŁY tekst z niebieskiej ramki (kliknij na początku, potem Shift+kliknij na końcu ramki).</w:t>
+      </w:r>
+    </w:p>
+    <w:p>
+      <w:pPr>
+        <w:spacing w:before="20" w:after="40"/>
+        <w:ind w:left="850" w:hanging="227"/>
+      </w:pPr>
+      <w:r>
+        <w:rPr>
+          <w:rFonts w:ascii="Calibri" w:hAnsi="Calibri"/>
+          <w:b/>
+          <w:i w:val="0"/>
+          <w:color w:val="1F497D"/>
+          <w:sz w:val="20"/>
+        </w:rPr>
+        <w:t xml:space="preserve">3.  </w:t>
+      </w:r>
+      <w:r>
+        <w:rPr>
+          <w:rFonts w:ascii="Calibri" w:hAnsi="Calibri"/>
+          <w:b w:val="0"/>
+          <w:i w:val="0"/>
+          <w:sz w:val="20"/>
+        </w:rPr>
+        <w:t>Skopiuj: Cmd+C (lub kliknij prawym przyciskiem → Kopiuj).</w:t>
+      </w:r>
+    </w:p>
+    <w:p>
+      <w:pPr>
+        <w:spacing w:before="20" w:after="40"/>
+        <w:ind w:left="850" w:hanging="227"/>
+      </w:pPr>
+      <w:r>
+        <w:rPr>
+          <w:rFonts w:ascii="Calibri" w:hAnsi="Calibri"/>
+          <w:b/>
+          <w:i w:val="0"/>
+          <w:color w:val="1F497D"/>
+          <w:sz w:val="20"/>
+        </w:rPr>
+        <w:t xml:space="preserve">4.  </w:t>
+      </w:r>
+      <w:r>
+        <w:rPr>
+          <w:rFonts w:ascii="Calibri" w:hAnsi="Calibri"/>
+          <w:b w:val="0"/>
+          <w:i w:val="0"/>
+          <w:sz w:val="20"/>
+        </w:rPr>
+        <w:t>Wróć do Windsurf i kliknij w ciemne okienko terminala.</w:t>
+      </w:r>
+    </w:p>
+    <w:p>
+      <w:pPr>
+        <w:spacing w:before="20" w:after="40"/>
+        <w:ind w:left="850" w:hanging="227"/>
+      </w:pPr>
+      <w:r>
+        <w:rPr>
+          <w:rFonts w:ascii="Calibri" w:hAnsi="Calibri"/>
+          <w:b/>
+          <w:i w:val="0"/>
+          <w:color w:val="1F497D"/>
+          <w:sz w:val="20"/>
+        </w:rPr>
+        <w:t xml:space="preserve">5.  </w:t>
+      </w:r>
+      <w:r>
+        <w:rPr>
+          <w:rFonts w:ascii="Calibri" w:hAnsi="Calibri"/>
+          <w:b w:val="0"/>
+          <w:i w:val="0"/>
+          <w:sz w:val="20"/>
+        </w:rPr>
+        <w:t>Wklej: Cmd+V (lub kliknij prawym → Wklej).</w:t>
+      </w:r>
+    </w:p>
+    <w:p>
+      <w:pPr>
+        <w:spacing w:before="20" w:after="40"/>
+        <w:ind w:left="850" w:hanging="227"/>
+      </w:pPr>
+      <w:r>
+        <w:rPr>
+          <w:rFonts w:ascii="Calibri" w:hAnsi="Calibri"/>
+          <w:b/>
+          <w:i w:val="0"/>
+          <w:color w:val="1F497D"/>
+          <w:sz w:val="20"/>
+        </w:rPr>
+        <w:t xml:space="preserve">6.  </w:t>
+      </w:r>
+      <w:r>
+        <w:rPr>
+          <w:rFonts w:ascii="Calibri" w:hAnsi="Calibri"/>
+          <w:b w:val="0"/>
+          <w:i w:val="0"/>
+          <w:sz w:val="20"/>
+        </w:rPr>
+        <w:t>Naciśnij Enter.</w:t>
+      </w:r>
+    </w:p>
+    <w:p>
+      <w:pPr>
+        <w:spacing w:before="20" w:after="40"/>
+        <w:ind w:left="850" w:hanging="227"/>
+      </w:pPr>
+      <w:r>
+        <w:rPr>
+          <w:rFonts w:ascii="Calibri" w:hAnsi="Calibri"/>
+          <w:b/>
+          <w:i w:val="0"/>
+          <w:color w:val="1F497D"/>
+          <w:sz w:val="20"/>
+        </w:rPr>
+        <w:t xml:space="preserve">7.  </w:t>
+      </w:r>
+      <w:r>
+        <w:rPr>
+          <w:rFonts w:ascii="Calibri" w:hAnsi="Calibri"/>
+          <w:b w:val="0"/>
+          <w:i w:val="0"/>
+          <w:sz w:val="20"/>
+        </w:rPr>
+        <w:t>Claude zacznie pisać do Ciebie i przeprowadzi Cię przez każdy następny krok. Wystarczy że będziesz odpowiadać "gotowe" gdy skończysz każdy krok.</w:t>
       </w:r>
     </w:p>
     <w:p>
@@ -479,7 +1639,7 @@
     <w:p/>
     <w:p>
       <w:pPr>
-        <w:spacing w:before="320" w:after="120"/>
+        <w:spacing w:before="280" w:after="120"/>
         <w:pBdr>
           <w:bottom w:val="single" w:sz="6" w:space="1" w:color="1F497D"/>
         </w:pBdr>
@@ -488,6 +1648,7 @@
         <w:rPr>
           <w:rFonts w:ascii="Calibri" w:hAnsi="Calibri"/>
           <w:b/>
+          <w:i w:val="0"/>
           <w:color w:val="1F497D"/>
           <w:sz w:val="28"/>
         </w:rPr>
@@ -499,15 +1660,16 @@
         <w:rPr>
           <w:rFonts w:ascii="Calibri" w:hAnsi="Calibri"/>
           <w:b w:val="0"/>
+          <w:i w:val="0"/>
           <w:sz w:val="20"/>
         </w:rPr>
-        <w:t>Zaznacz cały tekst w niebieskiej ramce poniżej (kliknij i Ctrl+A lub zaznacz myszką), skopiuj (Ctrl+C), a potem wklej do czarnego okienka w Windsurf gdzie działa Claude (Ctrl+V lub kliknij prawym → Paste). Naciśnij Enter. Claude zacznie rozmawiać z Tobą i przeprowadzi Cię przez całą resztę konfiguracji — krok po kroku, po polsku.</w:t>
+        <w:t>Zaznacz cały tekst w niebieskiej ramce poniżej, skopiuj (Cmd+C) i wklej do czarnego okienka w Windsurf gdzie działa Claude (Cmd+V). Naciśnij Enter. Claude zacznie rozmawiać z Tobą i przeprowadzi Cię przez całą resztę.</w:t>
       </w:r>
     </w:p>
     <w:p/>
     <w:p>
       <w:pPr>
-        <w:spacing w:before="120" w:after="120"/>
+        <w:spacing w:before="160" w:after="160"/>
         <w:ind w:left="283" w:right="283"/>
         <w:shd w:val="clear" w:color="auto" w:fill="EFF3FB"/>
         <w:pBdr>
@@ -521,6 +1683,7 @@
         <w:rPr>
           <w:rFonts w:ascii="Courier New" w:hAnsi="Courier New"/>
           <w:b w:val="0"/>
+          <w:i w:val="0"/>
           <w:sz w:val="16"/>
         </w:rPr>
         <w:t>Przeprowadź mnie przez konfigurację środowiska Claude Code.</w:t>
@@ -539,23 +1702,25 @@
         <w:br/>
         <w:t xml:space="preserve">  nigdy nie programowała</w:t>
         <w:br/>
-        <w:t>- Podawaj JEDNĄ komendę na raz</w:t>
+        <w:t>- Podawaj JEDNĄ komendę lub akcję na raz</w:t>
         <w:br/>
         <w:t>- Czekaj aż powiem "gotowe" zanim przejdziesz do następnego kroku</w:t>
         <w:br/>
         <w:t>- Po każdym kroku sprawdź czy zadziałało</w:t>
         <w:br/>
+        <w:t>- Jeśli coś się nie uda — pomóż mi to naprawić zanim pójdziemy dalej</w:t>
+        <w:br/>
         <w:br/>
         <w:t>CZĘŚĆ A — Instalacja brakujących narzędzi</w:t>
         <w:br/>
         <w:br/>
-        <w:t>1. Sprawdź czy mam Homebrew (brew --version). Jeśli nie — zainstaluj.</w:t>
+        <w:t>1. Sprawdź czy mam Homebrew: brew --version</w:t>
         <w:br/>
-        <w:t xml:space="preserve">   (Homebrew to sklep z narzędziami dla Maca, będzie potrzebny za chwilę)</w:t>
+        <w:t xml:space="preserve">   Jeśli nie ma — zainstaluj. (Homebrew to sklep z narzędziami dla Maca)</w:t>
         <w:br/>
         <w:t>2. Zainstaluj gh i jq: brew install gh jq</w:t>
         <w:br/>
-        <w:t xml:space="preserve">   (gh = logowanie do GitHub, jq = pomocnik do plików konfiguracyjnych)</w:t>
+        <w:t xml:space="preserve">   (gh = do łączenia z GitHub, jq = pomocnik konfiguracyjny)</w:t>
         <w:br/>
         <w:t>3. Zaloguj mnie do GitHub: gh auth login</w:t>
         <w:br/>
@@ -571,39 +1736,47 @@
         <w:br/>
         <w:t xml:space="preserve">   (state-start, catchup, setup-new-project)</w:t>
         <w:br/>
-        <w:t>6. Skopiuj security hook: setup/hooks/security-scan.py → ~/.claude/hooks/ + chmod +x</w:t>
+        <w:t>6. Skopiuj hook bezpieczeństwa: setup/hooks/security-scan.py → ~/.claude/hooks/</w:t>
         <w:br/>
-        <w:t>7. Skopiuj status line: setup/statusline-command.sh → ~/.claude/ + chmod +x</w:t>
+        <w:t xml:space="preserve">   Nadaj uprawnienia: chmod +x</w:t>
         <w:br/>
-        <w:t>8. Wygeneruj ~/.claude/settings.json z konfiguracją hooka i status line</w:t>
+        <w:t>7. Skopiuj status bar: setup/statusline-command.sh → ~/.claude/</w:t>
         <w:br/>
-        <w:t xml:space="preserve">   (użyj $HOME zamiast ~ przy ścieżkach — to ważne)</w:t>
+        <w:t xml:space="preserve">   Nadaj uprawnienia: chmod +x</w:t>
+        <w:br/>
+        <w:t>8. Wygeneruj plik konfiguracyjny ~/.claude/settings.json</w:t>
+        <w:br/>
+        <w:t xml:space="preserve">   z ustawieniami hooka i status baru (użyj $HOME zamiast ~ przy ścieżkach)</w:t>
         <w:br/>
         <w:t>9. Zapytaj mnie o:</w:t>
         <w:br/>
-        <w:t xml:space="preserve">   - język pracy z AI (np. polski / angielski)</w:t>
+        <w:t xml:space="preserve">   - w jakim języku chcę rozmawiać z AI (np. polski)</w:t>
         <w:br/>
         <w:t xml:space="preserve">   - mój GitHub username</w:t>
         <w:br/>
-        <w:t xml:space="preserve">   - gdzie trzymam projekty (np. ~/Projects/)</w:t>
+        <w:t xml:space="preserve">   - gdzie trzymam foldery projektów (np. ~/Projects/)</w:t>
         <w:br/>
-        <w:t xml:space="preserve">   Skopiuj setup/global-claude-template.md → ~/.claude/CLAUDE.md</w:t>
+        <w:t xml:space="preserve">   Potem skopiuj setup/global-claude-template.md → ~/.claude/CLAUDE.md</w:t>
         <w:br/>
-        <w:t xml:space="preserve">   i zastąp wszystkie znaczniki [[...]] moimi danymi</w:t>
+        <w:t xml:space="preserve">   i uzupełnij moje dane w miejscach oznaczonych [[...]]</w:t>
         <w:br/>
-        <w:t>10. W ~/.claude/skills/setup-new-project/SKILL.md zamień GITHUB_USERNAME</w:t>
+        <w:t>10. W pliku ~/.claude/skills/setup-new-project/SKILL.md</w:t>
         <w:br/>
-        <w:t xml:space="preserve">    na mój GitHub username</w:t>
+        <w:t xml:space="preserve">    zamień GITHUB_USERNAME na mój GitHub username</w:t>
         <w:br/>
-        <w:t>11. Weryfikacja: pokaż listę plików, wyświetl settings.json, przetestuj /state-start</w:t>
+        <w:t>11. Weryfikacja końcowa: sprawdź że wszystkie pliki istnieją,</w:t>
+        <w:br/>
+        <w:t xml:space="preserve">    pokaż zawartość settings.json, przetestuj komendę /state-start</w:t>
         <w:br/>
         <w:br/>
-        <w:t>Na końcu powiedz mi jak stworzyć swój pierwszy projekt korzystając z tego folderu</w:t>
+        <w:t>Na końcu wytłumacz mi jak stworzyć swój pierwszy projekt:</w:t>
         <w:br/>
-        <w:t>jako szablonu i jak uruchomić /setup-new-project.</w:t>
+        <w:t>- jak skopiować folder Onboarding jako szablon</w:t>
+        <w:br/>
+        <w:t>- jak uruchomić /setup-new-project żeby stworzyć repo na GitHub</w:t>
         <w:br/>
         <w:br/>
-        <w:t>Pełny opis każdego kroku znajdziesz w: setup/onboarding-prompt.md</w:t>
+        <w:t>Pełny opis każdego kroku: setup/onboarding-prompt.md</w:t>
       </w:r>
     </w:p>
     <w:p>
@@ -614,6 +1787,7 @@
         <w:rPr>
           <w:rFonts w:ascii="Calibri" w:hAnsi="Calibri"/>
           <w:b w:val="0"/>
+          <w:i w:val="0"/>
           <w:color w:val="808080"/>
           <w:sz w:val="18"/>
         </w:rPr>

</xml_diff>

<commit_message>
[fix] Wyłącz automatyczne screenshoty przeglądarki (TAKE_SCREENSHOTS=False)
Co-Authored-By: Claude Sonnet 4.6 <noreply@anthropic.com>
</commit_message>
<xml_diff>
--- a/docs/output/onboarding.docx
+++ b/docs/output/onboarding.docx
@@ -325,47 +325,6 @@
     </w:p>
     <w:p>
       <w:pPr>
-        <w:spacing w:before="120" w:after="40"/>
-        <w:ind w:left="680"/>
-        <w:jc w:val="center"/>
-      </w:pPr>
-      <w:r>
-        <w:drawing>
-          <wp:inline xmlns:a="http://schemas.openxmlformats.org/drawingml/2006/main" xmlns:pic="http://schemas.openxmlformats.org/drawingml/2006/picture">
-            <wp:extent cx="4572000" cy="1424354"/>
-            <wp:docPr id="1" name="Picture 1"/>
-            <wp:cNvGraphicFramePr>
-              <a:graphicFrameLocks noChangeAspect="1"/>
-            </wp:cNvGraphicFramePr>
-            <a:graphic>
-              <a:graphicData uri="http://schemas.openxmlformats.org/drawingml/2006/picture">
-                <pic:pic>
-                  <pic:nvPicPr>
-                    <pic:cNvPr id="0" name="tmpypzgk0_x.png"/>
-                    <pic:cNvPicPr/>
-                  </pic:nvPicPr>
-                  <pic:blipFill>
-                    <a:blip r:embed="rId9"/>
-                    <a:stretch>
-                      <a:fillRect/>
-                    </a:stretch>
-                  </pic:blipFill>
-                  <pic:spPr>
-                    <a:xfrm>
-                      <a:off x="0" y="0"/>
-                      <a:ext cx="4572000" cy="1424354"/>
-                    </a:xfrm>
-                    <a:prstGeom prst="rect"/>
-                  </pic:spPr>
-                </pic:pic>
-              </a:graphicData>
-            </a:graphic>
-          </wp:inline>
-        </w:drawing>
-      </w:r>
-    </w:p>
-    <w:p>
-      <w:pPr>
         <w:spacing w:before="40" w:after="120"/>
         <w:ind w:left="680"/>
       </w:pPr>
@@ -638,47 +597,6 @@
     </w:p>
     <w:p>
       <w:pPr>
-        <w:spacing w:before="120" w:after="40"/>
-        <w:ind w:left="680"/>
-        <w:jc w:val="center"/>
-      </w:pPr>
-      <w:r>
-        <w:drawing>
-          <wp:inline xmlns:a="http://schemas.openxmlformats.org/drawingml/2006/main" xmlns:pic="http://schemas.openxmlformats.org/drawingml/2006/picture">
-            <wp:extent cx="4572000" cy="1424354"/>
-            <wp:docPr id="2" name="Picture 2"/>
-            <wp:cNvGraphicFramePr>
-              <a:graphicFrameLocks noChangeAspect="1"/>
-            </wp:cNvGraphicFramePr>
-            <a:graphic>
-              <a:graphicData uri="http://schemas.openxmlformats.org/drawingml/2006/picture">
-                <pic:pic>
-                  <pic:nvPicPr>
-                    <pic:cNvPr id="0" name="tmpzskc2fkn.png"/>
-                    <pic:cNvPicPr/>
-                  </pic:nvPicPr>
-                  <pic:blipFill>
-                    <a:blip r:embed="rId10"/>
-                    <a:stretch>
-                      <a:fillRect/>
-                    </a:stretch>
-                  </pic:blipFill>
-                  <pic:spPr>
-                    <a:xfrm>
-                      <a:off x="0" y="0"/>
-                      <a:ext cx="4572000" cy="1424354"/>
-                    </a:xfrm>
-                    <a:prstGeom prst="rect"/>
-                  </pic:spPr>
-                </pic:pic>
-              </a:graphicData>
-            </a:graphic>
-          </wp:inline>
-        </w:drawing>
-      </w:r>
-    </w:p>
-    <w:p>
-      <w:pPr>
         <w:spacing w:before="40" w:after="120"/>
         <w:ind w:left="680"/>
       </w:pPr>
@@ -909,7 +827,7 @@
         <w:drawing>
           <wp:inline xmlns:a="http://schemas.openxmlformats.org/drawingml/2006/main" xmlns:pic="http://schemas.openxmlformats.org/drawingml/2006/picture">
             <wp:extent cx="4572000" cy="2637692"/>
-            <wp:docPr id="3" name="Picture 3"/>
+            <wp:docPr id="1" name="Picture 1"/>
             <wp:cNvGraphicFramePr>
               <a:graphicFrameLocks noChangeAspect="1"/>
             </wp:cNvGraphicFramePr>
@@ -917,11 +835,11 @@
               <a:graphicData uri="http://schemas.openxmlformats.org/drawingml/2006/picture">
                 <pic:pic>
                   <pic:nvPicPr>
-                    <pic:cNvPr id="0" name="tmptdib9ivi.png"/>
+                    <pic:cNvPr id="0" name="tmpy3kplok_.png"/>
                     <pic:cNvPicPr/>
                   </pic:nvPicPr>
                   <pic:blipFill>
-                    <a:blip r:embed="rId11"/>
+                    <a:blip r:embed="rId9"/>
                     <a:stretch>
                       <a:fillRect/>
                     </a:stretch>
@@ -1353,7 +1271,7 @@
         <w:drawing>
           <wp:inline xmlns:a="http://schemas.openxmlformats.org/drawingml/2006/main" xmlns:pic="http://schemas.openxmlformats.org/drawingml/2006/picture">
             <wp:extent cx="4572000" cy="1178169"/>
-            <wp:docPr id="4" name="Picture 4"/>
+            <wp:docPr id="2" name="Picture 2"/>
             <wp:cNvGraphicFramePr>
               <a:graphicFrameLocks noChangeAspect="1"/>
             </wp:cNvGraphicFramePr>
@@ -1361,11 +1279,11 @@
               <a:graphicData uri="http://schemas.openxmlformats.org/drawingml/2006/picture">
                 <pic:pic>
                   <pic:nvPicPr>
-                    <pic:cNvPr id="0" name="tmptef885a8.png"/>
+                    <pic:cNvPr id="0" name="tmppmrglw6w.png"/>
                     <pic:cNvPicPr/>
                   </pic:nvPicPr>
                   <pic:blipFill>
-                    <a:blip r:embed="rId12"/>
+                    <a:blip r:embed="rId10"/>
                     <a:stretch>
                       <a:fillRect/>
                     </a:stretch>

</xml_diff>

<commit_message>
[docs] Dodaj przyjazny wstęp do onboarding.docx
- Powitanie: "Nie stresuj się — to prostsze niż myślisz"
- Blok korzyści (zielone tło, 5 punktów): AI 24/7, oszczędność czasu,
  projekty jak profesjonalista, pamięć preferencji, wsparcie bez oceniania
- Szacunek czasu: ok. 20-30 minut (żółty box)
- Zachęta zamykająca wstęp

Co-Authored-By: Claude Sonnet 4.6 <noreply@anthropic.com>
</commit_message>
<xml_diff>
--- a/docs/output/onboarding.docx
+++ b/docs/output/onboarding.docx
@@ -36,7 +36,22 @@
     </w:p>
     <w:p>
       <w:pPr>
-        <w:spacing w:after="120"/>
+        <w:spacing w:before="80" w:after="160"/>
+      </w:pPr>
+      <w:r>
+        <w:rPr>
+          <w:rFonts w:ascii="Calibri" w:hAnsi="Calibri"/>
+          <w:b/>
+          <w:i w:val="0"/>
+          <w:color w:val="1F497D"/>
+          <w:sz w:val="26"/>
+        </w:rPr>
+        <w:t>Hej! Nie stresuj się — to prostsze niż myślisz.</w:t>
+      </w:r>
+    </w:p>
+    <w:p>
+      <w:pPr>
+        <w:spacing w:after="200"/>
       </w:pPr>
       <w:r>
         <w:rPr>
@@ -45,7 +60,264 @@
           <w:i w:val="0"/>
           <w:sz w:val="20"/>
         </w:rPr>
-        <w:t>Masz przed sobą 6 prostych kroków. Nie musisz wiedzieć nic o programowaniu — wystarczy klikać i wpisywać dokładnie to co widzisz. Po 6. kroku Claude (asystent AI) przejmuje i prowadzi Cię przez resztę po polsku.</w:t>
+        <w:t>Nie musisz być informatykiem ani znać się na programowaniu. Ten onboarding jest zaprojektowany tak, żeby każdy — naprawdę każdy — mógł przez niego przejść samodzielnie. A jeśli coś będzie niejasne, Claude (asystent AI) będzie przy Tobie na każdym kroku i wytłumaczy wszystko po ludzku.</w:t>
+      </w:r>
+    </w:p>
+    <w:p>
+      <w:pPr>
+        <w:spacing w:before="40" w:after="80"/>
+      </w:pPr>
+      <w:r>
+        <w:rPr>
+          <w:rFonts w:ascii="Calibri" w:hAnsi="Calibri"/>
+          <w:b/>
+          <w:i w:val="0"/>
+          <w:color w:val="1B5E20"/>
+          <w:sz w:val="22"/>
+        </w:rPr>
+        <w:t>Co zyskasz po instalacji?</w:t>
+      </w:r>
+    </w:p>
+    <w:p>
+      <w:pPr>
+        <w:spacing w:before="60" w:after="60"/>
+        <w:ind w:left="227"/>
+        <w:shd w:val="clear" w:color="auto" w:fill="F1F8F1"/>
+        <w:pBdr>
+          <w:left w:val="single" w:sz="12" w:space="6" w:color="43A047"/>
+        </w:pBdr>
+      </w:pPr>
+      <w:r>
+        <w:rPr>
+          <w:rFonts w:ascii="Calibri" w:hAnsi="Calibri"/>
+          <w:b w:val="0"/>
+          <w:i w:val="0"/>
+          <w:sz w:val="20"/>
+        </w:rPr>
+        <w:t xml:space="preserve">  </w:t>
+      </w:r>
+      <w:r>
+        <w:rPr>
+          <w:rFonts w:ascii="Calibri" w:hAnsi="Calibri"/>
+          <w:b/>
+          <w:i w:val="0"/>
+          <w:color w:val="1B5E20"/>
+          <w:sz w:val="20"/>
+        </w:rPr>
+        <w:t xml:space="preserve">Asystent AI dostępny 24/7  </w:t>
+      </w:r>
+      <w:r>
+        <w:rPr>
+          <w:rFonts w:ascii="Calibri" w:hAnsi="Calibri"/>
+          <w:b w:val="0"/>
+          <w:i w:val="0"/>
+          <w:color w:val="464646"/>
+          <w:sz w:val="20"/>
+        </w:rPr>
+        <w:t>Claude odpowiada na pytania, pisze teksty, tłumaczy dokumenty i rozwiązuje problemy — o każdej porze dnia i nocy.</w:t>
+      </w:r>
+    </w:p>
+    <w:p>
+      <w:pPr>
+        <w:spacing w:before="60" w:after="60"/>
+        <w:ind w:left="227"/>
+        <w:shd w:val="clear" w:color="auto" w:fill="F1F8F1"/>
+        <w:pBdr>
+          <w:left w:val="single" w:sz="12" w:space="6" w:color="43A047"/>
+        </w:pBdr>
+      </w:pPr>
+      <w:r>
+        <w:rPr>
+          <w:rFonts w:ascii="Calibri" w:hAnsi="Calibri"/>
+          <w:b w:val="0"/>
+          <w:i w:val="0"/>
+          <w:sz w:val="20"/>
+        </w:rPr>
+        <w:t xml:space="preserve">  </w:t>
+      </w:r>
+      <w:r>
+        <w:rPr>
+          <w:rFonts w:ascii="Calibri" w:hAnsi="Calibri"/>
+          <w:b/>
+          <w:i w:val="0"/>
+          <w:color w:val="1B5E20"/>
+          <w:sz w:val="20"/>
+        </w:rPr>
+        <w:t xml:space="preserve">Oszczędzasz czas na co dzień  </w:t>
+      </w:r>
+      <w:r>
+        <w:rPr>
+          <w:rFonts w:ascii="Calibri" w:hAnsi="Calibri"/>
+          <w:b w:val="0"/>
+          <w:i w:val="0"/>
+          <w:color w:val="464646"/>
+          <w:sz w:val="20"/>
+        </w:rPr>
+        <w:t>Zadania, które zajmowały Ci godziny, teraz trwają minuty. Raporty, emaile, analizy — Claude robi to za Ciebie.</w:t>
+      </w:r>
+    </w:p>
+    <w:p>
+      <w:pPr>
+        <w:spacing w:before="60" w:after="60"/>
+        <w:ind w:left="227"/>
+        <w:shd w:val="clear" w:color="auto" w:fill="F1F8F1"/>
+        <w:pBdr>
+          <w:left w:val="single" w:sz="12" w:space="6" w:color="43A047"/>
+        </w:pBdr>
+      </w:pPr>
+      <w:r>
+        <w:rPr>
+          <w:rFonts w:ascii="Calibri" w:hAnsi="Calibri"/>
+          <w:b w:val="0"/>
+          <w:i w:val="0"/>
+          <w:sz w:val="20"/>
+        </w:rPr>
+        <w:t xml:space="preserve">  </w:t>
+      </w:r>
+      <w:r>
+        <w:rPr>
+          <w:rFonts w:ascii="Calibri" w:hAnsi="Calibri"/>
+          <w:b/>
+          <w:i w:val="0"/>
+          <w:color w:val="1B5E20"/>
+          <w:sz w:val="20"/>
+        </w:rPr>
+        <w:t xml:space="preserve">Tworzysz projekty jak profesjonalista  </w:t>
+      </w:r>
+      <w:r>
+        <w:rPr>
+          <w:rFonts w:ascii="Calibri" w:hAnsi="Calibri"/>
+          <w:b w:val="0"/>
+          <w:i w:val="0"/>
+          <w:color w:val="464646"/>
+          <w:sz w:val="20"/>
+        </w:rPr>
+        <w:t>Windsurf daje Ci środowisko pracy, w którym Claude widzi Twoje pliki i pomaga Ci w całym projekcie — nie tylko w jednej rozmowie.</w:t>
+      </w:r>
+    </w:p>
+    <w:p>
+      <w:pPr>
+        <w:spacing w:before="60" w:after="60"/>
+        <w:ind w:left="227"/>
+        <w:shd w:val="clear" w:color="auto" w:fill="F1F8F1"/>
+        <w:pBdr>
+          <w:left w:val="single" w:sz="12" w:space="6" w:color="43A047"/>
+        </w:pBdr>
+      </w:pPr>
+      <w:r>
+        <w:rPr>
+          <w:rFonts w:ascii="Calibri" w:hAnsi="Calibri"/>
+          <w:b w:val="0"/>
+          <w:i w:val="0"/>
+          <w:sz w:val="20"/>
+        </w:rPr>
+        <w:t xml:space="preserve">  </w:t>
+      </w:r>
+      <w:r>
+        <w:rPr>
+          <w:rFonts w:ascii="Calibri" w:hAnsi="Calibri"/>
+          <w:b/>
+          <w:i w:val="0"/>
+          <w:color w:val="1B5E20"/>
+          <w:sz w:val="20"/>
+        </w:rPr>
+        <w:t xml:space="preserve">AI pamięta Twoje preferencje  </w:t>
+      </w:r>
+      <w:r>
+        <w:rPr>
+          <w:rFonts w:ascii="Calibri" w:hAnsi="Calibri"/>
+          <w:b w:val="0"/>
+          <w:i w:val="0"/>
+          <w:color w:val="464646"/>
+          <w:sz w:val="20"/>
+        </w:rPr>
+        <w:t>Po konfiguracji Claude zapamiętuje jak lubisz pracować, w jakim języku, co jest dla Ciebie ważne — i stosuje to automatycznie.</w:t>
+      </w:r>
+    </w:p>
+    <w:p>
+      <w:pPr>
+        <w:spacing w:before="60" w:after="60"/>
+        <w:ind w:left="227"/>
+        <w:shd w:val="clear" w:color="auto" w:fill="F1F8F1"/>
+        <w:pBdr>
+          <w:left w:val="single" w:sz="12" w:space="6" w:color="43A047"/>
+        </w:pBdr>
+      </w:pPr>
+      <w:r>
+        <w:rPr>
+          <w:rFonts w:ascii="Calibri" w:hAnsi="Calibri"/>
+          <w:b w:val="0"/>
+          <w:i w:val="0"/>
+          <w:sz w:val="20"/>
+        </w:rPr>
+        <w:t xml:space="preserve">  </w:t>
+      </w:r>
+      <w:r>
+        <w:rPr>
+          <w:rFonts w:ascii="Calibri" w:hAnsi="Calibri"/>
+          <w:b/>
+          <w:i w:val="0"/>
+          <w:color w:val="1B5E20"/>
+          <w:sz w:val="20"/>
+        </w:rPr>
+        <w:t xml:space="preserve">Zawsze masz kogoś do pomocy  </w:t>
+      </w:r>
+      <w:r>
+        <w:rPr>
+          <w:rFonts w:ascii="Calibri" w:hAnsi="Calibri"/>
+          <w:b w:val="0"/>
+          <w:i w:val="0"/>
+          <w:color w:val="464646"/>
+          <w:sz w:val="20"/>
+        </w:rPr>
+        <w:t>Nie wiesz jak coś zrobić? Zapytaj Claude. Nie ocenia, nie się niecierpliwi, tłumaczy tyle razy ile potrzebujesz.</w:t>
+      </w:r>
+    </w:p>
+    <w:p>
+      <w:pPr>
+        <w:spacing w:before="240" w:after="80"/>
+        <w:shd w:val="clear" w:color="auto" w:fill="FFF8E1"/>
+        <w:pBdr>
+          <w:top w:val="single" w:sz="4" w:space="4" w:color="FFA000"/>
+          <w:bottom w:val="single" w:sz="4" w:space="4" w:color="FFA000"/>
+          <w:left w:val="single" w:sz="4" w:space="4" w:color="FFA000"/>
+          <w:right w:val="single" w:sz="4" w:space="4" w:color="FFA000"/>
+        </w:pBdr>
+      </w:pPr>
+      <w:r>
+        <w:rPr>
+          <w:rFonts w:ascii="Calibri" w:hAnsi="Calibri"/>
+          <w:b/>
+          <w:i w:val="0"/>
+          <w:color w:val="E65100"/>
+          <w:sz w:val="20"/>
+        </w:rPr>
+        <w:t xml:space="preserve">  Ile to zajmie?  </w:t>
+      </w:r>
+      <w:r>
+        <w:rPr>
+          <w:rFonts w:ascii="Calibri" w:hAnsi="Calibri"/>
+          <w:b w:val="0"/>
+          <w:i w:val="0"/>
+          <w:color w:val="503C00"/>
+          <w:sz w:val="20"/>
+        </w:rPr>
+        <w:t>Około 20-30 minut — tyle co filiżanka kawy. Pierwsze 5 kroków zrobisz sam w ok. 10-15 minut. Resztą zajmie się Claude interaktywnie.</w:t>
+      </w:r>
+    </w:p>
+    <w:p>
+      <w:pPr>
+        <w:spacing w:before="160" w:after="80"/>
+      </w:pPr>
+      <w:r>
+        <w:rPr>
+          <w:rFonts w:ascii="Calibri" w:hAnsi="Calibri"/>
+          <w:b w:val="0"/>
+          <w:i/>
+          <w:color w:val="646464"/>
+          <w:sz w:val="20"/>
+        </w:rPr>
+        <w:t>Gotowy? Zacznij od Kroku 1 poniżej. Powodzenia!</w:t>
       </w:r>
     </w:p>
     <w:p/>
@@ -835,7 +1107,7 @@
               <a:graphicData uri="http://schemas.openxmlformats.org/drawingml/2006/picture">
                 <pic:pic>
                   <pic:nvPicPr>
-                    <pic:cNvPr id="0" name="tmpy3kplok_.png"/>
+                    <pic:cNvPr id="0" name="tmpln4vdr_4.png"/>
                     <pic:cNvPicPr/>
                   </pic:nvPicPr>
                   <pic:blipFill>
@@ -1279,7 +1551,7 @@
               <a:graphicData uri="http://schemas.openxmlformats.org/drawingml/2006/picture">
                 <pic:pic>
                   <pic:nvPicPr>
-                    <pic:cNvPr id="0" name="tmppmrglw6w.png"/>
+                    <pic:cNvPr id="0" name="tmp9jp10i8c.png"/>
                     <pic:cNvPicPr/>
                   </pic:nvPicPr>
                   <pic:blipFill>

</xml_diff>

<commit_message>
[fix] Uzupełnij luki w onboardingu — dokument i AI prompt
Dokument (onboarding.docx):
- Dodano sekcję "Czego potrzebujesz przed startem" (konto Anthropic, GitHub, Mac, internet)
- Krok 3: komenda npm widoczna wprost w tekście (nie tylko na mockupie)
- Krok 5: info jak założyć konto Anthropic jeśli user go nie ma

onboarding-prompt.md (pełny opis kroków dla Claude):
- KRYTYCZNE: dodano dokładny format settings.json z bash heredoc
  (bez tego Claude generował błędną strukturę — hook i statusline nie działały)
- Krok 6: Claude sprawdza czy user ma konto GitHub zanim zrobi gh auth login
- Poprawiona numeracja kroków (1-9), dodano szczegóły weryfikacji

Co-Authored-By: Claude Sonnet 4.6 <noreply@anthropic.com>
</commit_message>
<xml_diff>
--- a/docs/output/onboarding.docx
+++ b/docs/output/onboarding.docx
@@ -307,7 +307,154 @@
     </w:p>
     <w:p>
       <w:pPr>
-        <w:spacing w:before="160" w:after="80"/>
+        <w:spacing w:before="240" w:after="80"/>
+      </w:pPr>
+      <w:r>
+        <w:rPr>
+          <w:rFonts w:ascii="Calibri" w:hAnsi="Calibri"/>
+          <w:b/>
+          <w:i w:val="0"/>
+          <w:color w:val="641E16"/>
+          <w:sz w:val="22"/>
+        </w:rPr>
+        <w:t>Czego potrzebujesz przed startem?</w:t>
+      </w:r>
+    </w:p>
+    <w:p>
+      <w:pPr>
+        <w:spacing w:before="60" w:after="60"/>
+        <w:ind w:left="227"/>
+        <w:shd w:val="clear" w:color="auto" w:fill="FFF3F3"/>
+        <w:pBdr>
+          <w:left w:val="single" w:sz="12" w:space="6" w:color="E53935"/>
+        </w:pBdr>
+      </w:pPr>
+      <w:r>
+        <w:t xml:space="preserve">  </w:t>
+      </w:r>
+      <w:r>
+        <w:rPr>
+          <w:rFonts w:ascii="Calibri" w:hAnsi="Calibri"/>
+          <w:b/>
+          <w:i w:val="0"/>
+          <w:color w:val="B71C1C"/>
+          <w:sz w:val="20"/>
+        </w:rPr>
+        <w:t xml:space="preserve">Konto Anthropic (Claude)  </w:t>
+      </w:r>
+      <w:r>
+        <w:rPr>
+          <w:rFonts w:ascii="Calibri" w:hAnsi="Calibri"/>
+          <w:b w:val="0"/>
+          <w:i w:val="0"/>
+          <w:color w:val="464646"/>
+          <w:sz w:val="20"/>
+        </w:rPr>
+        <w:t>Bezpłatne konto na claude.ai — bez tego nie zaloguje się Claude. Jeśli nie masz: wejdź na claude.ai, kliknij "Sign up" i utwórz konto.</w:t>
+      </w:r>
+    </w:p>
+    <w:p>
+      <w:pPr>
+        <w:spacing w:before="60" w:after="60"/>
+        <w:ind w:left="227"/>
+        <w:shd w:val="clear" w:color="auto" w:fill="FFF3F3"/>
+        <w:pBdr>
+          <w:left w:val="single" w:sz="12" w:space="6" w:color="E53935"/>
+        </w:pBdr>
+      </w:pPr>
+      <w:r>
+        <w:t xml:space="preserve">  </w:t>
+      </w:r>
+      <w:r>
+        <w:rPr>
+          <w:rFonts w:ascii="Calibri" w:hAnsi="Calibri"/>
+          <w:b/>
+          <w:i w:val="0"/>
+          <w:color w:val="B71C1C"/>
+          <w:sz w:val="20"/>
+        </w:rPr>
+        <w:t xml:space="preserve">Konto GitHub  </w:t>
+      </w:r>
+      <w:r>
+        <w:rPr>
+          <w:rFonts w:ascii="Calibri" w:hAnsi="Calibri"/>
+          <w:b w:val="0"/>
+          <w:i w:val="0"/>
+          <w:color w:val="464646"/>
+          <w:sz w:val="20"/>
+        </w:rPr>
+        <w:t>Bezpłatne konto na github.com — potrzebne do tworzenia projektów. Jeśli nie masz: wejdź na github.com, kliknij "Sign up" i utwórz konto.</w:t>
+      </w:r>
+    </w:p>
+    <w:p>
+      <w:pPr>
+        <w:spacing w:before="60" w:after="60"/>
+        <w:ind w:left="227"/>
+        <w:shd w:val="clear" w:color="auto" w:fill="FFF3F3"/>
+        <w:pBdr>
+          <w:left w:val="single" w:sz="12" w:space="6" w:color="E53935"/>
+        </w:pBdr>
+      </w:pPr>
+      <w:r>
+        <w:t xml:space="preserve">  </w:t>
+      </w:r>
+      <w:r>
+        <w:rPr>
+          <w:rFonts w:ascii="Calibri" w:hAnsi="Calibri"/>
+          <w:b/>
+          <w:i w:val="0"/>
+          <w:color w:val="B71C1C"/>
+          <w:sz w:val="20"/>
+        </w:rPr>
+        <w:t xml:space="preserve">Mac z macOS (ta instrukcja)  </w:t>
+      </w:r>
+      <w:r>
+        <w:rPr>
+          <w:rFonts w:ascii="Calibri" w:hAnsi="Calibri"/>
+          <w:b w:val="0"/>
+          <w:i w:val="0"/>
+          <w:color w:val="464646"/>
+          <w:sz w:val="20"/>
+        </w:rPr>
+        <w:t>Używasz Maca? Świetnie, ta instrukcja jest dla Ciebie. Na Windowsie skorzystaj z osobnej instrukcji: onboarding-windows.docx</w:t>
+      </w:r>
+    </w:p>
+    <w:p>
+      <w:pPr>
+        <w:spacing w:before="60" w:after="60"/>
+        <w:ind w:left="227"/>
+        <w:shd w:val="clear" w:color="auto" w:fill="FFF3F3"/>
+        <w:pBdr>
+          <w:left w:val="single" w:sz="12" w:space="6" w:color="E53935"/>
+        </w:pBdr>
+      </w:pPr>
+      <w:r>
+        <w:t xml:space="preserve">  </w:t>
+      </w:r>
+      <w:r>
+        <w:rPr>
+          <w:rFonts w:ascii="Calibri" w:hAnsi="Calibri"/>
+          <w:b/>
+          <w:i w:val="0"/>
+          <w:color w:val="B71C1C"/>
+          <w:sz w:val="20"/>
+        </w:rPr>
+        <w:t xml:space="preserve">Połączenie z internetem  </w:t>
+      </w:r>
+      <w:r>
+        <w:rPr>
+          <w:rFonts w:ascii="Calibri" w:hAnsi="Calibri"/>
+          <w:b w:val="0"/>
+          <w:i w:val="0"/>
+          <w:color w:val="464646"/>
+          <w:sz w:val="20"/>
+        </w:rPr>
+        <w:t>Potrzebne przez cały czas instalacji i późniejszej pracy z Claude.</w:t>
+      </w:r>
+    </w:p>
+    <w:p>
+      <w:pPr>
+        <w:spacing w:before="200" w:after="80"/>
       </w:pPr>
       <w:r>
         <w:rPr>
@@ -317,7 +464,7 @@
           <w:color w:val="646464"/>
           <w:sz w:val="20"/>
         </w:rPr>
-        <w:t>Gotowy? Zacznij od Kroku 1 poniżej. Powodzenia!</w:t>
+        <w:t>Masz wszystko? Zacznij od Kroku 1 poniżej. Powodzenia!</w:t>
       </w:r>
     </w:p>
     <w:p/>
@@ -1061,7 +1208,7 @@
           <w:i w:val="0"/>
           <w:sz w:val="20"/>
         </w:rPr>
-        <w:t>Wpisz poniższą komendę i naciśnij Enter. Poczekaj — może trwać 1-3 minuty (coś się będzie instalować).</w:t>
+        <w:t>Wpisz dokładnie tę komendę i naciśnij Enter: npm install -g @anthropic-ai/claude-code</w:t>
       </w:r>
     </w:p>
     <w:p>
@@ -1086,7 +1233,32 @@
           <w:i w:val="0"/>
           <w:sz w:val="20"/>
         </w:rPr>
-        <w:t>Gdy skończy, w terminalu pojawi się nowa linia z kursorem — to znak że gotowe.</w:t>
+        <w:t>Poczekaj — może trwać 1-3 minuty. Zobaczysz dużo tekstu — to normalne.</w:t>
+      </w:r>
+    </w:p>
+    <w:p>
+      <w:pPr>
+        <w:spacing w:before="20" w:after="40"/>
+        <w:ind w:left="850" w:hanging="227"/>
+      </w:pPr>
+      <w:r>
+        <w:rPr>
+          <w:rFonts w:ascii="Calibri" w:hAnsi="Calibri"/>
+          <w:b/>
+          <w:i w:val="0"/>
+          <w:color w:val="1F497D"/>
+          <w:sz w:val="20"/>
+        </w:rPr>
+        <w:t xml:space="preserve">7.  </w:t>
+      </w:r>
+      <w:r>
+        <w:rPr>
+          <w:rFonts w:ascii="Calibri" w:hAnsi="Calibri"/>
+          <w:b w:val="0"/>
+          <w:i w:val="0"/>
+          <w:sz w:val="20"/>
+        </w:rPr>
+        <w:t>Gdy skończy, pojawi się nowa linia z kursorem — to znak że gotowe.</w:t>
       </w:r>
     </w:p>
     <w:p>
@@ -1107,7 +1279,7 @@
               <a:graphicData uri="http://schemas.openxmlformats.org/drawingml/2006/picture">
                 <pic:pic>
                   <pic:nvPicPr>
-                    <pic:cNvPr id="0" name="tmpln4vdr_4.png"/>
+                    <pic:cNvPr id="0" name="tmpyojd08ul.png"/>
                     <pic:cNvPicPr/>
                   </pic:nvPicPr>
                   <pic:blipFill>
@@ -1455,7 +1627,7 @@
           <w:i w:val="0"/>
           <w:sz w:val="20"/>
         </w:rPr>
-        <w:t>Claude może zapytać o zgodę — jeśli zobaczysz pytanie, wpisz Y i Enter.</w:t>
+        <w:t>Claude może zapytać o zgodę na uruchomienie — jeśli zobaczysz pytanie, wpisz Y i Enter.</w:t>
       </w:r>
     </w:p>
     <w:p>
@@ -1480,7 +1652,7 @@
           <w:i w:val="0"/>
           <w:sz w:val="20"/>
         </w:rPr>
-        <w:t>Automatycznie otworzy się przeglądarka z prośbą o zalogowanie.</w:t>
+        <w:t>Automatycznie otworzy się przeglądarka z prośbą o zalogowanie. Jeśli nie masz konta Anthropic — kliknij "Sign up" i utwórz je teraz (to bezpłatne). Jeśli masz — zaloguj się normalnie.</w:t>
       </w:r>
     </w:p>
     <w:p>
@@ -1505,7 +1677,7 @@
           <w:i w:val="0"/>
           <w:sz w:val="20"/>
         </w:rPr>
-        <w:t>Zaloguj się przez swoje konto Anthropic (lub utwórz konto jeśli nie masz).</w:t>
+        <w:t>Po zalogowaniu wróć do Windsurf — zostaw przeglądarkę otwartą, po prostu wróć do okna Windsurf.</w:t>
       </w:r>
     </w:p>
     <w:p>
@@ -1530,7 +1702,7 @@
           <w:i w:val="0"/>
           <w:sz w:val="20"/>
         </w:rPr>
-        <w:t>Wróć do Windsurf — w terminalu zobaczysz że Claude czeka na Twój tekst. Zobaczysz coś w stylu: "Claude Code &gt; "</w:t>
+        <w:t>W terminalu zobaczysz że Claude czeka — pojawi się coś w stylu: "Claude Code &gt;"</w:t>
       </w:r>
     </w:p>
     <w:p>
@@ -1551,7 +1723,7 @@
               <a:graphicData uri="http://schemas.openxmlformats.org/drawingml/2006/picture">
                 <pic:pic>
                   <pic:nvPicPr>
-                    <pic:cNvPr id="0" name="tmp9jp10i8c.png"/>
+                    <pic:cNvPr id="0" name="tmpts61tv6i.png"/>
                     <pic:cNvPicPr/>
                   </pic:nvPicPr>
                   <pic:blipFill>

</xml_diff>

<commit_message>
[feat] Połącz macOS i Windows w jeden onboarding.docx
- Jeden dokument zamiast dwóch (onboarding-windows.docx usunięty)
- Kroki 1-2 mają sekcje "Na Macu:" i "Na Windowsie:" z osobnymi instrukcjami
- Kroki 3-6 wspólne z notami gdzie różni się (Cmd vs Ctrl)
- Część 2: dwa bloki promptów — macOS i Windows na jednej stronie
- Część 3 (nowa): "Co dalej?" — /setup-new-project, /state-start, /catchup
- Wstęp: ramka "Który masz system?" z oznaczeniem sekcji Mac/Win
- WIN_HANDOFF_PROMPT: poprawione polskie znaki + settings.json czytelny wieloliniowo

Co-Authored-By: Claude Sonnet 4.6 <noreply@anthropic.com>
</commit_message>
<xml_diff>
--- a/docs/output/onboarding.docx
+++ b/docs/output/onboarding.docx
@@ -31,7 +31,98 @@
           <w:color w:val="808080"/>
           <w:sz w:val="22"/>
         </w:rPr>
-        <w:t>Instrukcja startowa · macOS</w:t>
+        <w:t>Instrukcja startowa · macOS i Windows</w:t>
+      </w:r>
+    </w:p>
+    <w:p>
+      <w:pPr>
+        <w:spacing w:before="120" w:after="200"/>
+        <w:shd w:val="clear" w:color="auto" w:fill="FFF9E6"/>
+        <w:pBdr>
+          <w:top w:val="single" w:sz="6" w:space="4" w:color="FFA000"/>
+          <w:bottom w:val="single" w:sz="6" w:space="4" w:color="FFA000"/>
+          <w:left w:val="single" w:sz="6" w:space="4" w:color="FFA000"/>
+          <w:right w:val="single" w:sz="6" w:space="4" w:color="FFA000"/>
+        </w:pBdr>
+      </w:pPr>
+      <w:r>
+        <w:rPr>
+          <w:rFonts w:ascii="Calibri" w:hAnsi="Calibri"/>
+          <w:b/>
+          <w:i w:val="0"/>
+          <w:color w:val="B45000"/>
+          <w:sz w:val="20"/>
+        </w:rPr>
+        <w:t xml:space="preserve">  Ktory masz system?   </w:t>
+      </w:r>
+      <w:r>
+        <w:rPr>
+          <w:rFonts w:ascii="Calibri" w:hAnsi="Calibri"/>
+          <w:b/>
+          <w:i w:val="0"/>
+          <w:color w:val="3C3C3C"/>
+          <w:sz w:val="20"/>
+        </w:rPr>
+        <w:t>[Apple Mac]</w:t>
+      </w:r>
+      <w:r>
+        <w:rPr>
+          <w:rFonts w:ascii="Calibri" w:hAnsi="Calibri"/>
+          <w:b w:val="0"/>
+          <w:i w:val="0"/>
+          <w:color w:val="3C3C3C"/>
+          <w:sz w:val="20"/>
+        </w:rPr>
+        <w:t xml:space="preserve"> Instrukcje dla Maca oznaczone </w:t>
+      </w:r>
+      <w:r>
+        <w:rPr>
+          <w:rFonts w:ascii="Calibri" w:hAnsi="Calibri"/>
+          <w:b/>
+          <w:i w:val="0"/>
+          <w:color w:val="505050"/>
+          <w:sz w:val="20"/>
+        </w:rPr>
+        <w:t>Na Macu:</w:t>
+      </w:r>
+      <w:r>
+        <w:rPr>
+          <w:rFonts w:ascii="Calibri" w:hAnsi="Calibri"/>
+          <w:b w:val="0"/>
+          <w:i w:val="0"/>
+          <w:sz w:val="20"/>
+        </w:rPr>
+        <w:t xml:space="preserve">     </w:t>
+      </w:r>
+      <w:r>
+        <w:rPr>
+          <w:rFonts w:ascii="Calibri" w:hAnsi="Calibri"/>
+          <w:b/>
+          <w:i w:val="0"/>
+          <w:color w:val="0054A6"/>
+          <w:sz w:val="20"/>
+        </w:rPr>
+        <w:t>[Windows]</w:t>
+      </w:r>
+      <w:r>
+        <w:rPr>
+          <w:rFonts w:ascii="Calibri" w:hAnsi="Calibri"/>
+          <w:b w:val="0"/>
+          <w:i w:val="0"/>
+          <w:color w:val="3C3C3C"/>
+          <w:sz w:val="20"/>
+        </w:rPr>
+        <w:t xml:space="preserve"> Instrukcje dla Windowsa oznaczone </w:t>
+      </w:r>
+      <w:r>
+        <w:rPr>
+          <w:rFonts w:ascii="Calibri" w:hAnsi="Calibri"/>
+          <w:b/>
+          <w:i w:val="0"/>
+          <w:color w:val="0054A6"/>
+          <w:sz w:val="20"/>
+        </w:rPr>
+        <w:t>Na Windowsie:</w:t>
       </w:r>
     </w:p>
     <w:p>
@@ -46,7 +137,7 @@
           <w:color w:val="1F497D"/>
           <w:sz w:val="26"/>
         </w:rPr>
-        <w:t>Hej! Nie stresuj się — to prostsze niż myślisz.</w:t>
+        <w:t>Hej! Nie stresuj sie — to prostsze niz myslisz.</w:t>
       </w:r>
     </w:p>
     <w:p>
@@ -60,7 +151,7 @@
           <w:i w:val="0"/>
           <w:sz w:val="20"/>
         </w:rPr>
-        <w:t>Nie musisz być informatykiem ani znać się na programowaniu. Ten onboarding jest zaprojektowany tak, żeby każdy — naprawdę każdy — mógł przez niego przejść samodzielnie. A jeśli coś będzie niejasne, Claude (asystent AI) będzie przy Tobie na każdym kroku i wytłumaczy wszystko po ludzku.</w:t>
+        <w:t>Nie musisz byc informatykiem ani znac sie na programowaniu. Ten onboarding jest zaprojektowany tak, zeby kazdy — naprawde kazdy — mogl przez niego przejsc samodzielnie. A jesli cos bedzie niejasne, Claude (asystent AI) bedzie przy Tobie na kazdym kroku i wytlumaczy wszystko po ludzku.</w:t>
       </w:r>
     </w:p>
     <w:p>
@@ -104,7 +195,7 @@
           <w:color w:val="1B5E20"/>
           <w:sz w:val="20"/>
         </w:rPr>
-        <w:t xml:space="preserve">Asystent AI dostępny 24/7  </w:t>
+        <w:t xml:space="preserve">Asystent AI dostepny 24/7  </w:t>
       </w:r>
       <w:r>
         <w:rPr>
@@ -114,7 +205,7 @@
           <w:color w:val="464646"/>
           <w:sz w:val="20"/>
         </w:rPr>
-        <w:t>Claude odpowiada na pytania, pisze teksty, tłumaczy dokumenty i rozwiązuje problemy — o każdej porze dnia i nocy.</w:t>
+        <w:t>Claude odpowiada na pytania, pisze teksty, tlumaczy dokumenty i rozwiazuje problemy — o kazdej porze dnia i nocy.</w:t>
       </w:r>
     </w:p>
     <w:p>
@@ -143,7 +234,7 @@
           <w:color w:val="1B5E20"/>
           <w:sz w:val="20"/>
         </w:rPr>
-        <w:t xml:space="preserve">Oszczędzasz czas na co dzień  </w:t>
+        <w:t xml:space="preserve">Oszczedzasz czas na co dzien  </w:t>
       </w:r>
       <w:r>
         <w:rPr>
@@ -153,7 +244,7 @@
           <w:color w:val="464646"/>
           <w:sz w:val="20"/>
         </w:rPr>
-        <w:t>Zadania, które zajmowały Ci godziny, teraz trwają minuty. Raporty, emaile, analizy — Claude robi to za Ciebie.</w:t>
+        <w:t>Zadania, ktore zajmowaly Ci godziny, teraz trwaja minuty. Raporty, emaile, analizy — Claude robi to za Ciebie.</w:t>
       </w:r>
     </w:p>
     <w:p>
@@ -192,7 +283,7 @@
           <w:color w:val="464646"/>
           <w:sz w:val="20"/>
         </w:rPr>
-        <w:t>Windsurf daje Ci środowisko pracy, w którym Claude widzi Twoje pliki i pomaga Ci w całym projekcie — nie tylko w jednej rozmowie.</w:t>
+        <w:t>Windsurf daje Ci srodowisko pracy, w ktorym Claude widzi Twoje pliki i pomaga Ci w calym projekcie — nie tylko w jednej rozmowie.</w:t>
       </w:r>
     </w:p>
     <w:p>
@@ -221,7 +312,7 @@
           <w:color w:val="1B5E20"/>
           <w:sz w:val="20"/>
         </w:rPr>
-        <w:t xml:space="preserve">AI pamięta Twoje preferencje  </w:t>
+        <w:t xml:space="preserve">AI pamieta Twoje preferencje  </w:t>
       </w:r>
       <w:r>
         <w:rPr>
@@ -231,7 +322,7 @@
           <w:color w:val="464646"/>
           <w:sz w:val="20"/>
         </w:rPr>
-        <w:t>Po konfiguracji Claude zapamiętuje jak lubisz pracować, w jakim języku, co jest dla Ciebie ważne — i stosuje to automatycznie.</w:t>
+        <w:t>Po konfiguracji Claude zapamietuje jak lubisz pracowac, w jakim jezyku, co jest dla Ciebie wazne — i stosuje to automatycznie.</w:t>
       </w:r>
     </w:p>
     <w:p>
@@ -260,7 +351,7 @@
           <w:color w:val="1B5E20"/>
           <w:sz w:val="20"/>
         </w:rPr>
-        <w:t xml:space="preserve">Zawsze masz kogoś do pomocy  </w:t>
+        <w:t xml:space="preserve">Zawsze masz kogos do pomocy  </w:t>
       </w:r>
       <w:r>
         <w:rPr>
@@ -270,7 +361,7 @@
           <w:color w:val="464646"/>
           <w:sz w:val="20"/>
         </w:rPr>
-        <w:t>Nie wiesz jak coś zrobić? Zapytaj Claude. Nie ocenia, nie się niecierpliwi, tłumaczy tyle razy ile potrzebujesz.</w:t>
+        <w:t>Nie wiesz jak cos zrobic? Zapytaj Claude. Nie ocenia, nie sie niecierpliwi, tlumaczy tyle razy ile potrzebujesz.</w:t>
       </w:r>
     </w:p>
     <w:p>
@@ -302,7 +393,7 @@
           <w:color w:val="503C00"/>
           <w:sz w:val="20"/>
         </w:rPr>
-        <w:t>Około 20-30 minut — tyle co filiżanka kawy. Pierwsze 5 kroków zrobisz sam w ok. 10-15 minut. Resztą zajmie się Claude interaktywnie.</w:t>
+        <w:t>Okolo 20-30 minut — tyle co filizanka kawy. Pierwsze 5 krokow zrobisz sam w ok. 10-15 minut. Reszta zajmie sie Claude interaktywnie.</w:t>
       </w:r>
     </w:p>
     <w:p>
@@ -350,7 +441,7 @@
           <w:color w:val="464646"/>
           <w:sz w:val="20"/>
         </w:rPr>
-        <w:t>Bezpłatne konto na claude.ai — bez tego nie zaloguje się Claude. Jeśli nie masz: wejdź na claude.ai, kliknij "Sign up" i utwórz konto.</w:t>
+        <w:t>Bezplatne konto na claude.ai — bez tego nie zaloguje sie Claude. Jesli nie masz: wejdz na claude.ai, kliknij "Sign up" i utworz konto.</w:t>
       </w:r>
     </w:p>
     <w:p>
@@ -383,7 +474,7 @@
           <w:color w:val="464646"/>
           <w:sz w:val="20"/>
         </w:rPr>
-        <w:t>Bezpłatne konto na github.com — potrzebne do tworzenia projektów. Jeśli nie masz: wejdź na github.com, kliknij "Sign up" i utwórz konto.</w:t>
+        <w:t>Bezplatne konto na github.com — potrzebne do tworzenia projektow. Jesli nie masz: wejdz na github.com, kliknij "Sign up" i utworz konto.</w:t>
       </w:r>
     </w:p>
     <w:p>
@@ -406,7 +497,7 @@
           <w:color w:val="B71C1C"/>
           <w:sz w:val="20"/>
         </w:rPr>
-        <w:t xml:space="preserve">Mac z macOS (ta instrukcja)  </w:t>
+        <w:t xml:space="preserve">Mac lub Windows 10/11  </w:t>
       </w:r>
       <w:r>
         <w:rPr>
@@ -416,7 +507,7 @@
           <w:color w:val="464646"/>
           <w:sz w:val="20"/>
         </w:rPr>
-        <w:t>Używasz Maca? Świetnie, ta instrukcja jest dla Ciebie. Na Windowsie skorzystaj z osobnej instrukcji: onboarding-windows.docx</w:t>
+        <w:t>Ta instrukcja dziala na obu systemach. Kroki specyficzne dla systemu sa wyraznie oznaczone "Na Macu:" lub "Na Windowsie:".</w:t>
       </w:r>
     </w:p>
     <w:p>
@@ -439,7 +530,7 @@
           <w:color w:val="B71C1C"/>
           <w:sz w:val="20"/>
         </w:rPr>
-        <w:t xml:space="preserve">Połączenie z internetem  </w:t>
+        <w:t xml:space="preserve">Polaczenie z internetem  </w:t>
       </w:r>
       <w:r>
         <w:rPr>
@@ -449,7 +540,7 @@
           <w:color w:val="464646"/>
           <w:sz w:val="20"/>
         </w:rPr>
-        <w:t>Potrzebne przez cały czas instalacji i późniejszej pracy z Claude.</w:t>
+        <w:t>Potrzebne przez caly czas instalacji i pozniejszej pracy z Claude.</w:t>
       </w:r>
     </w:p>
     <w:p>
@@ -464,7 +555,7 @@
           <w:color w:val="646464"/>
           <w:sz w:val="20"/>
         </w:rPr>
-        <w:t>Masz wszystko? Zacznij od Kroku 1 poniżej. Powodzenia!</w:t>
+        <w:t>Masz wszystko? Zacznij od Kroku 1 ponizej. Powodzenia!</w:t>
       </w:r>
     </w:p>
     <w:p/>
@@ -483,7 +574,7 @@
           <w:color w:val="1F497D"/>
           <w:sz w:val="28"/>
         </w:rPr>
-        <w:t>Część 1 — Zrób to sam  (6 kroków)</w:t>
+        <w:t>Czesc 1 — Zrob to sam  (6 krokow)</w:t>
       </w:r>
     </w:p>
     <w:p>
@@ -539,20 +630,38 @@
           <w:color w:val="464646"/>
           <w:sz w:val="20"/>
         </w:rPr>
-        <w:t>Windsurf to program, w którym będziesz pracować razem z asystentem AI. Musisz go zainstalować jak każdy inny program na Macu.</w:t>
+        <w:t>Windsurf to program, w ktorym bedziesz pracowac razem z asystentem AI. Musisz go zainstalowac jak kazdy inny program.</w:t>
       </w:r>
     </w:p>
     <w:p>
       <w:pPr>
-        <w:spacing w:before="20" w:after="40"/>
-        <w:ind w:left="850" w:hanging="227"/>
+        <w:spacing w:before="80" w:after="40"/>
+        <w:ind w:left="850"/>
+        <w:pBdr>
+          <w:left w:val="single" w:sz="8" w:space="6" w:color="999999"/>
+        </w:pBdr>
       </w:pPr>
       <w:r>
         <w:rPr>
           <w:rFonts w:ascii="Calibri" w:hAnsi="Calibri"/>
           <w:b/>
           <w:i w:val="0"/>
-          <w:color w:val="1F497D"/>
+          <w:sz w:val="20"/>
+        </w:rPr>
+        <w:t>Na Macu:</w:t>
+      </w:r>
+    </w:p>
+    <w:p>
+      <w:pPr>
+        <w:spacing w:before="20" w:after="40"/>
+        <w:ind w:left="1247" w:hanging="227"/>
+      </w:pPr>
+      <w:r>
+        <w:rPr>
+          <w:rFonts w:ascii="Calibri" w:hAnsi="Calibri"/>
+          <w:b/>
+          <w:i w:val="0"/>
+          <w:color w:val="505050"/>
           <w:sz w:val="20"/>
         </w:rPr>
         <w:t xml:space="preserve">1.  </w:t>
@@ -564,20 +673,20 @@
           <w:i w:val="0"/>
           <w:sz w:val="20"/>
         </w:rPr>
-        <w:t>Otwórz przeglądarkę na Macu (Safari, Chrome — cokolwiek masz).</w:t>
+        <w:t>Otworz przegladarke (Safari, Chrome — cokolwiek masz).</w:t>
       </w:r>
     </w:p>
     <w:p>
       <w:pPr>
         <w:spacing w:before="20" w:after="40"/>
-        <w:ind w:left="850" w:hanging="227"/>
+        <w:ind w:left="1247" w:hanging="227"/>
       </w:pPr>
       <w:r>
         <w:rPr>
           <w:rFonts w:ascii="Calibri" w:hAnsi="Calibri"/>
           <w:b/>
           <w:i w:val="0"/>
-          <w:color w:val="1F497D"/>
+          <w:color w:val="505050"/>
           <w:sz w:val="20"/>
         </w:rPr>
         <w:t xml:space="preserve">2.  </w:t>
@@ -589,20 +698,20 @@
           <w:i w:val="0"/>
           <w:sz w:val="20"/>
         </w:rPr>
-        <w:t>W pasku adresu u góry wpisz: windsurf.com  i naciśnij Enter.</w:t>
+        <w:t>Wejdz na strone: windsurf.com i nacisnij Enter.</w:t>
       </w:r>
     </w:p>
     <w:p>
       <w:pPr>
         <w:spacing w:before="20" w:after="40"/>
-        <w:ind w:left="850" w:hanging="227"/>
+        <w:ind w:left="1247" w:hanging="227"/>
       </w:pPr>
       <w:r>
         <w:rPr>
           <w:rFonts w:ascii="Calibri" w:hAnsi="Calibri"/>
           <w:b/>
           <w:i w:val="0"/>
-          <w:color w:val="1F497D"/>
+          <w:color w:val="505050"/>
           <w:sz w:val="20"/>
         </w:rPr>
         <w:t xml:space="preserve">3.  </w:t>
@@ -614,20 +723,20 @@
           <w:i w:val="0"/>
           <w:sz w:val="20"/>
         </w:rPr>
-        <w:t>Na stronie zobaczysz przycisk do pobierania — kliknij go (może się nazywać "Download for macOS" lub "Download for Mac").</w:t>
+        <w:t>Kliknij przycisk pobierania dla Maca (moze sie nazywac "Download for macOS" lub "Download for Mac").</w:t>
       </w:r>
     </w:p>
     <w:p>
       <w:pPr>
         <w:spacing w:before="20" w:after="40"/>
-        <w:ind w:left="850" w:hanging="227"/>
+        <w:ind w:left="1247" w:hanging="227"/>
       </w:pPr>
       <w:r>
         <w:rPr>
           <w:rFonts w:ascii="Calibri" w:hAnsi="Calibri"/>
           <w:b/>
           <w:i w:val="0"/>
-          <w:color w:val="1F497D"/>
+          <w:color w:val="505050"/>
           <w:sz w:val="20"/>
         </w:rPr>
         <w:t xml:space="preserve">4.  </w:t>
@@ -639,20 +748,20 @@
           <w:i w:val="0"/>
           <w:sz w:val="20"/>
         </w:rPr>
-        <w:t>Poczekaj chwilę — plik pobierze się do folderu Pobrane (Downloads). Zobaczysz go na dole okna przeglądarki lub w Finderze → Pobrane.</w:t>
+        <w:t>Poczekaj — plik pobierze sie do folderu Pobrane (Downloads). Zobaczysz go na dole okna przegladarki lub w Finderze Pobrane.</w:t>
       </w:r>
     </w:p>
     <w:p>
       <w:pPr>
         <w:spacing w:before="20" w:after="40"/>
-        <w:ind w:left="850" w:hanging="227"/>
+        <w:ind w:left="1247" w:hanging="227"/>
       </w:pPr>
       <w:r>
         <w:rPr>
           <w:rFonts w:ascii="Calibri" w:hAnsi="Calibri"/>
           <w:b/>
           <w:i w:val="0"/>
-          <w:color w:val="1F497D"/>
+          <w:color w:val="505050"/>
           <w:sz w:val="20"/>
         </w:rPr>
         <w:t xml:space="preserve">5.  </w:t>
@@ -664,20 +773,20 @@
           <w:i w:val="0"/>
           <w:sz w:val="20"/>
         </w:rPr>
-        <w:t>Kliknij dwukrotnie na pobrany plik (kończy się na .dmg).</w:t>
+        <w:t>Kliknij dwukrotnie na pobrany plik (konczy sie na .dmg).</w:t>
       </w:r>
     </w:p>
     <w:p>
       <w:pPr>
         <w:spacing w:before="20" w:after="40"/>
-        <w:ind w:left="850" w:hanging="227"/>
+        <w:ind w:left="1247" w:hanging="227"/>
       </w:pPr>
       <w:r>
         <w:rPr>
           <w:rFonts w:ascii="Calibri" w:hAnsi="Calibri"/>
           <w:b/>
           <w:i w:val="0"/>
-          <w:color w:val="1F497D"/>
+          <w:color w:val="505050"/>
           <w:sz w:val="20"/>
         </w:rPr>
         <w:t xml:space="preserve">6.  </w:t>
@@ -689,20 +798,20 @@
           <w:i w:val="0"/>
           <w:sz w:val="20"/>
         </w:rPr>
-        <w:t>Pojawi się okienko — przeciągnij ikonę Windsurf do folderu Applications.</w:t>
+        <w:t>Pojawi sie okienko — przeciagnij ikone Windsurf do folderu Applications.</w:t>
       </w:r>
     </w:p>
     <w:p>
       <w:pPr>
         <w:spacing w:before="20" w:after="40"/>
-        <w:ind w:left="850" w:hanging="227"/>
+        <w:ind w:left="1247" w:hanging="227"/>
       </w:pPr>
       <w:r>
         <w:rPr>
           <w:rFonts w:ascii="Calibri" w:hAnsi="Calibri"/>
           <w:b/>
           <w:i w:val="0"/>
-          <w:color w:val="1F497D"/>
+          <w:color w:val="505050"/>
           <w:sz w:val="20"/>
         </w:rPr>
         <w:t xml:space="preserve">7.  </w:t>
@@ -714,20 +823,20 @@
           <w:i w:val="0"/>
           <w:sz w:val="20"/>
         </w:rPr>
-        <w:t>Poczekaj aż się skopiuje i zamknij to okienko.</w:t>
+        <w:t>Poczekaj az sie skopiuje i zamknij to okienko.</w:t>
       </w:r>
     </w:p>
     <w:p>
       <w:pPr>
         <w:spacing w:before="20" w:after="40"/>
-        <w:ind w:left="850" w:hanging="227"/>
+        <w:ind w:left="1247" w:hanging="227"/>
       </w:pPr>
       <w:r>
         <w:rPr>
           <w:rFonts w:ascii="Calibri" w:hAnsi="Calibri"/>
           <w:b/>
           <w:i w:val="0"/>
-          <w:color w:val="1F497D"/>
+          <w:color w:val="505050"/>
           <w:sz w:val="20"/>
         </w:rPr>
         <w:t xml:space="preserve">8.  </w:t>
@@ -739,7 +848,48 @@
           <w:i w:val="0"/>
           <w:sz w:val="20"/>
         </w:rPr>
-        <w:t>Otwórz Windsurf: kliknij ikonę rakiety w Docku (Launchpad) lub naciśnij Cmd+Spacja, wpisz "Windsurf" i kliknij.</w:t>
+        <w:t>Otworz Windsurf: kliknij ikone rakiety w Docku (Launchpad) lub nacisnij Cmd+Spacja, wpisz "Windsurf" i kliknij.</w:t>
+      </w:r>
+    </w:p>
+    <w:p>
+      <w:pPr>
+        <w:spacing w:before="120" w:after="40"/>
+        <w:ind w:left="680"/>
+        <w:jc w:val="center"/>
+      </w:pPr>
+      <w:r>
+        <w:drawing>
+          <wp:inline xmlns:a="http://schemas.openxmlformats.org/drawingml/2006/main" xmlns:pic="http://schemas.openxmlformats.org/drawingml/2006/picture">
+            <wp:extent cx="4572000" cy="2637692"/>
+            <wp:docPr id="1" name="Picture 1"/>
+            <wp:cNvGraphicFramePr>
+              <a:graphicFrameLocks noChangeAspect="1"/>
+            </wp:cNvGraphicFramePr>
+            <a:graphic>
+              <a:graphicData uri="http://schemas.openxmlformats.org/drawingml/2006/picture">
+                <pic:pic>
+                  <pic:nvPicPr>
+                    <pic:cNvPr id="0" name="tmpxvjkiysj.png"/>
+                    <pic:cNvPicPr/>
+                  </pic:nvPicPr>
+                  <pic:blipFill>
+                    <a:blip r:embed="rId9"/>
+                    <a:stretch>
+                      <a:fillRect/>
+                    </a:stretch>
+                  </pic:blipFill>
+                  <pic:spPr>
+                    <a:xfrm>
+                      <a:off x="0" y="0"/>
+                      <a:ext cx="4572000" cy="2637692"/>
+                    </a:xfrm>
+                    <a:prstGeom prst="rect"/>
+                  </pic:spPr>
+                </pic:pic>
+              </a:graphicData>
+            </a:graphic>
+          </wp:inline>
+        </w:drawing>
       </w:r>
     </w:p>
     <w:p>
@@ -755,7 +905,282 @@
           <w:color w:val="646464"/>
           <w:sz w:val="18"/>
         </w:rPr>
-        <w:t xml:space="preserve">  Tak wygląda strona Windsurf — kliknij duży przycisk pobierania.</w:t>
+        <w:t xml:space="preserve">  Windsurf na Macu — Terminal otworzysz przez Terminal → New Terminal.</w:t>
+      </w:r>
+    </w:p>
+    <w:p>
+      <w:pPr>
+        <w:spacing w:before="80" w:after="40"/>
+        <w:ind w:left="850"/>
+        <w:pBdr>
+          <w:left w:val="single" w:sz="8" w:space="6" w:color="0078D4"/>
+        </w:pBdr>
+      </w:pPr>
+      <w:r>
+        <w:rPr>
+          <w:rFonts w:ascii="Calibri" w:hAnsi="Calibri"/>
+          <w:b/>
+          <w:i w:val="0"/>
+          <w:sz w:val="20"/>
+        </w:rPr>
+        <w:t>Na Windowsie:</w:t>
+      </w:r>
+    </w:p>
+    <w:p>
+      <w:pPr>
+        <w:spacing w:before="20" w:after="40"/>
+        <w:ind w:left="1247" w:hanging="227"/>
+      </w:pPr>
+      <w:r>
+        <w:rPr>
+          <w:rFonts w:ascii="Calibri" w:hAnsi="Calibri"/>
+          <w:b/>
+          <w:i w:val="0"/>
+          <w:color w:val="0054A6"/>
+          <w:sz w:val="20"/>
+        </w:rPr>
+        <w:t xml:space="preserve">1.  </w:t>
+      </w:r>
+      <w:r>
+        <w:rPr>
+          <w:rFonts w:ascii="Calibri" w:hAnsi="Calibri"/>
+          <w:b w:val="0"/>
+          <w:i w:val="0"/>
+          <w:sz w:val="20"/>
+        </w:rPr>
+        <w:t>Otworz przegladarke (Edge, Chrome — cokolwiek masz).</w:t>
+      </w:r>
+    </w:p>
+    <w:p>
+      <w:pPr>
+        <w:spacing w:before="20" w:after="40"/>
+        <w:ind w:left="1247" w:hanging="227"/>
+      </w:pPr>
+      <w:r>
+        <w:rPr>
+          <w:rFonts w:ascii="Calibri" w:hAnsi="Calibri"/>
+          <w:b/>
+          <w:i w:val="0"/>
+          <w:color w:val="0054A6"/>
+          <w:sz w:val="20"/>
+        </w:rPr>
+        <w:t xml:space="preserve">2.  </w:t>
+      </w:r>
+      <w:r>
+        <w:rPr>
+          <w:rFonts w:ascii="Calibri" w:hAnsi="Calibri"/>
+          <w:b w:val="0"/>
+          <w:i w:val="0"/>
+          <w:sz w:val="20"/>
+        </w:rPr>
+        <w:t>Wejdz na strone: windsurf.com i nacisnij Enter.</w:t>
+      </w:r>
+    </w:p>
+    <w:p>
+      <w:pPr>
+        <w:spacing w:before="20" w:after="40"/>
+        <w:ind w:left="1247" w:hanging="227"/>
+      </w:pPr>
+      <w:r>
+        <w:rPr>
+          <w:rFonts w:ascii="Calibri" w:hAnsi="Calibri"/>
+          <w:b/>
+          <w:i w:val="0"/>
+          <w:color w:val="0054A6"/>
+          <w:sz w:val="20"/>
+        </w:rPr>
+        <w:t xml:space="preserve">3.  </w:t>
+      </w:r>
+      <w:r>
+        <w:rPr>
+          <w:rFonts w:ascii="Calibri" w:hAnsi="Calibri"/>
+          <w:b w:val="0"/>
+          <w:i w:val="0"/>
+          <w:sz w:val="20"/>
+        </w:rPr>
+        <w:t>Kliknij przycisk pobierania dla Windows (moze sie nazywac "Download for Windows" lub podobnie).</w:t>
+      </w:r>
+    </w:p>
+    <w:p>
+      <w:pPr>
+        <w:spacing w:before="20" w:after="40"/>
+        <w:ind w:left="1247" w:hanging="227"/>
+      </w:pPr>
+      <w:r>
+        <w:rPr>
+          <w:rFonts w:ascii="Calibri" w:hAnsi="Calibri"/>
+          <w:b/>
+          <w:i w:val="0"/>
+          <w:color w:val="0054A6"/>
+          <w:sz w:val="20"/>
+        </w:rPr>
+        <w:t xml:space="preserve">4.  </w:t>
+      </w:r>
+      <w:r>
+        <w:rPr>
+          <w:rFonts w:ascii="Calibri" w:hAnsi="Calibri"/>
+          <w:b w:val="0"/>
+          <w:i w:val="0"/>
+          <w:sz w:val="20"/>
+        </w:rPr>
+        <w:t>Poczekaj — plik .exe lub .msi pobierze sie do folderu Pobrane.</w:t>
+      </w:r>
+    </w:p>
+    <w:p>
+      <w:pPr>
+        <w:spacing w:before="20" w:after="40"/>
+        <w:ind w:left="1247" w:hanging="227"/>
+      </w:pPr>
+      <w:r>
+        <w:rPr>
+          <w:rFonts w:ascii="Calibri" w:hAnsi="Calibri"/>
+          <w:b/>
+          <w:i w:val="0"/>
+          <w:color w:val="0054A6"/>
+          <w:sz w:val="20"/>
+        </w:rPr>
+        <w:t xml:space="preserve">5.  </w:t>
+      </w:r>
+      <w:r>
+        <w:rPr>
+          <w:rFonts w:ascii="Calibri" w:hAnsi="Calibri"/>
+          <w:b w:val="0"/>
+          <w:i w:val="0"/>
+          <w:sz w:val="20"/>
+        </w:rPr>
+        <w:t>Otworz pobrany plik (kliknij dwukrotnie).</w:t>
+      </w:r>
+    </w:p>
+    <w:p>
+      <w:pPr>
+        <w:spacing w:before="20" w:after="40"/>
+        <w:ind w:left="1247" w:hanging="227"/>
+      </w:pPr>
+      <w:r>
+        <w:rPr>
+          <w:rFonts w:ascii="Calibri" w:hAnsi="Calibri"/>
+          <w:b/>
+          <w:i w:val="0"/>
+          <w:color w:val="0054A6"/>
+          <w:sz w:val="20"/>
+        </w:rPr>
+        <w:t xml:space="preserve">6.  </w:t>
+      </w:r>
+      <w:r>
+        <w:rPr>
+          <w:rFonts w:ascii="Calibri" w:hAnsi="Calibri"/>
+          <w:b w:val="0"/>
+          <w:i w:val="0"/>
+          <w:sz w:val="20"/>
+        </w:rPr>
+        <w:t>Jesli Windows zapyta "Czy chcesz zezwolic..." — kliknij Tak.</w:t>
+      </w:r>
+    </w:p>
+    <w:p>
+      <w:pPr>
+        <w:spacing w:before="20" w:after="40"/>
+        <w:ind w:left="1247" w:hanging="227"/>
+      </w:pPr>
+      <w:r>
+        <w:rPr>
+          <w:rFonts w:ascii="Calibri" w:hAnsi="Calibri"/>
+          <w:b/>
+          <w:i w:val="0"/>
+          <w:color w:val="0054A6"/>
+          <w:sz w:val="20"/>
+        </w:rPr>
+        <w:t xml:space="preserve">7.  </w:t>
+      </w:r>
+      <w:r>
+        <w:rPr>
+          <w:rFonts w:ascii="Calibri" w:hAnsi="Calibri"/>
+          <w:b w:val="0"/>
+          <w:i w:val="0"/>
+          <w:sz w:val="20"/>
+        </w:rPr>
+        <w:t>Instalator sie otworzy — klikaj Dalej/Next przez kolejne ekrany.</w:t>
+      </w:r>
+    </w:p>
+    <w:p>
+      <w:pPr>
+        <w:spacing w:before="20" w:after="40"/>
+        <w:ind w:left="1247" w:hanging="227"/>
+      </w:pPr>
+      <w:r>
+        <w:rPr>
+          <w:rFonts w:ascii="Calibri" w:hAnsi="Calibri"/>
+          <w:b/>
+          <w:i w:val="0"/>
+          <w:color w:val="0054A6"/>
+          <w:sz w:val="20"/>
+        </w:rPr>
+        <w:t xml:space="preserve">8.  </w:t>
+      </w:r>
+      <w:r>
+        <w:rPr>
+          <w:rFonts w:ascii="Calibri" w:hAnsi="Calibri"/>
+          <w:b w:val="0"/>
+          <w:i w:val="0"/>
+          <w:sz w:val="20"/>
+        </w:rPr>
+        <w:t>Po instalacji kliknij Windsurf na Pulpicie lub w Menu Start.</w:t>
+      </w:r>
+    </w:p>
+    <w:p>
+      <w:pPr>
+        <w:spacing w:before="120" w:after="40"/>
+        <w:ind w:left="680"/>
+        <w:jc w:val="center"/>
+      </w:pPr>
+      <w:r>
+        <w:drawing>
+          <wp:inline xmlns:a="http://schemas.openxmlformats.org/drawingml/2006/main" xmlns:pic="http://schemas.openxmlformats.org/drawingml/2006/picture">
+            <wp:extent cx="4572000" cy="2637692"/>
+            <wp:docPr id="2" name="Picture 2"/>
+            <wp:cNvGraphicFramePr>
+              <a:graphicFrameLocks noChangeAspect="1"/>
+            </wp:cNvGraphicFramePr>
+            <a:graphic>
+              <a:graphicData uri="http://schemas.openxmlformats.org/drawingml/2006/picture">
+                <pic:pic>
+                  <pic:nvPicPr>
+                    <pic:cNvPr id="0" name="tmpc8oxyrt9.png"/>
+                    <pic:cNvPicPr/>
+                  </pic:nvPicPr>
+                  <pic:blipFill>
+                    <a:blip r:embed="rId10"/>
+                    <a:stretch>
+                      <a:fillRect/>
+                    </a:stretch>
+                  </pic:blipFill>
+                  <pic:spPr>
+                    <a:xfrm>
+                      <a:off x="0" y="0"/>
+                      <a:ext cx="4572000" cy="2637692"/>
+                    </a:xfrm>
+                    <a:prstGeom prst="rect"/>
+                  </pic:spPr>
+                </pic:pic>
+              </a:graphicData>
+            </a:graphic>
+          </wp:inline>
+        </w:drawing>
+      </w:r>
+    </w:p>
+    <w:p>
+      <w:pPr>
+        <w:spacing w:before="40" w:after="120"/>
+        <w:ind w:left="680"/>
+      </w:pPr>
+      <w:r>
+        <w:rPr>
+          <w:rFonts w:ascii="Calibri" w:hAnsi="Calibri"/>
+          <w:b w:val="0"/>
+          <w:i/>
+          <w:color w:val="646464"/>
+          <w:sz w:val="18"/>
+        </w:rPr>
+        <w:t xml:space="preserve">  Windsurf na Windowsie — Terminal (niebieski, PowerShell) otworzysz przez Terminal → New Terminal.</w:t>
       </w:r>
     </w:p>
     <w:p>
@@ -811,20 +1236,38 @@
           <w:color w:val="464646"/>
           <w:sz w:val="20"/>
         </w:rPr>
-        <w:t>Node.js to silnik, bez którego Claude nie uruchomi się. Instaluje się jak każdy normalny program — kilka kliknięć.</w:t>
+        <w:t>Node.js to silnik, bez ktorego Claude nie uruchomi sie. Instaluje sie jak kazdy normalny program — kilka klikniec.</w:t>
       </w:r>
     </w:p>
     <w:p>
       <w:pPr>
-        <w:spacing w:before="20" w:after="40"/>
-        <w:ind w:left="850" w:hanging="227"/>
+        <w:spacing w:before="80" w:after="40"/>
+        <w:ind w:left="850"/>
+        <w:pBdr>
+          <w:left w:val="single" w:sz="8" w:space="6" w:color="999999"/>
+        </w:pBdr>
       </w:pPr>
       <w:r>
         <w:rPr>
           <w:rFonts w:ascii="Calibri" w:hAnsi="Calibri"/>
           <w:b/>
           <w:i w:val="0"/>
-          <w:color w:val="1F497D"/>
+          <w:sz w:val="20"/>
+        </w:rPr>
+        <w:t>Na Macu:</w:t>
+      </w:r>
+    </w:p>
+    <w:p>
+      <w:pPr>
+        <w:spacing w:before="20" w:after="40"/>
+        <w:ind w:left="1247" w:hanging="227"/>
+      </w:pPr>
+      <w:r>
+        <w:rPr>
+          <w:rFonts w:ascii="Calibri" w:hAnsi="Calibri"/>
+          <w:b/>
+          <w:i w:val="0"/>
+          <w:color w:val="505050"/>
           <w:sz w:val="20"/>
         </w:rPr>
         <w:t xml:space="preserve">1.  </w:t>
@@ -836,20 +1279,20 @@
           <w:i w:val="0"/>
           <w:sz w:val="20"/>
         </w:rPr>
-        <w:t>Otwórz przeglądarkę (albo użyj tej samej co przed chwilą).</w:t>
+        <w:t>Wejdz na strone: nodejs.org</w:t>
       </w:r>
     </w:p>
     <w:p>
       <w:pPr>
         <w:spacing w:before="20" w:after="40"/>
-        <w:ind w:left="850" w:hanging="227"/>
+        <w:ind w:left="1247" w:hanging="227"/>
       </w:pPr>
       <w:r>
         <w:rPr>
           <w:rFonts w:ascii="Calibri" w:hAnsi="Calibri"/>
           <w:b/>
           <w:i w:val="0"/>
-          <w:color w:val="1F497D"/>
+          <w:color w:val="505050"/>
           <w:sz w:val="20"/>
         </w:rPr>
         <w:t xml:space="preserve">2.  </w:t>
@@ -861,20 +1304,20 @@
           <w:i w:val="0"/>
           <w:sz w:val="20"/>
         </w:rPr>
-        <w:t>Wejdź na stronę: nodejs.org</w:t>
+        <w:t>Kliknij zielony przycisk "Download Node.js (LTS)" — ten z napisem "Recommended for most users". NIE klikaj "Current".</w:t>
       </w:r>
     </w:p>
     <w:p>
       <w:pPr>
         <w:spacing w:before="20" w:after="40"/>
-        <w:ind w:left="850" w:hanging="227"/>
+        <w:ind w:left="1247" w:hanging="227"/>
       </w:pPr>
       <w:r>
         <w:rPr>
           <w:rFonts w:ascii="Calibri" w:hAnsi="Calibri"/>
           <w:b/>
           <w:i w:val="0"/>
-          <w:color w:val="1F497D"/>
+          <w:color w:val="505050"/>
           <w:sz w:val="20"/>
         </w:rPr>
         <w:t xml:space="preserve">3.  </w:t>
@@ -886,20 +1329,20 @@
           <w:i w:val="0"/>
           <w:sz w:val="20"/>
         </w:rPr>
-        <w:t>Zobaczysz dwa przyciski. Kliknij ten zielony — ma napis "Download Node.js (LTS)" i podpis "Recommended for most users". NIE klikaj drugiego (Current).</w:t>
+        <w:t>Plik .pkg pobierze sie — poczekaj az skonczy.</w:t>
       </w:r>
     </w:p>
     <w:p>
       <w:pPr>
         <w:spacing w:before="20" w:after="40"/>
-        <w:ind w:left="850" w:hanging="227"/>
+        <w:ind w:left="1247" w:hanging="227"/>
       </w:pPr>
       <w:r>
         <w:rPr>
           <w:rFonts w:ascii="Calibri" w:hAnsi="Calibri"/>
           <w:b/>
           <w:i w:val="0"/>
-          <w:color w:val="1F497D"/>
+          <w:color w:val="505050"/>
           <w:sz w:val="20"/>
         </w:rPr>
         <w:t xml:space="preserve">4.  </w:t>
@@ -911,20 +1354,20 @@
           <w:i w:val="0"/>
           <w:sz w:val="20"/>
         </w:rPr>
-        <w:t>Plik .pkg pobierze się — poczekaj aż skończy.</w:t>
+        <w:t>Otworz pobrany plik (kliknij dwukrotnie).</w:t>
       </w:r>
     </w:p>
     <w:p>
       <w:pPr>
         <w:spacing w:before="20" w:after="40"/>
-        <w:ind w:left="850" w:hanging="227"/>
+        <w:ind w:left="1247" w:hanging="227"/>
       </w:pPr>
       <w:r>
         <w:rPr>
           <w:rFonts w:ascii="Calibri" w:hAnsi="Calibri"/>
           <w:b/>
           <w:i w:val="0"/>
-          <w:color w:val="1F497D"/>
+          <w:color w:val="505050"/>
           <w:sz w:val="20"/>
         </w:rPr>
         <w:t xml:space="preserve">5.  </w:t>
@@ -936,20 +1379,20 @@
           <w:i w:val="0"/>
           <w:sz w:val="20"/>
         </w:rPr>
-        <w:t>Otwórz pobrany plik (kliknij dwukrotnie).</w:t>
+        <w:t>Klikaj "Kontynuuj" (Continue) przez kazdy ekran instalatora.</w:t>
       </w:r>
     </w:p>
     <w:p>
       <w:pPr>
         <w:spacing w:before="20" w:after="40"/>
-        <w:ind w:left="850" w:hanging="227"/>
+        <w:ind w:left="1247" w:hanging="227"/>
       </w:pPr>
       <w:r>
         <w:rPr>
           <w:rFonts w:ascii="Calibri" w:hAnsi="Calibri"/>
           <w:b/>
           <w:i w:val="0"/>
-          <w:color w:val="1F497D"/>
+          <w:color w:val="505050"/>
           <w:sz w:val="20"/>
         </w:rPr>
         <w:t xml:space="preserve">6.  </w:t>
@@ -961,20 +1404,20 @@
           <w:i w:val="0"/>
           <w:sz w:val="20"/>
         </w:rPr>
-        <w:t>Pojawi się instalator. Klikaj "Kontynuuj" (Continue) przez każdy ekran — nie musisz nic zmieniać.</w:t>
+        <w:t>Na koncu kliknij "Zainstaluj" (Install). Mac moze zapytac o haslo — wpisz swoje haslo do komputera.</w:t>
       </w:r>
     </w:p>
     <w:p>
       <w:pPr>
         <w:spacing w:before="20" w:after="40"/>
-        <w:ind w:left="850" w:hanging="227"/>
+        <w:ind w:left="1247" w:hanging="227"/>
       </w:pPr>
       <w:r>
         <w:rPr>
           <w:rFonts w:ascii="Calibri" w:hAnsi="Calibri"/>
           <w:b/>
           <w:i w:val="0"/>
-          <w:color w:val="1F497D"/>
+          <w:color w:val="505050"/>
           <w:sz w:val="20"/>
         </w:rPr>
         <w:t xml:space="preserve">7.  </w:t>
@@ -986,32 +1429,7 @@
           <w:i w:val="0"/>
           <w:sz w:val="20"/>
         </w:rPr>
-        <w:t>Na końcu kliknij "Zainstaluj" (Install). Mac może zapytać o hasło — wpisz swoje hasło do komputera.</w:t>
-      </w:r>
-    </w:p>
-    <w:p>
-      <w:pPr>
-        <w:spacing w:before="20" w:after="40"/>
-        <w:ind w:left="850" w:hanging="227"/>
-      </w:pPr>
-      <w:r>
-        <w:rPr>
-          <w:rFonts w:ascii="Calibri" w:hAnsi="Calibri"/>
-          <w:b/>
-          <w:i w:val="0"/>
-          <w:color w:val="1F497D"/>
-          <w:sz w:val="20"/>
-        </w:rPr>
-        <w:t xml:space="preserve">8.  </w:t>
-      </w:r>
-      <w:r>
-        <w:rPr>
-          <w:rFonts w:ascii="Calibri" w:hAnsi="Calibri"/>
-          <w:b w:val="0"/>
-          <w:i w:val="0"/>
-          <w:sz w:val="20"/>
-        </w:rPr>
-        <w:t>Gotowe! Możesz zamknąć instalator.</w:t>
+        <w:t>Gotowe! Mozesz zamknac instalator.</w:t>
       </w:r>
     </w:p>
     <w:p>
@@ -1028,6 +1446,224 @@
           <w:sz w:val="18"/>
         </w:rPr>
         <w:t xml:space="preserve">  Strona nodejs.org — kliknij zielony przycisk LTS (ten po lewej).</w:t>
+      </w:r>
+    </w:p>
+    <w:p>
+      <w:pPr>
+        <w:spacing w:before="80" w:after="40"/>
+        <w:ind w:left="850"/>
+        <w:pBdr>
+          <w:left w:val="single" w:sz="8" w:space="6" w:color="0078D4"/>
+        </w:pBdr>
+      </w:pPr>
+      <w:r>
+        <w:rPr>
+          <w:rFonts w:ascii="Calibri" w:hAnsi="Calibri"/>
+          <w:b/>
+          <w:i w:val="0"/>
+          <w:sz w:val="20"/>
+        </w:rPr>
+        <w:t>Na Windowsie:</w:t>
+      </w:r>
+    </w:p>
+    <w:p>
+      <w:pPr>
+        <w:spacing w:before="20" w:after="40"/>
+        <w:ind w:left="1247" w:hanging="227"/>
+      </w:pPr>
+      <w:r>
+        <w:rPr>
+          <w:rFonts w:ascii="Calibri" w:hAnsi="Calibri"/>
+          <w:b/>
+          <w:i w:val="0"/>
+          <w:color w:val="0054A6"/>
+          <w:sz w:val="20"/>
+        </w:rPr>
+        <w:t xml:space="preserve">1.  </w:t>
+      </w:r>
+      <w:r>
+        <w:rPr>
+          <w:rFonts w:ascii="Calibri" w:hAnsi="Calibri"/>
+          <w:b w:val="0"/>
+          <w:i w:val="0"/>
+          <w:sz w:val="20"/>
+        </w:rPr>
+        <w:t>Wejdz na strone: nodejs.org</w:t>
+      </w:r>
+    </w:p>
+    <w:p>
+      <w:pPr>
+        <w:spacing w:before="20" w:after="40"/>
+        <w:ind w:left="1247" w:hanging="227"/>
+      </w:pPr>
+      <w:r>
+        <w:rPr>
+          <w:rFonts w:ascii="Calibri" w:hAnsi="Calibri"/>
+          <w:b/>
+          <w:i w:val="0"/>
+          <w:color w:val="0054A6"/>
+          <w:sz w:val="20"/>
+        </w:rPr>
+        <w:t xml:space="preserve">2.  </w:t>
+      </w:r>
+      <w:r>
+        <w:rPr>
+          <w:rFonts w:ascii="Calibri" w:hAnsi="Calibri"/>
+          <w:b w:val="0"/>
+          <w:i w:val="0"/>
+          <w:sz w:val="20"/>
+        </w:rPr>
+        <w:t>Kliknij zielony przycisk "Download Node.js (LTS)" — ten z napisem "Recommended for most users". NIE klikaj "Current".</w:t>
+      </w:r>
+    </w:p>
+    <w:p>
+      <w:pPr>
+        <w:spacing w:before="20" w:after="40"/>
+        <w:ind w:left="1247" w:hanging="227"/>
+      </w:pPr>
+      <w:r>
+        <w:rPr>
+          <w:rFonts w:ascii="Calibri" w:hAnsi="Calibri"/>
+          <w:b/>
+          <w:i w:val="0"/>
+          <w:color w:val="0054A6"/>
+          <w:sz w:val="20"/>
+        </w:rPr>
+        <w:t xml:space="preserve">3.  </w:t>
+      </w:r>
+      <w:r>
+        <w:rPr>
+          <w:rFonts w:ascii="Calibri" w:hAnsi="Calibri"/>
+          <w:b w:val="0"/>
+          <w:i w:val="0"/>
+          <w:sz w:val="20"/>
+        </w:rPr>
+        <w:t>Plik .msi pobierze sie — poczekaj az skonczy.</w:t>
+      </w:r>
+    </w:p>
+    <w:p>
+      <w:pPr>
+        <w:spacing w:before="20" w:after="40"/>
+        <w:ind w:left="1247" w:hanging="227"/>
+      </w:pPr>
+      <w:r>
+        <w:rPr>
+          <w:rFonts w:ascii="Calibri" w:hAnsi="Calibri"/>
+          <w:b/>
+          <w:i w:val="0"/>
+          <w:color w:val="0054A6"/>
+          <w:sz w:val="20"/>
+        </w:rPr>
+        <w:t xml:space="preserve">4.  </w:t>
+      </w:r>
+      <w:r>
+        <w:rPr>
+          <w:rFonts w:ascii="Calibri" w:hAnsi="Calibri"/>
+          <w:b w:val="0"/>
+          <w:i w:val="0"/>
+          <w:sz w:val="20"/>
+        </w:rPr>
+        <w:t>Otworz pobrany plik (kliknij dwukrotnie).</w:t>
+      </w:r>
+    </w:p>
+    <w:p>
+      <w:pPr>
+        <w:spacing w:before="20" w:after="40"/>
+        <w:ind w:left="1247" w:hanging="227"/>
+      </w:pPr>
+      <w:r>
+        <w:rPr>
+          <w:rFonts w:ascii="Calibri" w:hAnsi="Calibri"/>
+          <w:b/>
+          <w:i w:val="0"/>
+          <w:color w:val="0054A6"/>
+          <w:sz w:val="20"/>
+        </w:rPr>
+        <w:t xml:space="preserve">5.  </w:t>
+      </w:r>
+      <w:r>
+        <w:rPr>
+          <w:rFonts w:ascii="Calibri" w:hAnsi="Calibri"/>
+          <w:b w:val="0"/>
+          <w:i w:val="0"/>
+          <w:sz w:val="20"/>
+        </w:rPr>
+        <w:t>Jesli Windows zapyta "Czy chcesz zezwolic..." — kliknij Tak.</w:t>
+      </w:r>
+    </w:p>
+    <w:p>
+      <w:pPr>
+        <w:spacing w:before="20" w:after="40"/>
+        <w:ind w:left="1247" w:hanging="227"/>
+      </w:pPr>
+      <w:r>
+        <w:rPr>
+          <w:rFonts w:ascii="Calibri" w:hAnsi="Calibri"/>
+          <w:b/>
+          <w:i w:val="0"/>
+          <w:color w:val="0054A6"/>
+          <w:sz w:val="20"/>
+        </w:rPr>
+        <w:t xml:space="preserve">6.  </w:t>
+      </w:r>
+      <w:r>
+        <w:rPr>
+          <w:rFonts w:ascii="Calibri" w:hAnsi="Calibri"/>
+          <w:b w:val="0"/>
+          <w:i w:val="0"/>
+          <w:sz w:val="20"/>
+        </w:rPr>
+        <w:t>Klikaj Next przez kolejne ekrany instalatora — nic nie zmieniaj.</w:t>
+      </w:r>
+    </w:p>
+    <w:p>
+      <w:pPr>
+        <w:spacing w:before="20" w:after="40"/>
+        <w:ind w:left="1247" w:hanging="227"/>
+      </w:pPr>
+      <w:r>
+        <w:rPr>
+          <w:rFonts w:ascii="Calibri" w:hAnsi="Calibri"/>
+          <w:b/>
+          <w:i w:val="0"/>
+          <w:color w:val="0054A6"/>
+          <w:sz w:val="20"/>
+        </w:rPr>
+        <w:t xml:space="preserve">7.  </w:t>
+      </w:r>
+      <w:r>
+        <w:rPr>
+          <w:rFonts w:ascii="Calibri" w:hAnsi="Calibri"/>
+          <w:b w:val="0"/>
+          <w:i w:val="0"/>
+          <w:sz w:val="20"/>
+        </w:rPr>
+        <w:t>Na koncu kliknij Install. Moze zapytac o haslo/zgode administratora.</w:t>
+      </w:r>
+    </w:p>
+    <w:p>
+      <w:pPr>
+        <w:spacing w:before="20" w:after="40"/>
+        <w:ind w:left="1247" w:hanging="227"/>
+      </w:pPr>
+      <w:r>
+        <w:rPr>
+          <w:rFonts w:ascii="Calibri" w:hAnsi="Calibri"/>
+          <w:b/>
+          <w:i w:val="0"/>
+          <w:color w:val="0054A6"/>
+          <w:sz w:val="20"/>
+        </w:rPr>
+        <w:t xml:space="preserve">8.  </w:t>
+      </w:r>
+      <w:r>
+        <w:rPr>
+          <w:rFonts w:ascii="Calibri" w:hAnsi="Calibri"/>
+          <w:b w:val="0"/>
+          <w:i w:val="0"/>
+          <w:sz w:val="20"/>
+        </w:rPr>
+        <w:t>Gotowe! Mozesz zamknac instalator.</w:t>
       </w:r>
     </w:p>
     <w:p>
@@ -1067,7 +1703,7 @@
           <w:i w:val="0"/>
           <w:sz w:val="24"/>
         </w:rPr>
-        <w:t>Krok 3 — Otwórz terminal w Windsurf i wpisz jedną komendę</w:t>
+        <w:t>Krok 3 — Otworz terminal w Windsurf i wpisz jedna komende</w:t>
       </w:r>
     </w:p>
     <w:p>
@@ -1083,7 +1719,7 @@
           <w:color w:val="464646"/>
           <w:sz w:val="20"/>
         </w:rPr>
-        <w:t>Terminal to czarne okienko, w którym wpisujesz polecenia. W Windsurf jest ukryte na dole ekranu — pokażemy Ci jak je otworzyć.</w:t>
+        <w:t>Terminal to okienko, w ktorym wpisujesz polecenia. W Windsurf jest ukryte na dole ekranu — pokarzemy Ci jak je otworzyc.</w:t>
       </w:r>
     </w:p>
     <w:p>
@@ -1108,7 +1744,7 @@
           <w:i w:val="0"/>
           <w:sz w:val="20"/>
         </w:rPr>
-        <w:t>Uruchom Windsurf (jeśli jeszcze nie jest otwarty).</w:t>
+        <w:t>Uruchom Windsurf (jesli jeszcze nie jest otwarty).</w:t>
       </w:r>
     </w:p>
     <w:p>
@@ -1133,7 +1769,7 @@
           <w:i w:val="0"/>
           <w:sz w:val="20"/>
         </w:rPr>
-        <w:t>W górnym menu kliknij "Terminal" a potem "New Terminal". Ewentualnie naciśnij klawisze Ctrl + ` (tylni apostrof — klawisz obok cyfry 1 na klawiaturze).</w:t>
+        <w:t>W gornym menu kliknij "Terminal" a potem "New Terminal". Ewentualnie nacisnij klawisze Ctrl + ` (tylni apostrof — klawisz obok cyfry 1 na klawiaturze).</w:t>
       </w:r>
     </w:p>
     <w:p>
@@ -1158,7 +1794,7 @@
           <w:i w:val="0"/>
           <w:sz w:val="20"/>
         </w:rPr>
-        <w:t>Na dole ekranu pojawi się ciemne okienko z kursorem — to terminal.</w:t>
+        <w:t>Na dole ekranu pojawi sie ciemne okienko z kursorem — to terminal.</w:t>
       </w:r>
     </w:p>
     <w:p>
@@ -1183,7 +1819,7 @@
           <w:i w:val="0"/>
           <w:sz w:val="20"/>
         </w:rPr>
-        <w:t>Kliknij w to ciemne okienko żeby je zaznaczyć.</w:t>
+        <w:t>Kliknij w to okienko zeby je zaznaczyc.</w:t>
       </w:r>
     </w:p>
     <w:p>
@@ -1208,7 +1844,7 @@
           <w:i w:val="0"/>
           <w:sz w:val="20"/>
         </w:rPr>
-        <w:t>Wpisz dokładnie tę komendę i naciśnij Enter: npm install -g @anthropic-ai/claude-code</w:t>
+        <w:t>Wpisz dokladnie te komende i nacisnij Enter: npm install -g @anthropic-ai/claude-code</w:t>
       </w:r>
     </w:p>
     <w:p>
@@ -1233,7 +1869,7 @@
           <w:i w:val="0"/>
           <w:sz w:val="20"/>
         </w:rPr>
-        <w:t>Poczekaj — może trwać 1-3 minuty. Zobaczysz dużo tekstu — to normalne.</w:t>
+        <w:t>Poczekaj — moze trwac 1-3 minuty. Zobaczysz duzo tekstu — to normalne.</w:t>
       </w:r>
     </w:p>
     <w:p>
@@ -1258,64 +1894,32 @@
           <w:i w:val="0"/>
           <w:sz w:val="20"/>
         </w:rPr>
-        <w:t>Gdy skończy, pojawi się nowa linia z kursorem — to znak że gotowe.</w:t>
+        <w:t>Gdy skonczy, pojawi sie nowa linia z kursorem — to znak ze gotowe.</w:t>
       </w:r>
     </w:p>
     <w:p>
       <w:pPr>
-        <w:spacing w:before="120" w:after="40"/>
-        <w:ind w:left="680"/>
-        <w:jc w:val="center"/>
-      </w:pPr>
-      <w:r>
-        <w:drawing>
-          <wp:inline xmlns:a="http://schemas.openxmlformats.org/drawingml/2006/main" xmlns:pic="http://schemas.openxmlformats.org/drawingml/2006/picture">
-            <wp:extent cx="4572000" cy="2637692"/>
-            <wp:docPr id="1" name="Picture 1"/>
-            <wp:cNvGraphicFramePr>
-              <a:graphicFrameLocks noChangeAspect="1"/>
-            </wp:cNvGraphicFramePr>
-            <a:graphic>
-              <a:graphicData uri="http://schemas.openxmlformats.org/drawingml/2006/picture">
-                <pic:pic>
-                  <pic:nvPicPr>
-                    <pic:cNvPr id="0" name="tmpyojd08ul.png"/>
-                    <pic:cNvPicPr/>
-                  </pic:nvPicPr>
-                  <pic:blipFill>
-                    <a:blip r:embed="rId9"/>
-                    <a:stretch>
-                      <a:fillRect/>
-                    </a:stretch>
-                  </pic:blipFill>
-                  <pic:spPr>
-                    <a:xfrm>
-                      <a:off x="0" y="0"/>
-                      <a:ext cx="4572000" cy="2637692"/>
-                    </a:xfrm>
-                    <a:prstGeom prst="rect"/>
-                  </pic:spPr>
-                </pic:pic>
-              </a:graphicData>
-            </a:graphic>
-          </wp:inline>
-        </w:drawing>
-      </w:r>
-    </w:p>
-    <w:p>
-      <w:pPr>
-        <w:spacing w:before="40" w:after="120"/>
-        <w:ind w:left="680"/>
+        <w:spacing w:before="20" w:after="40"/>
+        <w:ind w:left="850" w:hanging="227"/>
       </w:pPr>
       <w:r>
         <w:rPr>
           <w:rFonts w:ascii="Calibri" w:hAnsi="Calibri"/>
+          <w:b/>
+          <w:i w:val="0"/>
+          <w:color w:val="1F497D"/>
+          <w:sz w:val="20"/>
+        </w:rPr>
+        <w:t xml:space="preserve">8.  </w:t>
+      </w:r>
+      <w:r>
+        <w:rPr>
+          <w:rFonts w:ascii="Calibri" w:hAnsi="Calibri"/>
           <w:b w:val="0"/>
-          <w:i/>
-          <w:color w:val="646464"/>
-          <w:sz w:val="18"/>
+          <w:i w:val="0"/>
+          <w:sz w:val="20"/>
         </w:rPr>
-        <w:t xml:space="preserve">  Windsurf — Terminal otworzysz przez menu Terminal → New Terminal.</w:t>
+        <w:t>UWAGA dla Windows: zamiast zsh zobaczysz PowerShell (niebieski tekst) — to normalne, komenda dziala tak samo.</w:t>
       </w:r>
     </w:p>
     <w:p>
@@ -1355,7 +1959,7 @@
           <w:i w:val="0"/>
           <w:sz w:val="24"/>
         </w:rPr>
-        <w:t>Krok 4 — Otwórz folder Onboarding w Windsurf</w:t>
+        <w:t>Krok 4 — Otworz folder Onboarding w Windsurf</w:t>
       </w:r>
     </w:p>
     <w:p>
@@ -1371,7 +1975,7 @@
           <w:color w:val="464646"/>
           <w:sz w:val="20"/>
         </w:rPr>
-        <w:t>Musisz wskazać Windsurfowi folder z plikami onboardingowymi — ten sam folder, z którego czytasz ten dokument.</w:t>
+        <w:t>Musisz wskazac Windsurfowi folder z plikami onboardingowymi — ten sam folder, z ktorego czytasz ten dokument.</w:t>
       </w:r>
     </w:p>
     <w:p>
@@ -1396,7 +2000,7 @@
           <w:i w:val="0"/>
           <w:sz w:val="20"/>
         </w:rPr>
-        <w:t>W Windsurf kliknij "File" w górnym menu.</w:t>
+        <w:t>W Windsurf kliknij "File" w gornym menu.</w:t>
       </w:r>
     </w:p>
     <w:p>
@@ -1421,7 +2025,7 @@
           <w:i w:val="0"/>
           <w:sz w:val="20"/>
         </w:rPr>
-        <w:t>Kliknij "Open Folder..." (Otwórz folder).</w:t>
+        <w:t>Kliknij "Open Folder..." (Otworz folder).</w:t>
       </w:r>
     </w:p>
     <w:p>
@@ -1446,7 +2050,7 @@
           <w:i w:val="0"/>
           <w:sz w:val="20"/>
         </w:rPr>
-        <w:t>Pojawi się okienko do wyboru folderu — znajdź i zaznacz folder "Onboarding".</w:t>
+        <w:t>Pojawi sie okienko do wyboru folderu — znajdz i zaznacz folder "Onboarding".</w:t>
       </w:r>
     </w:p>
     <w:p>
@@ -1471,7 +2075,7 @@
           <w:i w:val="0"/>
           <w:sz w:val="20"/>
         </w:rPr>
-        <w:t>Kliknij przycisk "Open" (lub "Otwórz") na dole okienka.</w:t>
+        <w:t>Kliknij przycisk "Open" (lub "Otworz") na dole okienka.</w:t>
       </w:r>
     </w:p>
     <w:p>
@@ -1496,7 +2100,7 @@
           <w:i w:val="0"/>
           <w:sz w:val="20"/>
         </w:rPr>
-        <w:t>Po lewej stronie Windsurf pojawi się lista plików z folderu Onboarding — to znak że zadziałało.</w:t>
+        <w:t>Po lewej stronie Windsurf pojawi sie lista plikow z folderu Onboarding — to znak ze zadzialalo.</w:t>
       </w:r>
     </w:p>
     <w:p>
@@ -1536,7 +2140,7 @@
           <w:i w:val="0"/>
           <w:sz w:val="24"/>
         </w:rPr>
-        <w:t>Krok 5 — Uruchom Claude i zaloguj się</w:t>
+        <w:t>Krok 5 — Uruchom Claude i zaloguj sie</w:t>
       </w:r>
     </w:p>
     <w:p>
@@ -1552,7 +2156,7 @@
           <w:color w:val="464646"/>
           <w:sz w:val="20"/>
         </w:rPr>
-        <w:t>Teraz uruchamiamy samego Claude — asystenta AI. Przy pierwszym uruchomieniu otworzy się przeglądarka żebyś się zalogował.</w:t>
+        <w:t>Teraz uruchamiamy samego Claude — asystenta AI. Przy pierwszym uruchomieniu otworzy sie przegladarka zebys sie zalogowal.</w:t>
       </w:r>
     </w:p>
     <w:p>
@@ -1577,7 +2181,7 @@
           <w:i w:val="0"/>
           <w:sz w:val="20"/>
         </w:rPr>
-        <w:t>W ciemnym okienku (terminal) na dole Windsurf kliknij żeby je zaznaczyć.</w:t>
+        <w:t>W ciemnym okienku (terminal) na dole Windsurf kliknij zeby je zaznaczyc.</w:t>
       </w:r>
     </w:p>
     <w:p>
@@ -1602,7 +2206,7 @@
           <w:i w:val="0"/>
           <w:sz w:val="20"/>
         </w:rPr>
-        <w:t>Wpisz: claude  i naciśnij Enter.</w:t>
+        <w:t>Wpisz: claude  i nacisnij Enter.</w:t>
       </w:r>
     </w:p>
     <w:p>
@@ -1627,7 +2231,7 @@
           <w:i w:val="0"/>
           <w:sz w:val="20"/>
         </w:rPr>
-        <w:t>Claude może zapytać o zgodę na uruchomienie — jeśli zobaczysz pytanie, wpisz Y i Enter.</w:t>
+        <w:t>Claude moze zapytac o zgode na uruchomienie — jesli zobaczysz pytanie, wpisz Y i Enter.</w:t>
       </w:r>
     </w:p>
     <w:p>
@@ -1652,7 +2256,7 @@
           <w:i w:val="0"/>
           <w:sz w:val="20"/>
         </w:rPr>
-        <w:t>Automatycznie otworzy się przeglądarka z prośbą o zalogowanie. Jeśli nie masz konta Anthropic — kliknij "Sign up" i utwórz je teraz (to bezpłatne). Jeśli masz — zaloguj się normalnie.</w:t>
+        <w:t>Automatycznie otworzy sie przegladarka z prosba o zalogowanie. Jesli nie masz konta Anthropic — kliknij "Sign up" i utworz je teraz (bezplatne). Jesli masz — zaloguj sie normalnie.</w:t>
       </w:r>
     </w:p>
     <w:p>
@@ -1677,7 +2281,7 @@
           <w:i w:val="0"/>
           <w:sz w:val="20"/>
         </w:rPr>
-        <w:t>Po zalogowaniu wróć do Windsurf — zostaw przeglądarkę otwartą, po prostu wróć do okna Windsurf.</w:t>
+        <w:t>Po zalogowaniu wron do Windsurf — zostaw przegladarke otwarta.</w:t>
       </w:r>
     </w:p>
     <w:p>
@@ -1702,7 +2306,7 @@
           <w:i w:val="0"/>
           <w:sz w:val="20"/>
         </w:rPr>
-        <w:t>W terminalu zobaczysz że Claude czeka — pojawi się coś w stylu: "Claude Code &gt;"</w:t>
+        <w:t>W terminalu zobaczysz ze Claude czeka — pojawi sie cos w stylu: "Claude Code &gt;"</w:t>
       </w:r>
     </w:p>
     <w:p>
@@ -1715,7 +2319,7 @@
         <w:drawing>
           <wp:inline xmlns:a="http://schemas.openxmlformats.org/drawingml/2006/main" xmlns:pic="http://schemas.openxmlformats.org/drawingml/2006/picture">
             <wp:extent cx="4572000" cy="1178169"/>
-            <wp:docPr id="2" name="Picture 2"/>
+            <wp:docPr id="3" name="Picture 3"/>
             <wp:cNvGraphicFramePr>
               <a:graphicFrameLocks noChangeAspect="1"/>
             </wp:cNvGraphicFramePr>
@@ -1723,11 +2327,11 @@
               <a:graphicData uri="http://schemas.openxmlformats.org/drawingml/2006/picture">
                 <pic:pic>
                   <pic:nvPicPr>
-                    <pic:cNvPr id="0" name="tmpts61tv6i.png"/>
+                    <pic:cNvPr id="0" name="tmpg6ewzmlo.png"/>
                     <pic:cNvPicPr/>
                   </pic:nvPicPr>
                   <pic:blipFill>
-                    <a:blip r:embed="rId10"/>
+                    <a:blip r:embed="rId11"/>
                     <a:stretch>
                       <a:fillRect/>
                     </a:stretch>
@@ -1759,7 +2363,7 @@
           <w:color w:val="646464"/>
           <w:sz w:val="18"/>
         </w:rPr>
-        <w:t xml:space="preserve">  Tak wygląda uruchomiony Claude w terminalu Windsurf.</w:t>
+        <w:t xml:space="preserve">  Tak wyglada uruchomiony Claude w terminalu Windsurf.</w:t>
       </w:r>
     </w:p>
     <w:p>
@@ -1799,7 +2403,7 @@
           <w:i w:val="0"/>
           <w:sz w:val="24"/>
         </w:rPr>
-        <w:t>Krok 6 — Wklej prompt z Części 2 — Claude zajmie się resztą!</w:t>
+        <w:t>Krok 6 — Wklej prompt z Czesci 2 — Claude zajmie sie reszta!</w:t>
       </w:r>
     </w:p>
     <w:p>
@@ -1815,7 +2419,7 @@
           <w:color w:val="464646"/>
           <w:sz w:val="20"/>
         </w:rPr>
-        <w:t>To ostatni krok który robisz sam. Dajesz Claude instrukcje i od tej chwili on prowadzi Cię przez całą konfigurację — po polsku, krok po kroku, czekając aż każdy krok zrobisz.</w:t>
+        <w:t>To ostatni krok ktory robisz sam. Dajesz Claude instrukcje i od tej chwili on prowadzi Cie przez cala konfiguracje — po polsku, krok po kroku, czekajac az kazdy krok zrobisz.</w:t>
       </w:r>
     </w:p>
     <w:p>
@@ -1840,7 +2444,7 @@
           <w:i w:val="0"/>
           <w:sz w:val="20"/>
         </w:rPr>
-        <w:t>Przejdź na następną stronę tego dokumentu.</w:t>
+        <w:t>Przejdz na nastepna strone tego dokumentu.</w:t>
       </w:r>
     </w:p>
     <w:p>
@@ -1865,7 +2469,7 @@
           <w:i w:val="0"/>
           <w:sz w:val="20"/>
         </w:rPr>
-        <w:t>Zaznacz CAŁY tekst z niebieskiej ramki (kliknij na początku, potem Shift+kliknij na końcu ramki).</w:t>
+        <w:t>Znajdz swoj system — "Jesli masz Maca" lub "Jesli masz Windowsa" — i zaznacz CALY tekst w niebieskiej ramce dla swojego systemu.</w:t>
       </w:r>
     </w:p>
     <w:p>
@@ -1890,7 +2494,7 @@
           <w:i w:val="0"/>
           <w:sz w:val="20"/>
         </w:rPr>
-        <w:t>Skopiuj: Cmd+C (lub kliknij prawym przyciskiem → Kopiuj).</w:t>
+        <w:t>(Mac) Skopiuj: Cmd+C  |  (Windows) Skopiuj: Ctrl+C</w:t>
       </w:r>
     </w:p>
     <w:p>
@@ -1915,7 +2519,7 @@
           <w:i w:val="0"/>
           <w:sz w:val="20"/>
         </w:rPr>
-        <w:t>Wróć do Windsurf i kliknij w ciemne okienko terminala.</w:t>
+        <w:t>Wron do Windsurf i kliknij w ciemne okienko terminala.</w:t>
       </w:r>
     </w:p>
     <w:p>
@@ -1940,7 +2544,7 @@
           <w:i w:val="0"/>
           <w:sz w:val="20"/>
         </w:rPr>
-        <w:t>Wklej: Cmd+V (lub kliknij prawym → Wklej).</w:t>
+        <w:t>(Mac) Wklej: Cmd+V  |  (Windows) Wklej: Ctrl+V</w:t>
       </w:r>
     </w:p>
     <w:p>
@@ -1965,7 +2569,7 @@
           <w:i w:val="0"/>
           <w:sz w:val="20"/>
         </w:rPr>
-        <w:t>Naciśnij Enter.</w:t>
+        <w:t>Nacisnij Enter.</w:t>
       </w:r>
     </w:p>
     <w:p>
@@ -1990,7 +2594,7 @@
           <w:i w:val="0"/>
           <w:sz w:val="20"/>
         </w:rPr>
-        <w:t>Claude zacznie pisać do Ciebie i przeprowadzi Cię przez każdy następny krok. Wystarczy że będziesz odpowiadać "gotowe" gdy skończysz każdy krok.</w:t>
+        <w:t>Claude zacznie pisac do Ciebie i przeprowadzi Cie przez kazdy nastepny krok. Wystarczy ze bedziesz odpowiadac "gotowe" gdy skonczysz kazdy krok.</w:t>
       </w:r>
     </w:p>
     <w:p>
@@ -2014,7 +2618,7 @@
           <w:color w:val="1F497D"/>
           <w:sz w:val="28"/>
         </w:rPr>
-        <w:t>Część 2 — Tekst do wklejenia do Claude</w:t>
+        <w:t>Czesc 2 — Tekst do wklejenia do Claude</w:t>
       </w:r>
     </w:p>
     <w:p>
@@ -2025,10 +2629,151 @@
           <w:i w:val="0"/>
           <w:sz w:val="20"/>
         </w:rPr>
-        <w:t>Zaznacz cały tekst w niebieskiej ramce poniżej, skopiuj (Cmd+C) i wklej do czarnego okienka w Windsurf gdzie działa Claude (Cmd+V). Naciśnij Enter. Claude zacznie rozmawiać z Tobą i przeprowadzi Cię przez całą resztę.</w:t>
+        <w:t>Znajdz swoj system ponizej. Zaznacz CALY tekst w niebieskiej ramce, skopiuj (Cmd+C na Macu / Ctrl+C na Windowsie) i wklej do czarnego okienka w Windsurf gdzie dziala Claude (Cmd+V na Macu / Ctrl+V na Windowsie). Nacisnij Enter. Claude zacznie rozmawiac z Toba i przeprowadzi Cie przez cala reszte.</w:t>
       </w:r>
     </w:p>
-    <w:p/>
+    <w:p>
+      <w:pPr>
+        <w:spacing w:before="200" w:after="80"/>
+      </w:pPr>
+      <w:r>
+        <w:rPr>
+          <w:rFonts w:ascii="Calibri" w:hAnsi="Calibri"/>
+          <w:b/>
+          <w:i w:val="0"/>
+          <w:color w:val="3C3C3C"/>
+          <w:sz w:val="22"/>
+        </w:rPr>
+        <w:t>Jesli masz Maca — skopiuj to:</w:t>
+      </w:r>
+    </w:p>
+    <w:p>
+      <w:pPr>
+        <w:spacing w:before="160" w:after="160"/>
+        <w:ind w:left="283" w:right="283"/>
+        <w:shd w:val="clear" w:color="auto" w:fill="EFF3FB"/>
+        <w:pBdr>
+          <w:top w:val="single" w:sz="4" w:space="4" w:color="4472C4"/>
+          <w:bottom w:val="single" w:sz="4" w:space="4" w:color="4472C4"/>
+          <w:left w:val="single" w:sz="4" w:space="4" w:color="4472C4"/>
+          <w:right w:val="single" w:sz="4" w:space="4" w:color="4472C4"/>
+        </w:pBdr>
+      </w:pPr>
+      <w:r>
+        <w:rPr>
+          <w:rFonts w:ascii="Courier New" w:hAnsi="Courier New"/>
+          <w:b w:val="0"/>
+          <w:i w:val="0"/>
+          <w:sz w:val="16"/>
+        </w:rPr>
+        <w:t>Przeprowadz mnie przez konfiguracje srodowiska Claude Code.</w:t>
+        <w:br/>
+        <w:br/>
+        <w:t>Jestem nowym uzytkownikiem. Wlasnie zainstalowalem Windsurf i Claude Code CLI,</w:t>
+        <w:br/>
+        <w:t>jestem zalogowany. Pracuje w folderze Onboarding — zawiera podfolder setup/</w:t>
+        <w:br/>
+        <w:t>z gotowymi plikami do skopiowania.</w:t>
+        <w:br/>
+        <w:br/>
+        <w:t>Zasady dla kazdego kroku:</w:t>
+        <w:br/>
+        <w:t>- Tlumacz prosto, bez zargonu technicznego — jakbys mowil do osoby ktora</w:t>
+        <w:br/>
+        <w:t xml:space="preserve">  nigdy nie programowala</w:t>
+        <w:br/>
+        <w:t>- Podawaj JEDNA komende lub akcje na raz</w:t>
+        <w:br/>
+        <w:t>- Czekaj az powiem "gotowe" zanim przejdziesz do nastepnego kroku</w:t>
+        <w:br/>
+        <w:t>- Po kazdym kroku sprawdz czy zadzialalo</w:t>
+        <w:br/>
+        <w:t>- Jesli cos sie nie uda — pomoz mi to naprawic zanim pojdziemy dalej</w:t>
+        <w:br/>
+        <w:br/>
+        <w:t>CZESC A — Instalacja brakujacych narzedzi</w:t>
+        <w:br/>
+        <w:br/>
+        <w:t>1. Sprawdz czy mam Homebrew: brew --version</w:t>
+        <w:br/>
+        <w:t xml:space="preserve">   Jesli nie ma — zainstaluj. (Homebrew to sklep z narzediami dla Maca)</w:t>
+        <w:br/>
+        <w:t>2. Zainstaluj gh i jq: brew install gh jq</w:t>
+        <w:br/>
+        <w:t xml:space="preserve">   (gh = do laczenia z GitHub, jq = pomocnik konfiguracyjny)</w:t>
+        <w:br/>
+        <w:t>3. Zaloguj mnie do GitHub: gh auth login</w:t>
+        <w:br/>
+        <w:t xml:space="preserve">   Wybierz: GitHub.com -&gt; HTTPS -&gt; zaloguj przez przegladarke</w:t>
+        <w:br/>
+        <w:br/>
+        <w:t>CZESC B — Konfiguracja Claude</w:t>
+        <w:br/>
+        <w:br/>
+        <w:t>4. Utworz foldery: ~/.claude/skills/  ~/.claude/hooks/  ~/.claude/memory/</w:t>
+        <w:br/>
+        <w:t>5. Skopiuj skille z setup/skills/ do ~/.claude/skills/</w:t>
+        <w:br/>
+        <w:t xml:space="preserve">   (state-start, catchup, setup-new-project)</w:t>
+        <w:br/>
+        <w:t>6. Skopiuj hook bezpieczenstwa: setup/hooks/security-scan.py -&gt; ~/.claude/hooks/</w:t>
+        <w:br/>
+        <w:t xml:space="preserve">   Nadaj uprawnienia: chmod +x</w:t>
+        <w:br/>
+        <w:t>7. Skopiuj status bar: setup/statusline-command.sh -&gt; ~/.claude/</w:t>
+        <w:br/>
+        <w:t xml:space="preserve">   Nadaj uprawnienia: chmod +x</w:t>
+        <w:br/>
+        <w:t>8. Wygeneruj plik konfiguracyjny ~/.claude/settings.json</w:t>
+        <w:br/>
+        <w:t xml:space="preserve">   z ustawieniami hooka i status baru (uzyj $HOME zamiast ~ przy sciezkach)</w:t>
+        <w:br/>
+        <w:t>9. Zapytaj mnie o:</w:t>
+        <w:br/>
+        <w:t xml:space="preserve">   - w jakim jezyku chce rozmawiac z AI (np. polski)</w:t>
+        <w:br/>
+        <w:t xml:space="preserve">   - moj GitHub username</w:t>
+        <w:br/>
+        <w:t xml:space="preserve">   - gdzie trzymam foldery projektow (np. ~/Projects/)</w:t>
+        <w:br/>
+        <w:t xml:space="preserve">   Potem skopiuj setup/global-claude-template.md -&gt; ~/.claude/CLAUDE.md</w:t>
+        <w:br/>
+        <w:t xml:space="preserve">   i uzupelnij moje dane w miejscach oznaczonych [[...]]</w:t>
+        <w:br/>
+        <w:t>10. W pliku ~/.claude/skills/setup-new-project/SKILL.md</w:t>
+        <w:br/>
+        <w:t xml:space="preserve">    zamien GITHUB_USERNAME na moj GitHub username</w:t>
+        <w:br/>
+        <w:t>11. Weryfikacja koncowa: sprawdz ze wszystkie pliki istnieja,</w:t>
+        <w:br/>
+        <w:t xml:space="preserve">    pokaz zawartosc settings.json, przetestuj komende /state-start</w:t>
+        <w:br/>
+        <w:br/>
+        <w:t>Na koncu wytlumacz mi jak stworzyc swoj pierwszy projekt:</w:t>
+        <w:br/>
+        <w:t>- jak skopiowac folder Onboarding jako szablon</w:t>
+        <w:br/>
+        <w:t>- jak uruchomic /setup-new-project zeby stworzyc repo na GitHub</w:t>
+        <w:br/>
+        <w:br/>
+        <w:t>Pelny opis kazdego kroku: setup/onboarding-prompt.md</w:t>
+      </w:r>
+    </w:p>
+    <w:p>
+      <w:pPr>
+        <w:spacing w:before="240" w:after="80"/>
+      </w:pPr>
+      <w:r>
+        <w:rPr>
+          <w:rFonts w:ascii="Calibri" w:hAnsi="Calibri"/>
+          <w:b/>
+          <w:i w:val="0"/>
+          <w:color w:val="0054A6"/>
+          <w:sz w:val="22"/>
+        </w:rPr>
+        <w:t>Jesli masz Windowsa — skopiuj to:</w:t>
+      </w:r>
+    </w:p>
     <w:p>
       <w:pPr>
         <w:spacing w:before="160" w:after="160"/>
@@ -2051,94 +2796,133 @@
         <w:t>Przeprowadź mnie przez konfigurację środowiska Claude Code.</w:t>
         <w:br/>
         <w:br/>
-        <w:t>Jestem nowym użytkownikiem. Właśnie zainstalowałem Windsurf i Claude Code CLI,</w:t>
+        <w:t>Jestem nowym użytkownikiem na WINDOWS 10/11. Właśnie zainstalowałem Windsurf</w:t>
         <w:br/>
-        <w:t>jestem zalogowany. Pracuję w folderze Onboarding — zawiera podfolder setup/</w:t>
+        <w:t>i Claude Code CLI, jestem zalogowany. Pracuję w folderze Onboarding — zawiera</w:t>
         <w:br/>
-        <w:t>z gotowymi plikami do skopiowania.</w:t>
+        <w:t>podfolder setup/ z gotowymi plikami do skopiowania.</w:t>
         <w:br/>
         <w:br/>
         <w:t>Zasady dla każdego kroku:</w:t>
         <w:br/>
-        <w:t>- Tłumacz prosto, bez żargonu technicznego — jakbyś mówił do osoby która</w:t>
+        <w:t>- Tłumacz prosto, bez żargonu — jakbyś mówił do osoby która nigdy nie programowała</w:t>
         <w:br/>
-        <w:t xml:space="preserve">  nigdy nie programowała</w:t>
+        <w:t>- Używaj komend dla Windows (PowerShell), NIE dla macOS</w:t>
         <w:br/>
-        <w:t>- Podawaj JEDNĄ komendę lub akcję na raz</w:t>
-        <w:br/>
-        <w:t>- Czekaj aż powiem "gotowe" zanim przejdziesz do następnego kroku</w:t>
-        <w:br/>
-        <w:t>- Po każdym kroku sprawdź czy zadziałało</w:t>
-        <w:br/>
-        <w:t>- Jeśli coś się nie uda — pomóż mi to naprawić zanim pójdziemy dalej</w:t>
+        <w:t>- Jedna komenda na raz, czekaj na 'gotowe', sprawdzaj po każdym kroku</w:t>
         <w:br/>
         <w:br/>
-        <w:t>CZĘŚĆ A — Instalacja brakujących narzędzi</w:t>
+        <w:t>CZĘŚĆ A — Instalacja narzędzi (jeśli brakuje):</w:t>
         <w:br/>
         <w:br/>
-        <w:t>1. Sprawdź czy mam Homebrew: brew --version</w:t>
+        <w:t>1. Sprawdź: winget --version</w:t>
         <w:br/>
-        <w:t xml:space="preserve">   Jeśli nie ma — zainstaluj. (Homebrew to sklep z narzędziami dla Maca)</w:t>
+        <w:t xml:space="preserve">   Jeśli brak — powiedz żeby zainstalować 'App Installer' z Microsoft Store.</w:t>
         <w:br/>
-        <w:t>2. Zainstaluj gh i jq: brew install gh jq</w:t>
+        <w:t>2. Zainstaluj narzędzia:</w:t>
         <w:br/>
-        <w:t xml:space="preserve">   (gh = do łączenia z GitHub, jq = pomocnik konfiguracyjny)</w:t>
+        <w:t xml:space="preserve">   winget install GitHub.cli</w:t>
         <w:br/>
-        <w:t>3. Zaloguj mnie do GitHub: gh auth login</w:t>
+        <w:t xml:space="preserve">   winget install jqlang.jq</w:t>
         <w:br/>
-        <w:t xml:space="preserve">   Wybierz: GitHub.com → HTTPS → zaloguj przez przeglądarkę</w:t>
+        <w:t>3. Zamknij i otwórz nowy terminal w Windsurf (żeby narzędzia były widoczne).</w:t>
+        <w:br/>
+        <w:t>4. Zapytaj czy user ma konto github.com. Jeśli nie — powiedz żeby założył (bezpłatne).</w:t>
+        <w:br/>
+        <w:t xml:space="preserve">   Potem: gh auth login  (GitHub.com -&gt; HTTPS -&gt; zaloguj przez przeglądarkę)</w:t>
         <w:br/>
         <w:br/>
-        <w:t>CZĘŚĆ B — Konfiguracja Claude</w:t>
+        <w:t>CZĘŚĆ B — Konfiguracja Claude:</w:t>
         <w:br/>
         <w:br/>
-        <w:t>4. Utwórz foldery: ~/.claude/skills/  ~/.claude/hooks/  ~/.claude/memory/</w:t>
+        <w:t>5. Utwórz foldery konfiguracyjne:</w:t>
         <w:br/>
-        <w:t>5. Skopiuj skille z setup/skills/ do ~/.claude/skills/</w:t>
+        <w:t xml:space="preserve">   New-Item -ItemType Directory -Force $HOME/.claude/skills</w:t>
+        <w:br/>
+        <w:t xml:space="preserve">   New-Item -ItemType Directory -Force $HOME/.claude/hooks</w:t>
+        <w:br/>
+        <w:t xml:space="preserve">   New-Item -ItemType Directory -Force $HOME/.claude/memory</w:t>
+        <w:br/>
+        <w:t>6. Skopiuj skille z setup/skills/ do $HOME/.claude/skills/</w:t>
         <w:br/>
         <w:t xml:space="preserve">   (state-start, catchup, setup-new-project)</w:t>
         <w:br/>
-        <w:t>6. Skopiuj hook bezpieczeństwa: setup/hooks/security-scan.py → ~/.claude/hooks/</w:t>
+        <w:t>7. Skopiuj hook: setup/hooks/security-scan.py -&gt; $HOME/.claude/hooks/</w:t>
         <w:br/>
-        <w:t xml:space="preserve">   Nadaj uprawnienia: chmod +x</w:t>
+        <w:t>8. Skopiuj status bar: setup/statusline-command.sh -&gt; $HOME/.claude/</w:t>
         <w:br/>
-        <w:t>7. Skopiuj status bar: setup/statusline-command.sh → ~/.claude/</w:t>
+        <w:t>9. Wygeneruj $HOME/.claude/settings.json z DOKŁADNIE taką strukturą:</w:t>
         <w:br/>
-        <w:t xml:space="preserve">   Nadaj uprawnienia: chmod +x</w:t>
-        <w:br/>
-        <w:t>8. Wygeneruj plik konfiguracyjny ~/.claude/settings.json</w:t>
-        <w:br/>
-        <w:t xml:space="preserve">   z ustawieniami hooka i status baru (użyj $HOME zamiast ~ przy ścieżkach)</w:t>
-        <w:br/>
-        <w:t>9. Zapytaj mnie o:</w:t>
-        <w:br/>
-        <w:t xml:space="preserve">   - w jakim języku chcę rozmawiać z AI (np. polski)</w:t>
-        <w:br/>
-        <w:t xml:space="preserve">   - mój GitHub username</w:t>
-        <w:br/>
-        <w:t xml:space="preserve">   - gdzie trzymam foldery projektów (np. ~/Projects/)</w:t>
-        <w:br/>
-        <w:t xml:space="preserve">   Potem skopiuj setup/global-claude-template.md → ~/.claude/CLAUDE.md</w:t>
-        <w:br/>
-        <w:t xml:space="preserve">   i uzupełnij moje dane w miejscach oznaczonych [[...]]</w:t>
-        <w:br/>
-        <w:t>10. W pliku ~/.claude/skills/setup-new-project/SKILL.md</w:t>
-        <w:br/>
-        <w:t xml:space="preserve">    zamień GITHUB_USERNAME na mój GitHub username</w:t>
-        <w:br/>
-        <w:t>11. Weryfikacja końcowa: sprawdź że wszystkie pliki istnieją,</w:t>
-        <w:br/>
-        <w:t xml:space="preserve">    pokaż zawartość settings.json, przetestuj komendę /state-start</w:t>
+        <w:t xml:space="preserve">   (użyj $env:USERPROFILE żeby ścieżki były absolutne)</w:t>
         <w:br/>
         <w:br/>
-        <w:t>Na końcu wytłumacz mi jak stworzyć swój pierwszy projekt:</w:t>
+        <w:t xml:space="preserve">   $home = $env:USERPROFILE</w:t>
         <w:br/>
-        <w:t>- jak skopiować folder Onboarding jako szablon</w:t>
+        <w:t xml:space="preserve">   $json = @"</w:t>
         <w:br/>
-        <w:t>- jak uruchomić /setup-new-project żeby stworzyć repo na GitHub</w:t>
+        <w:t xml:space="preserve">   {</w:t>
+        <w:br/>
+        <w:t xml:space="preserve">     "model": "sonnet",</w:t>
+        <w:br/>
+        <w:t xml:space="preserve">     "statusLine": {</w:t>
+        <w:br/>
+        <w:t xml:space="preserve">       "type": "command",</w:t>
+        <w:br/>
+        <w:t xml:space="preserve">       "command": "bash $home/.claude/statusline-command.sh"</w:t>
+        <w:br/>
+        <w:t xml:space="preserve">     },</w:t>
+        <w:br/>
+        <w:t xml:space="preserve">     "hooks": {</w:t>
+        <w:br/>
+        <w:t xml:space="preserve">       "PreToolUse": [{</w:t>
+        <w:br/>
+        <w:t xml:space="preserve">         "matcher": "Write|Edit|Bash",</w:t>
+        <w:br/>
+        <w:t xml:space="preserve">         "hooks": [{ "type": "command",</w:t>
+        <w:br/>
+        <w:t xml:space="preserve">           "command": "python3 $home/.claude/hooks/security-scan.py" }]</w:t>
+        <w:br/>
+        <w:t xml:space="preserve">       }]</w:t>
+        <w:br/>
+        <w:t xml:space="preserve">     }</w:t>
+        <w:br/>
+        <w:t xml:space="preserve">   }</w:t>
+        <w:br/>
+        <w:t xml:space="preserve">   "@</w:t>
+        <w:br/>
+        <w:t xml:space="preserve">   $json | Set-Content $HOME/.claude/settings.json</w:t>
         <w:br/>
         <w:br/>
-        <w:t>Pełny opis każdego kroku: setup/onboarding-prompt.md</w:t>
+        <w:t xml:space="preserve">   Sprawdź: Get-Content $HOME/.claude/settings.json</w:t>
+        <w:br/>
+        <w:t xml:space="preserve">   Ścieżki muszą zawierać pełną ścieżkę (C:\Users\...), nie ~.</w:t>
+        <w:br/>
+        <w:br/>
+        <w:t>10. Zapytaj o: język AI, GitHub username, ścieżka projektów.</w:t>
+        <w:br/>
+        <w:t xml:space="preserve">    Skopiuj setup/global-claude-template.md -&gt; $HOME/.claude/CLAUDE.md</w:t>
+        <w:br/>
+        <w:t xml:space="preserve">    i wypełnij miejsca oznaczone [[...]] moimi danymi.</w:t>
+        <w:br/>
+        <w:t>11. W $HOME/.claude/skills/setup-new-project/SKILL.md</w:t>
+        <w:br/>
+        <w:t xml:space="preserve">    zamień GITHUB_USERNAME na mój GitHub username.</w:t>
+        <w:br/>
+        <w:t>12. Weryfikacja końcowa:</w:t>
+        <w:br/>
+        <w:t xml:space="preserve">    Get-ChildItem $HOME/.claude/skills/</w:t>
+        <w:br/>
+        <w:t xml:space="preserve">    Get-Content $HOME/.claude/settings.json</w:t>
+        <w:br/>
+        <w:t xml:space="preserve">    Przetestuj /state-start — powinien zapisać stan sesji.</w:t>
+        <w:br/>
+        <w:br/>
+        <w:t>Na końcu powiedz jak stworzyć pierwszy projekt (/setup-new-project)</w:t>
+        <w:br/>
+        <w:t>i wytłumacz kiedy używać /state-start i /catchup.</w:t>
+        <w:br/>
+        <w:br/>
+        <w:t>Pełny opis kroków: setup/onboarding-prompt.md</w:t>
       </w:r>
     </w:p>
     <w:p>
@@ -2153,7 +2937,192 @@
           <w:color w:val="808080"/>
           <w:sz w:val="18"/>
         </w:rPr>
-        <w:t>Szczegółowy opis każdego kroku konfiguracji: setup/onboarding-prompt.md</w:t>
+        <w:t>Szczegolowy opis kazdego kroku konfiguracji: setup/onboarding-prompt.md</w:t>
+      </w:r>
+    </w:p>
+    <w:p>
+      <w:r>
+        <w:br w:type="page"/>
+      </w:r>
+    </w:p>
+    <w:p/>
+    <w:p>
+      <w:pPr>
+        <w:spacing w:before="280" w:after="120"/>
+        <w:pBdr>
+          <w:bottom w:val="single" w:sz="6" w:space="1" w:color="1F497D"/>
+        </w:pBdr>
+      </w:pPr>
+      <w:r>
+        <w:rPr>
+          <w:rFonts w:ascii="Calibri" w:hAnsi="Calibri"/>
+          <w:b/>
+          <w:i w:val="0"/>
+          <w:color w:val="1F497D"/>
+          <w:sz w:val="28"/>
+        </w:rPr>
+        <w:t>Co dalej? — po zakonczeniu konfiguracji</w:t>
+      </w:r>
+    </w:p>
+    <w:p>
+      <w:pPr>
+        <w:spacing w:before="80" w:after="120"/>
+      </w:pPr>
+      <w:r>
+        <w:rPr>
+          <w:rFonts w:ascii="Calibri" w:hAnsi="Calibri"/>
+          <w:b w:val="0"/>
+          <w:i w:val="0"/>
+          <w:sz w:val="20"/>
+        </w:rPr>
+        <w:t>Gratulacje! Masz skonfigurowane srodowisko. Oto co mozesz teraz robic:</w:t>
+      </w:r>
+    </w:p>
+    <w:p>
+      <w:pPr>
+        <w:spacing w:before="60" w:after="60"/>
+        <w:ind w:left="227"/>
+        <w:shd w:val="clear" w:color="auto" w:fill="EFF3FB"/>
+        <w:pBdr>
+          <w:left w:val="single" w:sz="12" w:space="6" w:color="4472C4"/>
+        </w:pBdr>
+      </w:pPr>
+      <w:r>
+        <w:t xml:space="preserve">  </w:t>
+      </w:r>
+      <w:r>
+        <w:rPr>
+          <w:rFonts w:ascii="Calibri" w:hAnsi="Calibri"/>
+          <w:b/>
+          <w:i w:val="0"/>
+          <w:color w:val="1F497D"/>
+          <w:sz w:val="20"/>
+        </w:rPr>
+        <w:t xml:space="preserve">Stworz pierwszy projekt  </w:t>
+      </w:r>
+      <w:r>
+        <w:rPr>
+          <w:rFonts w:ascii="Calibri" w:hAnsi="Calibri"/>
+          <w:b w:val="0"/>
+          <w:i w:val="0"/>
+          <w:color w:val="464646"/>
+          <w:sz w:val="20"/>
+        </w:rPr>
+        <w:t>— wpisz /setup-new-project do Claude i on zajmie sie reszta</w:t>
+      </w:r>
+    </w:p>
+    <w:p>
+      <w:pPr>
+        <w:spacing w:before="60" w:after="60"/>
+        <w:ind w:left="227"/>
+        <w:shd w:val="clear" w:color="auto" w:fill="EFF3FB"/>
+        <w:pBdr>
+          <w:left w:val="single" w:sz="12" w:space="6" w:color="4472C4"/>
+        </w:pBdr>
+      </w:pPr>
+      <w:r>
+        <w:t xml:space="preserve">  </w:t>
+      </w:r>
+      <w:r>
+        <w:rPr>
+          <w:rFonts w:ascii="Calibri" w:hAnsi="Calibri"/>
+          <w:b/>
+          <w:i w:val="0"/>
+          <w:color w:val="1F497D"/>
+          <w:sz w:val="20"/>
+        </w:rPr>
+        <w:t xml:space="preserve">Pracuj z Claude  </w:t>
+      </w:r>
+      <w:r>
+        <w:rPr>
+          <w:rFonts w:ascii="Calibri" w:hAnsi="Calibri"/>
+          <w:b w:val="0"/>
+          <w:i w:val="0"/>
+          <w:color w:val="464646"/>
+          <w:sz w:val="20"/>
+        </w:rPr>
+        <w:t>— po prostu wpisz pytanie lub zadanie. Claude widzi Twoje pliki i pomaga</w:t>
+      </w:r>
+    </w:p>
+    <w:p>
+      <w:pPr>
+        <w:spacing w:before="60" w:after="60"/>
+        <w:ind w:left="227"/>
+        <w:shd w:val="clear" w:color="auto" w:fill="EFF3FB"/>
+        <w:pBdr>
+          <w:left w:val="single" w:sz="12" w:space="6" w:color="4472C4"/>
+        </w:pBdr>
+      </w:pPr>
+      <w:r>
+        <w:t xml:space="preserve">  </w:t>
+      </w:r>
+      <w:r>
+        <w:rPr>
+          <w:rFonts w:ascii="Calibri" w:hAnsi="Calibri"/>
+          <w:b/>
+          <w:i w:val="0"/>
+          <w:color w:val="1F497D"/>
+          <w:sz w:val="20"/>
+        </w:rPr>
+        <w:t xml:space="preserve">Gdy za duzo rozmow  </w:t>
+      </w:r>
+      <w:r>
+        <w:rPr>
+          <w:rFonts w:ascii="Calibri" w:hAnsi="Calibri"/>
+          <w:b w:val="0"/>
+          <w:i w:val="0"/>
+          <w:color w:val="464646"/>
+          <w:sz w:val="20"/>
+        </w:rPr>
+        <w:t>— wpisz /state-start zeby Claude pamietat gdzie skonczyles, potem /clear</w:t>
+      </w:r>
+    </w:p>
+    <w:p>
+      <w:pPr>
+        <w:spacing w:before="60" w:after="60"/>
+        <w:ind w:left="227"/>
+        <w:shd w:val="clear" w:color="auto" w:fill="EFF3FB"/>
+        <w:pBdr>
+          <w:left w:val="single" w:sz="12" w:space="6" w:color="4472C4"/>
+        </w:pBdr>
+      </w:pPr>
+      <w:r>
+        <w:t xml:space="preserve">  </w:t>
+      </w:r>
+      <w:r>
+        <w:rPr>
+          <w:rFonts w:ascii="Calibri" w:hAnsi="Calibri"/>
+          <w:b/>
+          <w:i w:val="0"/>
+          <w:color w:val="1F497D"/>
+          <w:sz w:val="20"/>
+        </w:rPr>
+        <w:t xml:space="preserve">Wron po przerwie  </w:t>
+      </w:r>
+      <w:r>
+        <w:rPr>
+          <w:rFonts w:ascii="Calibri" w:hAnsi="Calibri"/>
+          <w:b w:val="0"/>
+          <w:i w:val="0"/>
+          <w:color w:val="464646"/>
+          <w:sz w:val="20"/>
+        </w:rPr>
+        <w:t>— wpisz /catchup zeby Claude przypominal sobie co robiliście</w:t>
+      </w:r>
+    </w:p>
+    <w:p>
+      <w:pPr>
+        <w:spacing w:before="200" w:after="120"/>
+      </w:pPr>
+      <w:r>
+        <w:rPr>
+          <w:rFonts w:ascii="Calibri" w:hAnsi="Calibri"/>
+          <w:b w:val="0"/>
+          <w:i/>
+          <w:color w:val="787878"/>
+          <w:sz w:val="20"/>
+        </w:rPr>
+        <w:t>Wszystkiego najlepszego w pracy z AI — Claude czeka na Twoje pytania!</w:t>
       </w:r>
     </w:p>
     <w:sectPr>

</xml_diff>

<commit_message>
[fix] Polskie znaki, layout Mac+Win obok siebie, placeholdery na screenshoty
- Wszystkie teksty z polskimi znakami (ą, ę, ó, ś, ć, ź, ż, ń, ł)
- Mac i Windows wyświetlane obok siebie w tabeli 2-kolumnowej (nie pionowo)
- Nowe funkcje: add_screenshot_placeholder(), _add_screenshot_ph_to_cell()
- Placeholdery [Miejsce na screenshot] w: Kroku 2 (nodejs.org), Kroku 3
  (terminal po npm), Kroku 4 (Windsurf+folder), Kroku 5 (Claude >)
- HANDOFF_PROMPT z polskimi znakami

Co-Authored-By: Claude Sonnet 4.6 <noreply@anthropic.com>
</commit_message>
<xml_diff>
--- a/docs/output/onboarding.docx
+++ b/docs/output/onboarding.docx
@@ -53,7 +53,7 @@
           <w:color w:val="B45000"/>
           <w:sz w:val="20"/>
         </w:rPr>
-        <w:t xml:space="preserve">  Ktory masz system?   </w:t>
+        <w:t xml:space="preserve">  Który masz system?   </w:t>
       </w:r>
       <w:r>
         <w:rPr>
@@ -137,7 +137,7 @@
           <w:color w:val="1F497D"/>
           <w:sz w:val="26"/>
         </w:rPr>
-        <w:t>Hej! Nie stresuj sie — to prostsze niz myslisz.</w:t>
+        <w:t>Hej! Nie stresuj się — to prostsze niż myślisz.</w:t>
       </w:r>
     </w:p>
     <w:p>
@@ -151,7 +151,7 @@
           <w:i w:val="0"/>
           <w:sz w:val="20"/>
         </w:rPr>
-        <w:t>Nie musisz byc informatykiem ani znac sie na programowaniu. Ten onboarding jest zaprojektowany tak, zeby kazdy — naprawde kazdy — mogl przez niego przejsc samodzielnie. A jesli cos bedzie niejasne, Claude (asystent AI) bedzie przy Tobie na kazdym kroku i wytlumaczy wszystko po ludzku.</w:t>
+        <w:t>Nie musisz być informatykiem ani znać się na programowaniu. Ten onboarding jest zaprojektowany tak, żeby każdy — naprawdę każdy — mógł przez niego przejść samodzielnie. A jeśli coś będzie niejasne, Claude (asystent AI) będzie przy Tobie na każdym kroku i wytłumaczy wszystko po ludzku.</w:t>
       </w:r>
     </w:p>
     <w:p>
@@ -195,7 +195,7 @@
           <w:color w:val="1B5E20"/>
           <w:sz w:val="20"/>
         </w:rPr>
-        <w:t xml:space="preserve">Asystent AI dostepny 24/7  </w:t>
+        <w:t xml:space="preserve">Asystent AI dostępny 24/7  </w:t>
       </w:r>
       <w:r>
         <w:rPr>
@@ -205,7 +205,7 @@
           <w:color w:val="464646"/>
           <w:sz w:val="20"/>
         </w:rPr>
-        <w:t>Claude odpowiada na pytania, pisze teksty, tlumaczy dokumenty i rozwiazuje problemy — o kazdej porze dnia i nocy.</w:t>
+        <w:t>Claude odpowiada na pytania, pisze teksty, tłumaczy dokumenty i rozwiązuje problemy — o każdej porze dnia i nocy.</w:t>
       </w:r>
     </w:p>
     <w:p>
@@ -234,7 +234,7 @@
           <w:color w:val="1B5E20"/>
           <w:sz w:val="20"/>
         </w:rPr>
-        <w:t xml:space="preserve">Oszczedzasz czas na co dzien  </w:t>
+        <w:t xml:space="preserve">Oszczędzasz czas na co dzień  </w:t>
       </w:r>
       <w:r>
         <w:rPr>
@@ -244,7 +244,7 @@
           <w:color w:val="464646"/>
           <w:sz w:val="20"/>
         </w:rPr>
-        <w:t>Zadania, ktore zajmowaly Ci godziny, teraz trwaja minuty. Raporty, emaile, analizy — Claude robi to za Ciebie.</w:t>
+        <w:t>Zadania, które zajmowały Ci godziny, teraz trwają minuty. Raporty, emaile, analizy — Claude robi to za Ciebie.</w:t>
       </w:r>
     </w:p>
     <w:p>
@@ -283,7 +283,7 @@
           <w:color w:val="464646"/>
           <w:sz w:val="20"/>
         </w:rPr>
-        <w:t>Windsurf daje Ci srodowisko pracy, w ktorym Claude widzi Twoje pliki i pomaga Ci w calym projekcie — nie tylko w jednej rozmowie.</w:t>
+        <w:t>Windsurf daje Ci środowisko pracy, w którym Claude widzi Twoje pliki i pomaga Ci w całym projekcie — nie tylko w jednej rozmowie.</w:t>
       </w:r>
     </w:p>
     <w:p>
@@ -312,7 +312,7 @@
           <w:color w:val="1B5E20"/>
           <w:sz w:val="20"/>
         </w:rPr>
-        <w:t xml:space="preserve">AI pamieta Twoje preferencje  </w:t>
+        <w:t xml:space="preserve">AI pamięta Twoje preferencje  </w:t>
       </w:r>
       <w:r>
         <w:rPr>
@@ -322,7 +322,7 @@
           <w:color w:val="464646"/>
           <w:sz w:val="20"/>
         </w:rPr>
-        <w:t>Po konfiguracji Claude zapamietuje jak lubisz pracowac, w jakim jezyku, co jest dla Ciebie wazne — i stosuje to automatycznie.</w:t>
+        <w:t>Po konfiguracji Claude zapamiętuje jak lubisz pracować, w jakim języku, co jest dla Ciebie ważne — i stosuje to automatycznie.</w:t>
       </w:r>
     </w:p>
     <w:p>
@@ -351,7 +351,7 @@
           <w:color w:val="1B5E20"/>
           <w:sz w:val="20"/>
         </w:rPr>
-        <w:t xml:space="preserve">Zawsze masz kogos do pomocy  </w:t>
+        <w:t xml:space="preserve">Zawsze masz kogoś do pomocy  </w:t>
       </w:r>
       <w:r>
         <w:rPr>
@@ -361,7 +361,7 @@
           <w:color w:val="464646"/>
           <w:sz w:val="20"/>
         </w:rPr>
-        <w:t>Nie wiesz jak cos zrobic? Zapytaj Claude. Nie ocenia, nie sie niecierpliwi, tlumaczy tyle razy ile potrzebujesz.</w:t>
+        <w:t>Nie wiesz jak coś zrobić? Zapytaj Claude. Nie ocenia, nie się niecierpliwi, tłumaczy tyle razy ile potrzebujesz.</w:t>
       </w:r>
     </w:p>
     <w:p>
@@ -393,7 +393,7 @@
           <w:color w:val="503C00"/>
           <w:sz w:val="20"/>
         </w:rPr>
-        <w:t>Okolo 20-30 minut — tyle co filizanka kawy. Pierwsze 5 krokow zrobisz sam w ok. 10-15 minut. Reszta zajmie sie Claude interaktywnie.</w:t>
+        <w:t>Około 20-30 minut — tyle co filiżanka kawy. Pierwsze 5 kroków zrobisz sam w ok. 10-15 minut. Reszta zajmie się Claude interaktywnie.</w:t>
       </w:r>
     </w:p>
     <w:p>
@@ -441,7 +441,7 @@
           <w:color w:val="464646"/>
           <w:sz w:val="20"/>
         </w:rPr>
-        <w:t>Bezplatne konto na claude.ai — bez tego nie zaloguje sie Claude. Jesli nie masz: wejdz na claude.ai, kliknij "Sign up" i utworz konto.</w:t>
+        <w:t>Bezpłatne konto na claude.ai — bez tego nie zaloguje się Claude. Jeśli nie masz: wejdź na claude.ai, kliknij "Sign up" i utwórz konto.</w:t>
       </w:r>
     </w:p>
     <w:p>
@@ -474,7 +474,7 @@
           <w:color w:val="464646"/>
           <w:sz w:val="20"/>
         </w:rPr>
-        <w:t>Bezplatne konto na github.com — potrzebne do tworzenia projektow. Jesli nie masz: wejdz na github.com, kliknij "Sign up" i utworz konto.</w:t>
+        <w:t>Bezpłatne konto na github.com — potrzebne do tworzenia projektów. Jeśli nie masz: wejdź na github.com, kliknij "Sign up" i utwórz konto.</w:t>
       </w:r>
     </w:p>
     <w:p>
@@ -507,7 +507,7 @@
           <w:color w:val="464646"/>
           <w:sz w:val="20"/>
         </w:rPr>
-        <w:t>Ta instrukcja dziala na obu systemach. Kroki specyficzne dla systemu sa wyraznie oznaczone "Na Macu:" lub "Na Windowsie:".</w:t>
+        <w:t>Ta instrukcja działa na obu systemach. Kroki specyficzne dla systemu są wyraźnie oznaczone "Na Macu:" lub "Na Windowsie:".</w:t>
       </w:r>
     </w:p>
     <w:p>
@@ -530,7 +530,7 @@
           <w:color w:val="B71C1C"/>
           <w:sz w:val="20"/>
         </w:rPr>
-        <w:t xml:space="preserve">Polaczenie z internetem  </w:t>
+        <w:t xml:space="preserve">Połączenie z internetem  </w:t>
       </w:r>
       <w:r>
         <w:rPr>
@@ -540,7 +540,7 @@
           <w:color w:val="464646"/>
           <w:sz w:val="20"/>
         </w:rPr>
-        <w:t>Potrzebne przez caly czas instalacji i pozniejszej pracy z Claude.</w:t>
+        <w:t>Potrzebne przez cały czas instalacji i późniejszej pracy z Claude.</w:t>
       </w:r>
     </w:p>
     <w:p>
@@ -555,7 +555,7 @@
           <w:color w:val="646464"/>
           <w:sz w:val="20"/>
         </w:rPr>
-        <w:t>Masz wszystko? Zacznij od Kroku 1 ponizej. Powodzenia!</w:t>
+        <w:t>Masz wszystko? Zacznij od Kroku 1 poniżej. Powodzenia!</w:t>
       </w:r>
     </w:p>
     <w:p/>
@@ -574,7 +574,7 @@
           <w:color w:val="1F497D"/>
           <w:sz w:val="28"/>
         </w:rPr>
-        <w:t>Czesc 1 — Zrob to sam  (6 krokow)</w:t>
+        <w:t>Część 1 — Zrób to sam  (6 kroków)</w:t>
       </w:r>
     </w:p>
     <w:p>
@@ -630,559 +630,597 @@
           <w:color w:val="464646"/>
           <w:sz w:val="20"/>
         </w:rPr>
-        <w:t>Windsurf to program, w ktorym bedziesz pracowac razem z asystentem AI. Musisz go zainstalowac jak kazdy inny program.</w:t>
+        <w:t>Windsurf to program, w którym będziesz pracować razem z asystentem AI. Musisz go zainstalować jak każdy inny program.</w:t>
       </w:r>
     </w:p>
-    <w:p>
-      <w:pPr>
-        <w:spacing w:before="80" w:after="40"/>
-        <w:ind w:left="850"/>
-        <w:pBdr>
-          <w:left w:val="single" w:sz="8" w:space="6" w:color="999999"/>
-        </w:pBdr>
-      </w:pPr>
-      <w:r>
-        <w:rPr>
-          <w:rFonts w:ascii="Calibri" w:hAnsi="Calibri"/>
-          <w:b/>
-          <w:i w:val="0"/>
-          <w:sz w:val="20"/>
-        </w:rPr>
-        <w:t>Na Macu:</w:t>
-      </w:r>
-    </w:p>
-    <w:p>
-      <w:pPr>
-        <w:spacing w:before="20" w:after="40"/>
-        <w:ind w:left="1247" w:hanging="227"/>
-      </w:pPr>
-      <w:r>
-        <w:rPr>
-          <w:rFonts w:ascii="Calibri" w:hAnsi="Calibri"/>
-          <w:b/>
-          <w:i w:val="0"/>
-          <w:color w:val="505050"/>
-          <w:sz w:val="20"/>
-        </w:rPr>
-        <w:t xml:space="preserve">1.  </w:t>
-      </w:r>
-      <w:r>
-        <w:rPr>
-          <w:rFonts w:ascii="Calibri" w:hAnsi="Calibri"/>
-          <w:b w:val="0"/>
-          <w:i w:val="0"/>
-          <w:sz w:val="20"/>
-        </w:rPr>
-        <w:t>Otworz przegladarke (Safari, Chrome — cokolwiek masz).</w:t>
-      </w:r>
-    </w:p>
-    <w:p>
-      <w:pPr>
-        <w:spacing w:before="20" w:after="40"/>
-        <w:ind w:left="1247" w:hanging="227"/>
-      </w:pPr>
-      <w:r>
-        <w:rPr>
-          <w:rFonts w:ascii="Calibri" w:hAnsi="Calibri"/>
-          <w:b/>
-          <w:i w:val="0"/>
-          <w:color w:val="505050"/>
-          <w:sz w:val="20"/>
-        </w:rPr>
-        <w:t xml:space="preserve">2.  </w:t>
-      </w:r>
-      <w:r>
-        <w:rPr>
-          <w:rFonts w:ascii="Calibri" w:hAnsi="Calibri"/>
-          <w:b w:val="0"/>
-          <w:i w:val="0"/>
-          <w:sz w:val="20"/>
-        </w:rPr>
-        <w:t>Wejdz na strone: windsurf.com i nacisnij Enter.</w:t>
-      </w:r>
-    </w:p>
-    <w:p>
-      <w:pPr>
-        <w:spacing w:before="20" w:after="40"/>
-        <w:ind w:left="1247" w:hanging="227"/>
-      </w:pPr>
-      <w:r>
-        <w:rPr>
-          <w:rFonts w:ascii="Calibri" w:hAnsi="Calibri"/>
-          <w:b/>
-          <w:i w:val="0"/>
-          <w:color w:val="505050"/>
-          <w:sz w:val="20"/>
-        </w:rPr>
-        <w:t xml:space="preserve">3.  </w:t>
-      </w:r>
-      <w:r>
-        <w:rPr>
-          <w:rFonts w:ascii="Calibri" w:hAnsi="Calibri"/>
-          <w:b w:val="0"/>
-          <w:i w:val="0"/>
-          <w:sz w:val="20"/>
-        </w:rPr>
-        <w:t>Kliknij przycisk pobierania dla Maca (moze sie nazywac "Download for macOS" lub "Download for Mac").</w:t>
-      </w:r>
-    </w:p>
-    <w:p>
-      <w:pPr>
-        <w:spacing w:before="20" w:after="40"/>
-        <w:ind w:left="1247" w:hanging="227"/>
-      </w:pPr>
-      <w:r>
-        <w:rPr>
-          <w:rFonts w:ascii="Calibri" w:hAnsi="Calibri"/>
-          <w:b/>
-          <w:i w:val="0"/>
-          <w:color w:val="505050"/>
-          <w:sz w:val="20"/>
-        </w:rPr>
-        <w:t xml:space="preserve">4.  </w:t>
-      </w:r>
-      <w:r>
-        <w:rPr>
-          <w:rFonts w:ascii="Calibri" w:hAnsi="Calibri"/>
-          <w:b w:val="0"/>
-          <w:i w:val="0"/>
-          <w:sz w:val="20"/>
-        </w:rPr>
-        <w:t>Poczekaj — plik pobierze sie do folderu Pobrane (Downloads). Zobaczysz go na dole okna przegladarki lub w Finderze Pobrane.</w:t>
-      </w:r>
-    </w:p>
-    <w:p>
-      <w:pPr>
-        <w:spacing w:before="20" w:after="40"/>
-        <w:ind w:left="1247" w:hanging="227"/>
-      </w:pPr>
-      <w:r>
-        <w:rPr>
-          <w:rFonts w:ascii="Calibri" w:hAnsi="Calibri"/>
-          <w:b/>
-          <w:i w:val="0"/>
-          <w:color w:val="505050"/>
-          <w:sz w:val="20"/>
-        </w:rPr>
-        <w:t xml:space="preserve">5.  </w:t>
-      </w:r>
-      <w:r>
-        <w:rPr>
-          <w:rFonts w:ascii="Calibri" w:hAnsi="Calibri"/>
-          <w:b w:val="0"/>
-          <w:i w:val="0"/>
-          <w:sz w:val="20"/>
-        </w:rPr>
-        <w:t>Kliknij dwukrotnie na pobrany plik (konczy sie na .dmg).</w:t>
-      </w:r>
-    </w:p>
-    <w:p>
-      <w:pPr>
-        <w:spacing w:before="20" w:after="40"/>
-        <w:ind w:left="1247" w:hanging="227"/>
-      </w:pPr>
-      <w:r>
-        <w:rPr>
-          <w:rFonts w:ascii="Calibri" w:hAnsi="Calibri"/>
-          <w:b/>
-          <w:i w:val="0"/>
-          <w:color w:val="505050"/>
-          <w:sz w:val="20"/>
-        </w:rPr>
-        <w:t xml:space="preserve">6.  </w:t>
-      </w:r>
-      <w:r>
-        <w:rPr>
-          <w:rFonts w:ascii="Calibri" w:hAnsi="Calibri"/>
-          <w:b w:val="0"/>
-          <w:i w:val="0"/>
-          <w:sz w:val="20"/>
-        </w:rPr>
-        <w:t>Pojawi sie okienko — przeciagnij ikone Windsurf do folderu Applications.</w:t>
-      </w:r>
-    </w:p>
-    <w:p>
-      <w:pPr>
-        <w:spacing w:before="20" w:after="40"/>
-        <w:ind w:left="1247" w:hanging="227"/>
-      </w:pPr>
-      <w:r>
-        <w:rPr>
-          <w:rFonts w:ascii="Calibri" w:hAnsi="Calibri"/>
-          <w:b/>
-          <w:i w:val="0"/>
-          <w:color w:val="505050"/>
-          <w:sz w:val="20"/>
-        </w:rPr>
-        <w:t xml:space="preserve">7.  </w:t>
-      </w:r>
-      <w:r>
-        <w:rPr>
-          <w:rFonts w:ascii="Calibri" w:hAnsi="Calibri"/>
-          <w:b w:val="0"/>
-          <w:i w:val="0"/>
-          <w:sz w:val="20"/>
-        </w:rPr>
-        <w:t>Poczekaj az sie skopiuje i zamknij to okienko.</w:t>
-      </w:r>
-    </w:p>
-    <w:p>
-      <w:pPr>
-        <w:spacing w:before="20" w:after="40"/>
-        <w:ind w:left="1247" w:hanging="227"/>
-      </w:pPr>
-      <w:r>
-        <w:rPr>
-          <w:rFonts w:ascii="Calibri" w:hAnsi="Calibri"/>
-          <w:b/>
-          <w:i w:val="0"/>
-          <w:color w:val="505050"/>
-          <w:sz w:val="20"/>
-        </w:rPr>
-        <w:t xml:space="preserve">8.  </w:t>
-      </w:r>
-      <w:r>
-        <w:rPr>
-          <w:rFonts w:ascii="Calibri" w:hAnsi="Calibri"/>
-          <w:b w:val="0"/>
-          <w:i w:val="0"/>
-          <w:sz w:val="20"/>
-        </w:rPr>
-        <w:t>Otworz Windsurf: kliknij ikone rakiety w Docku (Launchpad) lub nacisnij Cmd+Spacja, wpisz "Windsurf" i kliknij.</w:t>
-      </w:r>
-    </w:p>
-    <w:p>
-      <w:pPr>
-        <w:spacing w:before="120" w:after="40"/>
-        <w:ind w:left="680"/>
-        <w:jc w:val="center"/>
-      </w:pPr>
-      <w:r>
-        <w:drawing>
-          <wp:inline xmlns:a="http://schemas.openxmlformats.org/drawingml/2006/main" xmlns:pic="http://schemas.openxmlformats.org/drawingml/2006/picture">
-            <wp:extent cx="4572000" cy="2637692"/>
-            <wp:docPr id="1" name="Picture 1"/>
-            <wp:cNvGraphicFramePr>
-              <a:graphicFrameLocks noChangeAspect="1"/>
-            </wp:cNvGraphicFramePr>
-            <a:graphic>
-              <a:graphicData uri="http://schemas.openxmlformats.org/drawingml/2006/picture">
-                <pic:pic>
-                  <pic:nvPicPr>
-                    <pic:cNvPr id="0" name="tmpxvjkiysj.png"/>
-                    <pic:cNvPicPr/>
-                  </pic:nvPicPr>
-                  <pic:blipFill>
-                    <a:blip r:embed="rId9"/>
-                    <a:stretch>
-                      <a:fillRect/>
-                    </a:stretch>
-                  </pic:blipFill>
-                  <pic:spPr>
-                    <a:xfrm>
-                      <a:off x="0" y="0"/>
-                      <a:ext cx="4572000" cy="2637692"/>
-                    </a:xfrm>
-                    <a:prstGeom prst="rect"/>
-                  </pic:spPr>
-                </pic:pic>
-              </a:graphicData>
-            </a:graphic>
-          </wp:inline>
-        </w:drawing>
-      </w:r>
-    </w:p>
-    <w:p>
-      <w:pPr>
-        <w:spacing w:before="40" w:after="120"/>
-        <w:ind w:left="680"/>
-      </w:pPr>
-      <w:r>
-        <w:rPr>
-          <w:rFonts w:ascii="Calibri" w:hAnsi="Calibri"/>
-          <w:b w:val="0"/>
-          <w:i/>
-          <w:color w:val="646464"/>
-          <w:sz w:val="18"/>
-        </w:rPr>
-        <w:t xml:space="preserve">  Windsurf na Macu — Terminal otworzysz przez Terminal → New Terminal.</w:t>
-      </w:r>
-    </w:p>
-    <w:p>
-      <w:pPr>
-        <w:spacing w:before="80" w:after="40"/>
-        <w:ind w:left="850"/>
-        <w:pBdr>
-          <w:left w:val="single" w:sz="8" w:space="6" w:color="0078D4"/>
-        </w:pBdr>
-      </w:pPr>
-      <w:r>
-        <w:rPr>
-          <w:rFonts w:ascii="Calibri" w:hAnsi="Calibri"/>
-          <w:b/>
-          <w:i w:val="0"/>
-          <w:sz w:val="20"/>
-        </w:rPr>
-        <w:t>Na Windowsie:</w:t>
-      </w:r>
-    </w:p>
-    <w:p>
-      <w:pPr>
-        <w:spacing w:before="20" w:after="40"/>
-        <w:ind w:left="1247" w:hanging="227"/>
-      </w:pPr>
-      <w:r>
-        <w:rPr>
-          <w:rFonts w:ascii="Calibri" w:hAnsi="Calibri"/>
-          <w:b/>
-          <w:i w:val="0"/>
-          <w:color w:val="0054A6"/>
-          <w:sz w:val="20"/>
-        </w:rPr>
-        <w:t xml:space="preserve">1.  </w:t>
-      </w:r>
-      <w:r>
-        <w:rPr>
-          <w:rFonts w:ascii="Calibri" w:hAnsi="Calibri"/>
-          <w:b w:val="0"/>
-          <w:i w:val="0"/>
-          <w:sz w:val="20"/>
-        </w:rPr>
-        <w:t>Otworz przegladarke (Edge, Chrome — cokolwiek masz).</w:t>
-      </w:r>
-    </w:p>
-    <w:p>
-      <w:pPr>
-        <w:spacing w:before="20" w:after="40"/>
-        <w:ind w:left="1247" w:hanging="227"/>
-      </w:pPr>
-      <w:r>
-        <w:rPr>
-          <w:rFonts w:ascii="Calibri" w:hAnsi="Calibri"/>
-          <w:b/>
-          <w:i w:val="0"/>
-          <w:color w:val="0054A6"/>
-          <w:sz w:val="20"/>
-        </w:rPr>
-        <w:t xml:space="preserve">2.  </w:t>
-      </w:r>
-      <w:r>
-        <w:rPr>
-          <w:rFonts w:ascii="Calibri" w:hAnsi="Calibri"/>
-          <w:b w:val="0"/>
-          <w:i w:val="0"/>
-          <w:sz w:val="20"/>
-        </w:rPr>
-        <w:t>Wejdz na strone: windsurf.com i nacisnij Enter.</w:t>
-      </w:r>
-    </w:p>
-    <w:p>
-      <w:pPr>
-        <w:spacing w:before="20" w:after="40"/>
-        <w:ind w:left="1247" w:hanging="227"/>
-      </w:pPr>
-      <w:r>
-        <w:rPr>
-          <w:rFonts w:ascii="Calibri" w:hAnsi="Calibri"/>
-          <w:b/>
-          <w:i w:val="0"/>
-          <w:color w:val="0054A6"/>
-          <w:sz w:val="20"/>
-        </w:rPr>
-        <w:t xml:space="preserve">3.  </w:t>
-      </w:r>
-      <w:r>
-        <w:rPr>
-          <w:rFonts w:ascii="Calibri" w:hAnsi="Calibri"/>
-          <w:b w:val="0"/>
-          <w:i w:val="0"/>
-          <w:sz w:val="20"/>
-        </w:rPr>
-        <w:t>Kliknij przycisk pobierania dla Windows (moze sie nazywac "Download for Windows" lub podobnie).</w:t>
-      </w:r>
-    </w:p>
-    <w:p>
-      <w:pPr>
-        <w:spacing w:before="20" w:after="40"/>
-        <w:ind w:left="1247" w:hanging="227"/>
-      </w:pPr>
-      <w:r>
-        <w:rPr>
-          <w:rFonts w:ascii="Calibri" w:hAnsi="Calibri"/>
-          <w:b/>
-          <w:i w:val="0"/>
-          <w:color w:val="0054A6"/>
-          <w:sz w:val="20"/>
-        </w:rPr>
-        <w:t xml:space="preserve">4.  </w:t>
-      </w:r>
-      <w:r>
-        <w:rPr>
-          <w:rFonts w:ascii="Calibri" w:hAnsi="Calibri"/>
-          <w:b w:val="0"/>
-          <w:i w:val="0"/>
-          <w:sz w:val="20"/>
-        </w:rPr>
-        <w:t>Poczekaj — plik .exe lub .msi pobierze sie do folderu Pobrane.</w:t>
-      </w:r>
-    </w:p>
-    <w:p>
-      <w:pPr>
-        <w:spacing w:before="20" w:after="40"/>
-        <w:ind w:left="1247" w:hanging="227"/>
-      </w:pPr>
-      <w:r>
-        <w:rPr>
-          <w:rFonts w:ascii="Calibri" w:hAnsi="Calibri"/>
-          <w:b/>
-          <w:i w:val="0"/>
-          <w:color w:val="0054A6"/>
-          <w:sz w:val="20"/>
-        </w:rPr>
-        <w:t xml:space="preserve">5.  </w:t>
-      </w:r>
-      <w:r>
-        <w:rPr>
-          <w:rFonts w:ascii="Calibri" w:hAnsi="Calibri"/>
-          <w:b w:val="0"/>
-          <w:i w:val="0"/>
-          <w:sz w:val="20"/>
-        </w:rPr>
-        <w:t>Otworz pobrany plik (kliknij dwukrotnie).</w:t>
-      </w:r>
-    </w:p>
-    <w:p>
-      <w:pPr>
-        <w:spacing w:before="20" w:after="40"/>
-        <w:ind w:left="1247" w:hanging="227"/>
-      </w:pPr>
-      <w:r>
-        <w:rPr>
-          <w:rFonts w:ascii="Calibri" w:hAnsi="Calibri"/>
-          <w:b/>
-          <w:i w:val="0"/>
-          <w:color w:val="0054A6"/>
-          <w:sz w:val="20"/>
-        </w:rPr>
-        <w:t xml:space="preserve">6.  </w:t>
-      </w:r>
-      <w:r>
-        <w:rPr>
-          <w:rFonts w:ascii="Calibri" w:hAnsi="Calibri"/>
-          <w:b w:val="0"/>
-          <w:i w:val="0"/>
-          <w:sz w:val="20"/>
-        </w:rPr>
-        <w:t>Jesli Windows zapyta "Czy chcesz zezwolic..." — kliknij Tak.</w:t>
-      </w:r>
-    </w:p>
-    <w:p>
-      <w:pPr>
-        <w:spacing w:before="20" w:after="40"/>
-        <w:ind w:left="1247" w:hanging="227"/>
-      </w:pPr>
-      <w:r>
-        <w:rPr>
-          <w:rFonts w:ascii="Calibri" w:hAnsi="Calibri"/>
-          <w:b/>
-          <w:i w:val="0"/>
-          <w:color w:val="0054A6"/>
-          <w:sz w:val="20"/>
-        </w:rPr>
-        <w:t xml:space="preserve">7.  </w:t>
-      </w:r>
-      <w:r>
-        <w:rPr>
-          <w:rFonts w:ascii="Calibri" w:hAnsi="Calibri"/>
-          <w:b w:val="0"/>
-          <w:i w:val="0"/>
-          <w:sz w:val="20"/>
-        </w:rPr>
-        <w:t>Instalator sie otworzy — klikaj Dalej/Next przez kolejne ekrany.</w:t>
-      </w:r>
-    </w:p>
-    <w:p>
-      <w:pPr>
-        <w:spacing w:before="20" w:after="40"/>
-        <w:ind w:left="1247" w:hanging="227"/>
-      </w:pPr>
-      <w:r>
-        <w:rPr>
-          <w:rFonts w:ascii="Calibri" w:hAnsi="Calibri"/>
-          <w:b/>
-          <w:i w:val="0"/>
-          <w:color w:val="0054A6"/>
-          <w:sz w:val="20"/>
-        </w:rPr>
-        <w:t xml:space="preserve">8.  </w:t>
-      </w:r>
-      <w:r>
-        <w:rPr>
-          <w:rFonts w:ascii="Calibri" w:hAnsi="Calibri"/>
-          <w:b w:val="0"/>
-          <w:i w:val="0"/>
-          <w:sz w:val="20"/>
-        </w:rPr>
-        <w:t>Po instalacji kliknij Windsurf na Pulpicie lub w Menu Start.</w:t>
-      </w:r>
-    </w:p>
-    <w:p>
-      <w:pPr>
-        <w:spacing w:before="120" w:after="40"/>
-        <w:ind w:left="680"/>
-        <w:jc w:val="center"/>
-      </w:pPr>
-      <w:r>
-        <w:drawing>
-          <wp:inline xmlns:a="http://schemas.openxmlformats.org/drawingml/2006/main" xmlns:pic="http://schemas.openxmlformats.org/drawingml/2006/picture">
-            <wp:extent cx="4572000" cy="2637692"/>
-            <wp:docPr id="2" name="Picture 2"/>
-            <wp:cNvGraphicFramePr>
-              <a:graphicFrameLocks noChangeAspect="1"/>
-            </wp:cNvGraphicFramePr>
-            <a:graphic>
-              <a:graphicData uri="http://schemas.openxmlformats.org/drawingml/2006/picture">
-                <pic:pic>
-                  <pic:nvPicPr>
-                    <pic:cNvPr id="0" name="tmpc8oxyrt9.png"/>
-                    <pic:cNvPicPr/>
-                  </pic:nvPicPr>
-                  <pic:blipFill>
-                    <a:blip r:embed="rId10"/>
-                    <a:stretch>
-                      <a:fillRect/>
-                    </a:stretch>
-                  </pic:blipFill>
-                  <pic:spPr>
-                    <a:xfrm>
-                      <a:off x="0" y="0"/>
-                      <a:ext cx="4572000" cy="2637692"/>
-                    </a:xfrm>
-                    <a:prstGeom prst="rect"/>
-                  </pic:spPr>
-                </pic:pic>
-              </a:graphicData>
-            </a:graphic>
-          </wp:inline>
-        </w:drawing>
-      </w:r>
-    </w:p>
-    <w:p>
-      <w:pPr>
-        <w:spacing w:before="40" w:after="120"/>
-        <w:ind w:left="680"/>
-      </w:pPr>
-      <w:r>
-        <w:rPr>
-          <w:rFonts w:ascii="Calibri" w:hAnsi="Calibri"/>
-          <w:b w:val="0"/>
-          <w:i/>
-          <w:color w:val="646464"/>
-          <w:sz w:val="18"/>
-        </w:rPr>
-        <w:t xml:space="preserve">  Windsurf na Windowsie — Terminal (niebieski, PowerShell) otworzysz przez Terminal → New Terminal.</w:t>
-      </w:r>
-    </w:p>
+    <w:tbl>
+      <w:tblPr>
+        <w:tblW w:type="auto" w:w="0"/>
+        <w:tblLook w:firstColumn="1" w:firstRow="1" w:lastColumn="0" w:lastRow="0" w:noHBand="0" w:noVBand="1" w:val="04A0"/>
+        <w:tblBorders>
+          <w:top w:val="none" w:sz="0" w:space="0" w:color="auto"/>
+          <w:left w:val="none" w:sz="0" w:space="0" w:color="auto"/>
+          <w:bottom w:val="none" w:sz="0" w:space="0" w:color="auto"/>
+          <w:right w:val="none" w:sz="0" w:space="0" w:color="auto"/>
+          <w:insideH w:val="none" w:sz="0" w:space="0" w:color="auto"/>
+          <w:insideV w:val="none" w:sz="0" w:space="0" w:color="auto"/>
+        </w:tblBorders>
+      </w:tblPr>
+      <w:tblGrid>
+        <w:gridCol w:w="4703"/>
+        <w:gridCol w:w="4703"/>
+      </w:tblGrid>
+      <w:tr>
+        <w:tc>
+          <w:tcPr>
+            <w:tcW w:type="dxa" w:w="4703"/>
+            <w:tcBorders>
+              <w:top w:val="none" w:sz="0" w:space="0" w:color="auto"/>
+              <w:bottom w:val="none" w:sz="0" w:space="0" w:color="auto"/>
+              <w:right w:val="none" w:sz="0" w:space="0" w:color="auto"/>
+              <w:insideV w:val="none" w:sz="0" w:space="0" w:color="auto"/>
+              <w:insideH w:val="none" w:sz="0" w:space="0" w:color="auto"/>
+              <w:left w:val="single" w:sz="8" w:space="6" w:color="999999"/>
+            </w:tcBorders>
+          </w:tcPr>
+          <w:p>
+            <w:pPr>
+              <w:spacing w:before="80" w:after="80"/>
+              <w:ind w:left="170"/>
+            </w:pPr>
+            <w:r>
+              <w:rPr>
+                <w:rFonts w:ascii="Calibri" w:hAnsi="Calibri"/>
+                <w:b/>
+                <w:i w:val="0"/>
+                <w:color w:val="505050"/>
+                <w:sz w:val="20"/>
+              </w:rPr>
+              <w:t>Na Macu:</w:t>
+            </w:r>
+          </w:p>
+          <w:p>
+            <w:pPr>
+              <w:spacing w:before="20" w:after="40"/>
+              <w:ind w:left="283" w:hanging="227"/>
+            </w:pPr>
+            <w:r>
+              <w:rPr>
+                <w:rFonts w:ascii="Calibri" w:hAnsi="Calibri"/>
+                <w:b/>
+                <w:i w:val="0"/>
+                <w:color w:val="505050"/>
+                <w:sz w:val="20"/>
+              </w:rPr>
+              <w:t xml:space="preserve">1.  </w:t>
+            </w:r>
+            <w:r>
+              <w:rPr>
+                <w:rFonts w:ascii="Calibri" w:hAnsi="Calibri"/>
+                <w:b w:val="0"/>
+                <w:i w:val="0"/>
+                <w:sz w:val="20"/>
+              </w:rPr>
+              <w:t>Otwórz przeglądarkę (Safari, Chrome — cokolwiek masz).</w:t>
+            </w:r>
+          </w:p>
+          <w:p>
+            <w:pPr>
+              <w:spacing w:before="20" w:after="40"/>
+              <w:ind w:left="283" w:hanging="227"/>
+            </w:pPr>
+            <w:r>
+              <w:rPr>
+                <w:rFonts w:ascii="Calibri" w:hAnsi="Calibri"/>
+                <w:b/>
+                <w:i w:val="0"/>
+                <w:color w:val="505050"/>
+                <w:sz w:val="20"/>
+              </w:rPr>
+              <w:t xml:space="preserve">2.  </w:t>
+            </w:r>
+            <w:r>
+              <w:rPr>
+                <w:rFonts w:ascii="Calibri" w:hAnsi="Calibri"/>
+                <w:b w:val="0"/>
+                <w:i w:val="0"/>
+                <w:sz w:val="20"/>
+              </w:rPr>
+              <w:t>Wejdź na stronę: windsurf.com i naciśnij Enter.</w:t>
+            </w:r>
+          </w:p>
+          <w:p>
+            <w:pPr>
+              <w:spacing w:before="20" w:after="40"/>
+              <w:ind w:left="283" w:hanging="227"/>
+            </w:pPr>
+            <w:r>
+              <w:rPr>
+                <w:rFonts w:ascii="Calibri" w:hAnsi="Calibri"/>
+                <w:b/>
+                <w:i w:val="0"/>
+                <w:color w:val="505050"/>
+                <w:sz w:val="20"/>
+              </w:rPr>
+              <w:t xml:space="preserve">3.  </w:t>
+            </w:r>
+            <w:r>
+              <w:rPr>
+                <w:rFonts w:ascii="Calibri" w:hAnsi="Calibri"/>
+                <w:b w:val="0"/>
+                <w:i w:val="0"/>
+                <w:sz w:val="20"/>
+              </w:rPr>
+              <w:t>Kliknij przycisk pobierania dla Maca (może się nazywać "Download for macOS" lub "Download for Mac").</w:t>
+            </w:r>
+          </w:p>
+          <w:p>
+            <w:pPr>
+              <w:spacing w:before="20" w:after="40"/>
+              <w:ind w:left="283" w:hanging="227"/>
+            </w:pPr>
+            <w:r>
+              <w:rPr>
+                <w:rFonts w:ascii="Calibri" w:hAnsi="Calibri"/>
+                <w:b/>
+                <w:i w:val="0"/>
+                <w:color w:val="505050"/>
+                <w:sz w:val="20"/>
+              </w:rPr>
+              <w:t xml:space="preserve">4.  </w:t>
+            </w:r>
+            <w:r>
+              <w:rPr>
+                <w:rFonts w:ascii="Calibri" w:hAnsi="Calibri"/>
+                <w:b w:val="0"/>
+                <w:i w:val="0"/>
+                <w:sz w:val="20"/>
+              </w:rPr>
+              <w:t>Poczekaj — plik pobierze się do folderu Pobrane (Downloads). Zobaczysz go na dole okna przeglądarki lub w Finderze Pobrane.</w:t>
+            </w:r>
+          </w:p>
+          <w:p>
+            <w:pPr>
+              <w:spacing w:before="20" w:after="40"/>
+              <w:ind w:left="283" w:hanging="227"/>
+            </w:pPr>
+            <w:r>
+              <w:rPr>
+                <w:rFonts w:ascii="Calibri" w:hAnsi="Calibri"/>
+                <w:b/>
+                <w:i w:val="0"/>
+                <w:color w:val="505050"/>
+                <w:sz w:val="20"/>
+              </w:rPr>
+              <w:t xml:space="preserve">5.  </w:t>
+            </w:r>
+            <w:r>
+              <w:rPr>
+                <w:rFonts w:ascii="Calibri" w:hAnsi="Calibri"/>
+                <w:b w:val="0"/>
+                <w:i w:val="0"/>
+                <w:sz w:val="20"/>
+              </w:rPr>
+              <w:t>Kliknij dwukrotnie na pobrany plik (kończy się na .dmg).</w:t>
+            </w:r>
+          </w:p>
+          <w:p>
+            <w:pPr>
+              <w:spacing w:before="20" w:after="40"/>
+              <w:ind w:left="283" w:hanging="227"/>
+            </w:pPr>
+            <w:r>
+              <w:rPr>
+                <w:rFonts w:ascii="Calibri" w:hAnsi="Calibri"/>
+                <w:b/>
+                <w:i w:val="0"/>
+                <w:color w:val="505050"/>
+                <w:sz w:val="20"/>
+              </w:rPr>
+              <w:t xml:space="preserve">6.  </w:t>
+            </w:r>
+            <w:r>
+              <w:rPr>
+                <w:rFonts w:ascii="Calibri" w:hAnsi="Calibri"/>
+                <w:b w:val="0"/>
+                <w:i w:val="0"/>
+                <w:sz w:val="20"/>
+              </w:rPr>
+              <w:t>Pojawi się okienko — przeciągnij ikonę Windsurf do folderu Applications.</w:t>
+            </w:r>
+          </w:p>
+          <w:p>
+            <w:pPr>
+              <w:spacing w:before="20" w:after="40"/>
+              <w:ind w:left="283" w:hanging="227"/>
+            </w:pPr>
+            <w:r>
+              <w:rPr>
+                <w:rFonts w:ascii="Calibri" w:hAnsi="Calibri"/>
+                <w:b/>
+                <w:i w:val="0"/>
+                <w:color w:val="505050"/>
+                <w:sz w:val="20"/>
+              </w:rPr>
+              <w:t xml:space="preserve">7.  </w:t>
+            </w:r>
+            <w:r>
+              <w:rPr>
+                <w:rFonts w:ascii="Calibri" w:hAnsi="Calibri"/>
+                <w:b w:val="0"/>
+                <w:i w:val="0"/>
+                <w:sz w:val="20"/>
+              </w:rPr>
+              <w:t>Poczekaj aż się skopiuje i zamknij to okienko.</w:t>
+            </w:r>
+          </w:p>
+          <w:p>
+            <w:pPr>
+              <w:spacing w:before="20" w:after="40"/>
+              <w:ind w:left="283" w:hanging="227"/>
+            </w:pPr>
+            <w:r>
+              <w:rPr>
+                <w:rFonts w:ascii="Calibri" w:hAnsi="Calibri"/>
+                <w:b/>
+                <w:i w:val="0"/>
+                <w:color w:val="505050"/>
+                <w:sz w:val="20"/>
+              </w:rPr>
+              <w:t xml:space="preserve">8.  </w:t>
+            </w:r>
+            <w:r>
+              <w:rPr>
+                <w:rFonts w:ascii="Calibri" w:hAnsi="Calibri"/>
+                <w:b w:val="0"/>
+                <w:i w:val="0"/>
+                <w:sz w:val="20"/>
+              </w:rPr>
+              <w:t>Otwórz Windsurf: kliknij ikonę rakiety w Docku (Launchpad) lub naciśnij Cmd+Spacja, wpisz "Windsurf" i kliknij.</w:t>
+            </w:r>
+          </w:p>
+          <w:p>
+            <w:pPr>
+              <w:spacing w:before="80" w:after="40"/>
+              <w:jc w:val="center"/>
+            </w:pPr>
+            <w:r>
+              <w:drawing>
+                <wp:inline xmlns:a="http://schemas.openxmlformats.org/drawingml/2006/main" xmlns:pic="http://schemas.openxmlformats.org/drawingml/2006/picture">
+                  <wp:extent cx="2560320" cy="1477108"/>
+                  <wp:docPr id="1" name="Picture 1"/>
+                  <wp:cNvGraphicFramePr>
+                    <a:graphicFrameLocks noChangeAspect="1"/>
+                  </wp:cNvGraphicFramePr>
+                  <a:graphic>
+                    <a:graphicData uri="http://schemas.openxmlformats.org/drawingml/2006/picture">
+                      <pic:pic>
+                        <pic:nvPicPr>
+                          <pic:cNvPr id="0" name="tmp6khqsfoi.png"/>
+                          <pic:cNvPicPr/>
+                        </pic:nvPicPr>
+                        <pic:blipFill>
+                          <a:blip r:embed="rId9"/>
+                          <a:stretch>
+                            <a:fillRect/>
+                          </a:stretch>
+                        </pic:blipFill>
+                        <pic:spPr>
+                          <a:xfrm>
+                            <a:off x="0" y="0"/>
+                            <a:ext cx="2560320" cy="1477108"/>
+                          </a:xfrm>
+                          <a:prstGeom prst="rect"/>
+                        </pic:spPr>
+                      </pic:pic>
+                    </a:graphicData>
+                  </a:graphic>
+                </wp:inline>
+              </w:drawing>
+            </w:r>
+          </w:p>
+          <w:p>
+            <w:pPr>
+              <w:spacing w:before="40" w:after="80"/>
+            </w:pPr>
+            <w:r>
+              <w:rPr>
+                <w:rFonts w:ascii="Calibri" w:hAnsi="Calibri"/>
+                <w:b w:val="0"/>
+                <w:i/>
+                <w:color w:val="646464"/>
+                <w:sz w:val="16"/>
+              </w:rPr>
+              <w:t xml:space="preserve">  Windsurf na Macu — Terminal otworzysz przez Terminal → New Terminal.</w:t>
+            </w:r>
+          </w:p>
+        </w:tc>
+        <w:tc>
+          <w:tcPr>
+            <w:tcW w:type="dxa" w:w="4703"/>
+            <w:tcBorders>
+              <w:top w:val="none" w:sz="0" w:space="0" w:color="auto"/>
+              <w:bottom w:val="none" w:sz="0" w:space="0" w:color="auto"/>
+              <w:right w:val="none" w:sz="0" w:space="0" w:color="auto"/>
+              <w:insideV w:val="none" w:sz="0" w:space="0" w:color="auto"/>
+              <w:insideH w:val="none" w:sz="0" w:space="0" w:color="auto"/>
+              <w:left w:val="single" w:sz="8" w:space="6" w:color="0078D4"/>
+            </w:tcBorders>
+          </w:tcPr>
+          <w:p>
+            <w:pPr>
+              <w:spacing w:before="80" w:after="80"/>
+              <w:ind w:left="170"/>
+            </w:pPr>
+            <w:r>
+              <w:rPr>
+                <w:rFonts w:ascii="Calibri" w:hAnsi="Calibri"/>
+                <w:b/>
+                <w:i w:val="0"/>
+                <w:color w:val="0054A6"/>
+                <w:sz w:val="20"/>
+              </w:rPr>
+              <w:t>Na Windowsie:</w:t>
+            </w:r>
+          </w:p>
+          <w:p>
+            <w:pPr>
+              <w:spacing w:before="20" w:after="40"/>
+              <w:ind w:left="283" w:hanging="227"/>
+            </w:pPr>
+            <w:r>
+              <w:rPr>
+                <w:rFonts w:ascii="Calibri" w:hAnsi="Calibri"/>
+                <w:b/>
+                <w:i w:val="0"/>
+                <w:color w:val="0054A6"/>
+                <w:sz w:val="20"/>
+              </w:rPr>
+              <w:t xml:space="preserve">1.  </w:t>
+            </w:r>
+            <w:r>
+              <w:rPr>
+                <w:rFonts w:ascii="Calibri" w:hAnsi="Calibri"/>
+                <w:b w:val="0"/>
+                <w:i w:val="0"/>
+                <w:sz w:val="20"/>
+              </w:rPr>
+              <w:t>Otwórz przeglądarkę (Edge, Chrome — cokolwiek masz).</w:t>
+            </w:r>
+          </w:p>
+          <w:p>
+            <w:pPr>
+              <w:spacing w:before="20" w:after="40"/>
+              <w:ind w:left="283" w:hanging="227"/>
+            </w:pPr>
+            <w:r>
+              <w:rPr>
+                <w:rFonts w:ascii="Calibri" w:hAnsi="Calibri"/>
+                <w:b/>
+                <w:i w:val="0"/>
+                <w:color w:val="0054A6"/>
+                <w:sz w:val="20"/>
+              </w:rPr>
+              <w:t xml:space="preserve">2.  </w:t>
+            </w:r>
+            <w:r>
+              <w:rPr>
+                <w:rFonts w:ascii="Calibri" w:hAnsi="Calibri"/>
+                <w:b w:val="0"/>
+                <w:i w:val="0"/>
+                <w:sz w:val="20"/>
+              </w:rPr>
+              <w:t>Wejdź na stronę: windsurf.com i naciśnij Enter.</w:t>
+            </w:r>
+          </w:p>
+          <w:p>
+            <w:pPr>
+              <w:spacing w:before="20" w:after="40"/>
+              <w:ind w:left="283" w:hanging="227"/>
+            </w:pPr>
+            <w:r>
+              <w:rPr>
+                <w:rFonts w:ascii="Calibri" w:hAnsi="Calibri"/>
+                <w:b/>
+                <w:i w:val="0"/>
+                <w:color w:val="0054A6"/>
+                <w:sz w:val="20"/>
+              </w:rPr>
+              <w:t xml:space="preserve">3.  </w:t>
+            </w:r>
+            <w:r>
+              <w:rPr>
+                <w:rFonts w:ascii="Calibri" w:hAnsi="Calibri"/>
+                <w:b w:val="0"/>
+                <w:i w:val="0"/>
+                <w:sz w:val="20"/>
+              </w:rPr>
+              <w:t>Kliknij przycisk pobierania dla Windows (może się nazywać "Download for Windows" lub podobnie).</w:t>
+            </w:r>
+          </w:p>
+          <w:p>
+            <w:pPr>
+              <w:spacing w:before="20" w:after="40"/>
+              <w:ind w:left="283" w:hanging="227"/>
+            </w:pPr>
+            <w:r>
+              <w:rPr>
+                <w:rFonts w:ascii="Calibri" w:hAnsi="Calibri"/>
+                <w:b/>
+                <w:i w:val="0"/>
+                <w:color w:val="0054A6"/>
+                <w:sz w:val="20"/>
+              </w:rPr>
+              <w:t xml:space="preserve">4.  </w:t>
+            </w:r>
+            <w:r>
+              <w:rPr>
+                <w:rFonts w:ascii="Calibri" w:hAnsi="Calibri"/>
+                <w:b w:val="0"/>
+                <w:i w:val="0"/>
+                <w:sz w:val="20"/>
+              </w:rPr>
+              <w:t>Poczekaj — plik .exe lub .msi pobierze się do folderu Pobrane.</w:t>
+            </w:r>
+          </w:p>
+          <w:p>
+            <w:pPr>
+              <w:spacing w:before="20" w:after="40"/>
+              <w:ind w:left="283" w:hanging="227"/>
+            </w:pPr>
+            <w:r>
+              <w:rPr>
+                <w:rFonts w:ascii="Calibri" w:hAnsi="Calibri"/>
+                <w:b/>
+                <w:i w:val="0"/>
+                <w:color w:val="0054A6"/>
+                <w:sz w:val="20"/>
+              </w:rPr>
+              <w:t xml:space="preserve">5.  </w:t>
+            </w:r>
+            <w:r>
+              <w:rPr>
+                <w:rFonts w:ascii="Calibri" w:hAnsi="Calibri"/>
+                <w:b w:val="0"/>
+                <w:i w:val="0"/>
+                <w:sz w:val="20"/>
+              </w:rPr>
+              <w:t>Otwórz pobrany plik (kliknij dwukrotnie).</w:t>
+            </w:r>
+          </w:p>
+          <w:p>
+            <w:pPr>
+              <w:spacing w:before="20" w:after="40"/>
+              <w:ind w:left="283" w:hanging="227"/>
+            </w:pPr>
+            <w:r>
+              <w:rPr>
+                <w:rFonts w:ascii="Calibri" w:hAnsi="Calibri"/>
+                <w:b/>
+                <w:i w:val="0"/>
+                <w:color w:val="0054A6"/>
+                <w:sz w:val="20"/>
+              </w:rPr>
+              <w:t xml:space="preserve">6.  </w:t>
+            </w:r>
+            <w:r>
+              <w:rPr>
+                <w:rFonts w:ascii="Calibri" w:hAnsi="Calibri"/>
+                <w:b w:val="0"/>
+                <w:i w:val="0"/>
+                <w:sz w:val="20"/>
+              </w:rPr>
+              <w:t>Jeśli Windows zapyta "Czy chcesz zezwolić..." — kliknij Tak.</w:t>
+            </w:r>
+          </w:p>
+          <w:p>
+            <w:pPr>
+              <w:spacing w:before="20" w:after="40"/>
+              <w:ind w:left="283" w:hanging="227"/>
+            </w:pPr>
+            <w:r>
+              <w:rPr>
+                <w:rFonts w:ascii="Calibri" w:hAnsi="Calibri"/>
+                <w:b/>
+                <w:i w:val="0"/>
+                <w:color w:val="0054A6"/>
+                <w:sz w:val="20"/>
+              </w:rPr>
+              <w:t xml:space="preserve">7.  </w:t>
+            </w:r>
+            <w:r>
+              <w:rPr>
+                <w:rFonts w:ascii="Calibri" w:hAnsi="Calibri"/>
+                <w:b w:val="0"/>
+                <w:i w:val="0"/>
+                <w:sz w:val="20"/>
+              </w:rPr>
+              <w:t>Instalator się otworzy — klikaj Dalej/Next przez kolejne ekrany.</w:t>
+            </w:r>
+          </w:p>
+          <w:p>
+            <w:pPr>
+              <w:spacing w:before="20" w:after="40"/>
+              <w:ind w:left="283" w:hanging="227"/>
+            </w:pPr>
+            <w:r>
+              <w:rPr>
+                <w:rFonts w:ascii="Calibri" w:hAnsi="Calibri"/>
+                <w:b/>
+                <w:i w:val="0"/>
+                <w:color w:val="0054A6"/>
+                <w:sz w:val="20"/>
+              </w:rPr>
+              <w:t xml:space="preserve">8.  </w:t>
+            </w:r>
+            <w:r>
+              <w:rPr>
+                <w:rFonts w:ascii="Calibri" w:hAnsi="Calibri"/>
+                <w:b w:val="0"/>
+                <w:i w:val="0"/>
+                <w:sz w:val="20"/>
+              </w:rPr>
+              <w:t>Po instalacji kliknij Windsurf na Pulpicie lub w Menu Start.</w:t>
+            </w:r>
+          </w:p>
+          <w:p>
+            <w:pPr>
+              <w:spacing w:before="80" w:after="40"/>
+              <w:jc w:val="center"/>
+            </w:pPr>
+            <w:r>
+              <w:drawing>
+                <wp:inline xmlns:a="http://schemas.openxmlformats.org/drawingml/2006/main" xmlns:pic="http://schemas.openxmlformats.org/drawingml/2006/picture">
+                  <wp:extent cx="2560320" cy="1477108"/>
+                  <wp:docPr id="2" name="Picture 2"/>
+                  <wp:cNvGraphicFramePr>
+                    <a:graphicFrameLocks noChangeAspect="1"/>
+                  </wp:cNvGraphicFramePr>
+                  <a:graphic>
+                    <a:graphicData uri="http://schemas.openxmlformats.org/drawingml/2006/picture">
+                      <pic:pic>
+                        <pic:nvPicPr>
+                          <pic:cNvPr id="0" name="tmpd8kbikua.png"/>
+                          <pic:cNvPicPr/>
+                        </pic:nvPicPr>
+                        <pic:blipFill>
+                          <a:blip r:embed="rId10"/>
+                          <a:stretch>
+                            <a:fillRect/>
+                          </a:stretch>
+                        </pic:blipFill>
+                        <pic:spPr>
+                          <a:xfrm>
+                            <a:off x="0" y="0"/>
+                            <a:ext cx="2560320" cy="1477108"/>
+                          </a:xfrm>
+                          <a:prstGeom prst="rect"/>
+                        </pic:spPr>
+                      </pic:pic>
+                    </a:graphicData>
+                  </a:graphic>
+                </wp:inline>
+              </w:drawing>
+            </w:r>
+          </w:p>
+          <w:p>
+            <w:pPr>
+              <w:spacing w:before="40" w:after="80"/>
+            </w:pPr>
+            <w:r>
+              <w:rPr>
+                <w:rFonts w:ascii="Calibri" w:hAnsi="Calibri"/>
+                <w:b w:val="0"/>
+                <w:i/>
+                <w:color w:val="646464"/>
+                <w:sz w:val="16"/>
+              </w:rPr>
+              <w:t xml:space="preserve">  Windsurf na Windowsie — Terminal (niebieski, PowerShell) otworzysz przez Terminal → New Terminal.</w:t>
+            </w:r>
+          </w:p>
+        </w:tc>
+      </w:tr>
+    </w:tbl>
     <w:p>
       <w:pPr>
         <w:spacing w:before="240" w:after="60"/>
@@ -1236,38 +1274,529 @@
           <w:color w:val="464646"/>
           <w:sz w:val="20"/>
         </w:rPr>
-        <w:t>Node.js to silnik, bez ktorego Claude nie uruchomi sie. Instaluje sie jak kazdy normalny program — kilka klikniec.</w:t>
+        <w:t>Node.js to silnik, bez którego Claude nie uruchomi się. Instaluje się jak każdy normalny program — kilka kliknięć.</w:t>
+      </w:r>
+    </w:p>
+    <w:tbl>
+      <w:tblPr>
+        <w:tblW w:type="auto" w:w="0"/>
+        <w:tblLook w:firstColumn="1" w:firstRow="1" w:lastColumn="0" w:lastRow="0" w:noHBand="0" w:noVBand="1" w:val="04A0"/>
+        <w:tblBorders>
+          <w:top w:val="none" w:sz="0" w:space="0" w:color="auto"/>
+          <w:left w:val="none" w:sz="0" w:space="0" w:color="auto"/>
+          <w:bottom w:val="none" w:sz="0" w:space="0" w:color="auto"/>
+          <w:right w:val="none" w:sz="0" w:space="0" w:color="auto"/>
+          <w:insideH w:val="none" w:sz="0" w:space="0" w:color="auto"/>
+          <w:insideV w:val="none" w:sz="0" w:space="0" w:color="auto"/>
+        </w:tblBorders>
+      </w:tblPr>
+      <w:tblGrid>
+        <w:gridCol w:w="4703"/>
+        <w:gridCol w:w="4703"/>
+      </w:tblGrid>
+      <w:tr>
+        <w:tc>
+          <w:tcPr>
+            <w:tcW w:type="dxa" w:w="4703"/>
+            <w:tcBorders>
+              <w:top w:val="none" w:sz="0" w:space="0" w:color="auto"/>
+              <w:bottom w:val="none" w:sz="0" w:space="0" w:color="auto"/>
+              <w:right w:val="none" w:sz="0" w:space="0" w:color="auto"/>
+              <w:insideV w:val="none" w:sz="0" w:space="0" w:color="auto"/>
+              <w:insideH w:val="none" w:sz="0" w:space="0" w:color="auto"/>
+              <w:left w:val="single" w:sz="8" w:space="6" w:color="999999"/>
+            </w:tcBorders>
+          </w:tcPr>
+          <w:p>
+            <w:pPr>
+              <w:spacing w:before="80" w:after="80"/>
+              <w:ind w:left="170"/>
+            </w:pPr>
+            <w:r>
+              <w:rPr>
+                <w:rFonts w:ascii="Calibri" w:hAnsi="Calibri"/>
+                <w:b/>
+                <w:i w:val="0"/>
+                <w:color w:val="505050"/>
+                <w:sz w:val="20"/>
+              </w:rPr>
+              <w:t>Na Macu:</w:t>
+            </w:r>
+          </w:p>
+          <w:p>
+            <w:pPr>
+              <w:spacing w:before="20" w:after="40"/>
+              <w:ind w:left="283" w:hanging="227"/>
+            </w:pPr>
+            <w:r>
+              <w:rPr>
+                <w:rFonts w:ascii="Calibri" w:hAnsi="Calibri"/>
+                <w:b/>
+                <w:i w:val="0"/>
+                <w:color w:val="505050"/>
+                <w:sz w:val="20"/>
+              </w:rPr>
+              <w:t xml:space="preserve">1.  </w:t>
+            </w:r>
+            <w:r>
+              <w:rPr>
+                <w:rFonts w:ascii="Calibri" w:hAnsi="Calibri"/>
+                <w:b w:val="0"/>
+                <w:i w:val="0"/>
+                <w:sz w:val="20"/>
+              </w:rPr>
+              <w:t>Wejdź na stronę: nodejs.org</w:t>
+            </w:r>
+          </w:p>
+          <w:p>
+            <w:pPr>
+              <w:spacing w:before="20" w:after="40"/>
+              <w:ind w:left="283" w:hanging="227"/>
+            </w:pPr>
+            <w:r>
+              <w:rPr>
+                <w:rFonts w:ascii="Calibri" w:hAnsi="Calibri"/>
+                <w:b/>
+                <w:i w:val="0"/>
+                <w:color w:val="505050"/>
+                <w:sz w:val="20"/>
+              </w:rPr>
+              <w:t xml:space="preserve">2.  </w:t>
+            </w:r>
+            <w:r>
+              <w:rPr>
+                <w:rFonts w:ascii="Calibri" w:hAnsi="Calibri"/>
+                <w:b w:val="0"/>
+                <w:i w:val="0"/>
+                <w:sz w:val="20"/>
+              </w:rPr>
+              <w:t>Kliknij zielony przycisk "Download Node.js (LTS)" — ten z napisem "Recommended for most users". NIE klikaj "Current".</w:t>
+            </w:r>
+          </w:p>
+          <w:p>
+            <w:pPr>
+              <w:spacing w:before="20" w:after="40"/>
+              <w:ind w:left="283" w:hanging="227"/>
+            </w:pPr>
+            <w:r>
+              <w:rPr>
+                <w:rFonts w:ascii="Calibri" w:hAnsi="Calibri"/>
+                <w:b/>
+                <w:i w:val="0"/>
+                <w:color w:val="505050"/>
+                <w:sz w:val="20"/>
+              </w:rPr>
+              <w:t xml:space="preserve">3.  </w:t>
+            </w:r>
+            <w:r>
+              <w:rPr>
+                <w:rFonts w:ascii="Calibri" w:hAnsi="Calibri"/>
+                <w:b w:val="0"/>
+                <w:i w:val="0"/>
+                <w:sz w:val="20"/>
+              </w:rPr>
+              <w:t>Plik .pkg pobierze się — poczekaj aż skończy.</w:t>
+            </w:r>
+          </w:p>
+          <w:p>
+            <w:pPr>
+              <w:spacing w:before="20" w:after="40"/>
+              <w:ind w:left="283" w:hanging="227"/>
+            </w:pPr>
+            <w:r>
+              <w:rPr>
+                <w:rFonts w:ascii="Calibri" w:hAnsi="Calibri"/>
+                <w:b/>
+                <w:i w:val="0"/>
+                <w:color w:val="505050"/>
+                <w:sz w:val="20"/>
+              </w:rPr>
+              <w:t xml:space="preserve">4.  </w:t>
+            </w:r>
+            <w:r>
+              <w:rPr>
+                <w:rFonts w:ascii="Calibri" w:hAnsi="Calibri"/>
+                <w:b w:val="0"/>
+                <w:i w:val="0"/>
+                <w:sz w:val="20"/>
+              </w:rPr>
+              <w:t>Otwórz pobrany plik (kliknij dwukrotnie).</w:t>
+            </w:r>
+          </w:p>
+          <w:p>
+            <w:pPr>
+              <w:spacing w:before="20" w:after="40"/>
+              <w:ind w:left="283" w:hanging="227"/>
+            </w:pPr>
+            <w:r>
+              <w:rPr>
+                <w:rFonts w:ascii="Calibri" w:hAnsi="Calibri"/>
+                <w:b/>
+                <w:i w:val="0"/>
+                <w:color w:val="505050"/>
+                <w:sz w:val="20"/>
+              </w:rPr>
+              <w:t xml:space="preserve">5.  </w:t>
+            </w:r>
+            <w:r>
+              <w:rPr>
+                <w:rFonts w:ascii="Calibri" w:hAnsi="Calibri"/>
+                <w:b w:val="0"/>
+                <w:i w:val="0"/>
+                <w:sz w:val="20"/>
+              </w:rPr>
+              <w:t>Klikaj "Kontynuuj" (Continue) przez każdy ekran instalatora.</w:t>
+            </w:r>
+          </w:p>
+          <w:p>
+            <w:pPr>
+              <w:spacing w:before="20" w:after="40"/>
+              <w:ind w:left="283" w:hanging="227"/>
+            </w:pPr>
+            <w:r>
+              <w:rPr>
+                <w:rFonts w:ascii="Calibri" w:hAnsi="Calibri"/>
+                <w:b/>
+                <w:i w:val="0"/>
+                <w:color w:val="505050"/>
+                <w:sz w:val="20"/>
+              </w:rPr>
+              <w:t xml:space="preserve">6.  </w:t>
+            </w:r>
+            <w:r>
+              <w:rPr>
+                <w:rFonts w:ascii="Calibri" w:hAnsi="Calibri"/>
+                <w:b w:val="0"/>
+                <w:i w:val="0"/>
+                <w:sz w:val="20"/>
+              </w:rPr>
+              <w:t>Na końcu kliknij "Zainstaluj" (Install). Mac może zapytać o hasło — wpisz swoje hasło do komputera.</w:t>
+            </w:r>
+          </w:p>
+          <w:p>
+            <w:pPr>
+              <w:spacing w:before="20" w:after="40"/>
+              <w:ind w:left="283" w:hanging="227"/>
+            </w:pPr>
+            <w:r>
+              <w:rPr>
+                <w:rFonts w:ascii="Calibri" w:hAnsi="Calibri"/>
+                <w:b/>
+                <w:i w:val="0"/>
+                <w:color w:val="505050"/>
+                <w:sz w:val="20"/>
+              </w:rPr>
+              <w:t xml:space="preserve">7.  </w:t>
+            </w:r>
+            <w:r>
+              <w:rPr>
+                <w:rFonts w:ascii="Calibri" w:hAnsi="Calibri"/>
+                <w:b w:val="0"/>
+                <w:i w:val="0"/>
+                <w:sz w:val="20"/>
+              </w:rPr>
+              <w:t>Gotowe! Możesz zamknąć instalator.</w:t>
+            </w:r>
+          </w:p>
+        </w:tc>
+        <w:tc>
+          <w:tcPr>
+            <w:tcW w:type="dxa" w:w="4703"/>
+            <w:tcBorders>
+              <w:top w:val="none" w:sz="0" w:space="0" w:color="auto"/>
+              <w:bottom w:val="none" w:sz="0" w:space="0" w:color="auto"/>
+              <w:right w:val="none" w:sz="0" w:space="0" w:color="auto"/>
+              <w:insideV w:val="none" w:sz="0" w:space="0" w:color="auto"/>
+              <w:insideH w:val="none" w:sz="0" w:space="0" w:color="auto"/>
+              <w:left w:val="single" w:sz="8" w:space="6" w:color="0078D4"/>
+            </w:tcBorders>
+          </w:tcPr>
+          <w:p>
+            <w:pPr>
+              <w:spacing w:before="80" w:after="80"/>
+              <w:ind w:left="170"/>
+            </w:pPr>
+            <w:r>
+              <w:rPr>
+                <w:rFonts w:ascii="Calibri" w:hAnsi="Calibri"/>
+                <w:b/>
+                <w:i w:val="0"/>
+                <w:color w:val="0054A6"/>
+                <w:sz w:val="20"/>
+              </w:rPr>
+              <w:t>Na Windowsie:</w:t>
+            </w:r>
+          </w:p>
+          <w:p>
+            <w:pPr>
+              <w:spacing w:before="20" w:after="40"/>
+              <w:ind w:left="283" w:hanging="227"/>
+            </w:pPr>
+            <w:r>
+              <w:rPr>
+                <w:rFonts w:ascii="Calibri" w:hAnsi="Calibri"/>
+                <w:b/>
+                <w:i w:val="0"/>
+                <w:color w:val="0054A6"/>
+                <w:sz w:val="20"/>
+              </w:rPr>
+              <w:t xml:space="preserve">1.  </w:t>
+            </w:r>
+            <w:r>
+              <w:rPr>
+                <w:rFonts w:ascii="Calibri" w:hAnsi="Calibri"/>
+                <w:b w:val="0"/>
+                <w:i w:val="0"/>
+                <w:sz w:val="20"/>
+              </w:rPr>
+              <w:t>Wejdź na stronę: nodejs.org</w:t>
+            </w:r>
+          </w:p>
+          <w:p>
+            <w:pPr>
+              <w:spacing w:before="20" w:after="40"/>
+              <w:ind w:left="283" w:hanging="227"/>
+            </w:pPr>
+            <w:r>
+              <w:rPr>
+                <w:rFonts w:ascii="Calibri" w:hAnsi="Calibri"/>
+                <w:b/>
+                <w:i w:val="0"/>
+                <w:color w:val="0054A6"/>
+                <w:sz w:val="20"/>
+              </w:rPr>
+              <w:t xml:space="preserve">2.  </w:t>
+            </w:r>
+            <w:r>
+              <w:rPr>
+                <w:rFonts w:ascii="Calibri" w:hAnsi="Calibri"/>
+                <w:b w:val="0"/>
+                <w:i w:val="0"/>
+                <w:sz w:val="20"/>
+              </w:rPr>
+              <w:t>Kliknij zielony przycisk "Download Node.js (LTS)" — ten z napisem "Recommended for most users". NIE klikaj "Current".</w:t>
+            </w:r>
+          </w:p>
+          <w:p>
+            <w:pPr>
+              <w:spacing w:before="20" w:after="40"/>
+              <w:ind w:left="283" w:hanging="227"/>
+            </w:pPr>
+            <w:r>
+              <w:rPr>
+                <w:rFonts w:ascii="Calibri" w:hAnsi="Calibri"/>
+                <w:b/>
+                <w:i w:val="0"/>
+                <w:color w:val="0054A6"/>
+                <w:sz w:val="20"/>
+              </w:rPr>
+              <w:t xml:space="preserve">3.  </w:t>
+            </w:r>
+            <w:r>
+              <w:rPr>
+                <w:rFonts w:ascii="Calibri" w:hAnsi="Calibri"/>
+                <w:b w:val="0"/>
+                <w:i w:val="0"/>
+                <w:sz w:val="20"/>
+              </w:rPr>
+              <w:t>Plik .msi pobierze się — poczekaj aż skończy.</w:t>
+            </w:r>
+          </w:p>
+          <w:p>
+            <w:pPr>
+              <w:spacing w:before="20" w:after="40"/>
+              <w:ind w:left="283" w:hanging="227"/>
+            </w:pPr>
+            <w:r>
+              <w:rPr>
+                <w:rFonts w:ascii="Calibri" w:hAnsi="Calibri"/>
+                <w:b/>
+                <w:i w:val="0"/>
+                <w:color w:val="0054A6"/>
+                <w:sz w:val="20"/>
+              </w:rPr>
+              <w:t xml:space="preserve">4.  </w:t>
+            </w:r>
+            <w:r>
+              <w:rPr>
+                <w:rFonts w:ascii="Calibri" w:hAnsi="Calibri"/>
+                <w:b w:val="0"/>
+                <w:i w:val="0"/>
+                <w:sz w:val="20"/>
+              </w:rPr>
+              <w:t>Otwórz pobrany plik (kliknij dwukrotnie).</w:t>
+            </w:r>
+          </w:p>
+          <w:p>
+            <w:pPr>
+              <w:spacing w:before="20" w:after="40"/>
+              <w:ind w:left="283" w:hanging="227"/>
+            </w:pPr>
+            <w:r>
+              <w:rPr>
+                <w:rFonts w:ascii="Calibri" w:hAnsi="Calibri"/>
+                <w:b/>
+                <w:i w:val="0"/>
+                <w:color w:val="0054A6"/>
+                <w:sz w:val="20"/>
+              </w:rPr>
+              <w:t xml:space="preserve">5.  </w:t>
+            </w:r>
+            <w:r>
+              <w:rPr>
+                <w:rFonts w:ascii="Calibri" w:hAnsi="Calibri"/>
+                <w:b w:val="0"/>
+                <w:i w:val="0"/>
+                <w:sz w:val="20"/>
+              </w:rPr>
+              <w:t>Jeśli Windows zapyta "Czy chcesz zezwolić..." — kliknij Tak.</w:t>
+            </w:r>
+          </w:p>
+          <w:p>
+            <w:pPr>
+              <w:spacing w:before="20" w:after="40"/>
+              <w:ind w:left="283" w:hanging="227"/>
+            </w:pPr>
+            <w:r>
+              <w:rPr>
+                <w:rFonts w:ascii="Calibri" w:hAnsi="Calibri"/>
+                <w:b/>
+                <w:i w:val="0"/>
+                <w:color w:val="0054A6"/>
+                <w:sz w:val="20"/>
+              </w:rPr>
+              <w:t xml:space="preserve">6.  </w:t>
+            </w:r>
+            <w:r>
+              <w:rPr>
+                <w:rFonts w:ascii="Calibri" w:hAnsi="Calibri"/>
+                <w:b w:val="0"/>
+                <w:i w:val="0"/>
+                <w:sz w:val="20"/>
+              </w:rPr>
+              <w:t>Klikaj Next przez kolejne ekrany instalatora — nic nie zmieniaj.</w:t>
+            </w:r>
+          </w:p>
+          <w:p>
+            <w:pPr>
+              <w:spacing w:before="20" w:after="40"/>
+              <w:ind w:left="283" w:hanging="227"/>
+            </w:pPr>
+            <w:r>
+              <w:rPr>
+                <w:rFonts w:ascii="Calibri" w:hAnsi="Calibri"/>
+                <w:b/>
+                <w:i w:val="0"/>
+                <w:color w:val="0054A6"/>
+                <w:sz w:val="20"/>
+              </w:rPr>
+              <w:t xml:space="preserve">7.  </w:t>
+            </w:r>
+            <w:r>
+              <w:rPr>
+                <w:rFonts w:ascii="Calibri" w:hAnsi="Calibri"/>
+                <w:b w:val="0"/>
+                <w:i w:val="0"/>
+                <w:sz w:val="20"/>
+              </w:rPr>
+              <w:t>Na końcu kliknij Install. Może zapytać o hasło/zgodę administratora.</w:t>
+            </w:r>
+          </w:p>
+          <w:p>
+            <w:pPr>
+              <w:spacing w:before="20" w:after="40"/>
+              <w:ind w:left="283" w:hanging="227"/>
+            </w:pPr>
+            <w:r>
+              <w:rPr>
+                <w:rFonts w:ascii="Calibri" w:hAnsi="Calibri"/>
+                <w:b/>
+                <w:i w:val="0"/>
+                <w:color w:val="0054A6"/>
+                <w:sz w:val="20"/>
+              </w:rPr>
+              <w:t xml:space="preserve">8.  </w:t>
+            </w:r>
+            <w:r>
+              <w:rPr>
+                <w:rFonts w:ascii="Calibri" w:hAnsi="Calibri"/>
+                <w:b w:val="0"/>
+                <w:i w:val="0"/>
+                <w:sz w:val="20"/>
+              </w:rPr>
+              <w:t>Gotowe! Możesz zamknąć instalator.</w:t>
+            </w:r>
+          </w:p>
+        </w:tc>
+      </w:tr>
+    </w:tbl>
+    <w:p>
+      <w:pPr>
+        <w:spacing w:before="240" w:after="60"/>
+      </w:pPr>
+      <w:r>
+        <w:fldChar w:fldCharType="begin">
+          <w:ffData>
+            <w:name w:val=""/>
+            <w:enabled/>
+            <w:calcOnExit w:val="0"/>
+            <w:checkBox>
+              <w:sizeAuto/>
+              <w:default w:val="0"/>
+              <w:checked w:val="0"/>
+            </w:checkBox>
+          </w:ffData>
+        </w:fldChar>
+      </w:r>
+      <w:r>
+        <w:instrText xml:space="preserve"> FORMCHECKBOX </w:instrText>
+      </w:r>
+      <w:r>
+        <w:fldChar w:fldCharType="separate"/>
+      </w:r>
+      <w:r>
+        <w:fldChar w:fldCharType="end"/>
+      </w:r>
+      <w:r>
+        <w:t xml:space="preserve">  </w:t>
+      </w:r>
+      <w:r>
+        <w:rPr>
+          <w:rFonts w:ascii="Calibri" w:hAnsi="Calibri"/>
+          <w:b/>
+          <w:i w:val="0"/>
+          <w:sz w:val="24"/>
+        </w:rPr>
+        <w:t>Krok 3 — Otwórz terminal w Windsurf i wpisz jedną komendę</w:t>
       </w:r>
     </w:p>
     <w:p>
       <w:pPr>
-        <w:spacing w:before="80" w:after="40"/>
-        <w:ind w:left="850"/>
-        <w:pBdr>
-          <w:left w:val="single" w:sz="8" w:space="6" w:color="999999"/>
-        </w:pBdr>
+        <w:spacing w:before="40" w:after="80"/>
+        <w:ind w:left="680"/>
+      </w:pPr>
+      <w:r>
+        <w:rPr>
+          <w:rFonts w:ascii="Calibri" w:hAnsi="Calibri"/>
+          <w:b w:val="0"/>
+          <w:i w:val="0"/>
+          <w:color w:val="464646"/>
+          <w:sz w:val="20"/>
+        </w:rPr>
+        <w:t>Terminal to okienko, w którym wpisujesz polecenia. W Windsurf jest ukryte na dole ekranu — pokażemy Ci jak je otworzyć.</w:t>
+      </w:r>
+    </w:p>
+    <w:p>
+      <w:pPr>
+        <w:spacing w:before="20" w:after="40"/>
+        <w:ind w:left="850" w:hanging="227"/>
       </w:pPr>
       <w:r>
         <w:rPr>
           <w:rFonts w:ascii="Calibri" w:hAnsi="Calibri"/>
           <w:b/>
           <w:i w:val="0"/>
-          <w:sz w:val="20"/>
-        </w:rPr>
-        <w:t>Na Macu:</w:t>
-      </w:r>
-    </w:p>
-    <w:p>
-      <w:pPr>
-        <w:spacing w:before="20" w:after="40"/>
-        <w:ind w:left="1247" w:hanging="227"/>
-      </w:pPr>
-      <w:r>
-        <w:rPr>
-          <w:rFonts w:ascii="Calibri" w:hAnsi="Calibri"/>
-          <w:b/>
-          <w:i w:val="0"/>
-          <w:color w:val="505050"/>
+          <w:color w:val="1F497D"/>
           <w:sz w:val="20"/>
         </w:rPr>
         <w:t xml:space="preserve">1.  </w:t>
@@ -1279,20 +1808,20 @@
           <w:i w:val="0"/>
           <w:sz w:val="20"/>
         </w:rPr>
-        <w:t>Wejdz na strone: nodejs.org</w:t>
+        <w:t>Uruchom Windsurf (jeśli jeszcze nie jest otwarty).</w:t>
       </w:r>
     </w:p>
     <w:p>
       <w:pPr>
         <w:spacing w:before="20" w:after="40"/>
-        <w:ind w:left="1247" w:hanging="227"/>
+        <w:ind w:left="850" w:hanging="227"/>
       </w:pPr>
       <w:r>
         <w:rPr>
           <w:rFonts w:ascii="Calibri" w:hAnsi="Calibri"/>
           <w:b/>
           <w:i w:val="0"/>
-          <w:color w:val="505050"/>
+          <w:color w:val="1F497D"/>
           <w:sz w:val="20"/>
         </w:rPr>
         <w:t xml:space="preserve">2.  </w:t>
@@ -1304,20 +1833,20 @@
           <w:i w:val="0"/>
           <w:sz w:val="20"/>
         </w:rPr>
-        <w:t>Kliknij zielony przycisk "Download Node.js (LTS)" — ten z napisem "Recommended for most users". NIE klikaj "Current".</w:t>
+        <w:t>W górnym menu kliknij "Terminal" a potem "New Terminal". Ewentualnie naciśnij klawisze Ctrl + ` (tylny apostrof — klawisz obok cyfry 1 na klawiaturze).</w:t>
       </w:r>
     </w:p>
     <w:p>
       <w:pPr>
         <w:spacing w:before="20" w:after="40"/>
-        <w:ind w:left="1247" w:hanging="227"/>
+        <w:ind w:left="850" w:hanging="227"/>
       </w:pPr>
       <w:r>
         <w:rPr>
           <w:rFonts w:ascii="Calibri" w:hAnsi="Calibri"/>
           <w:b/>
           <w:i w:val="0"/>
-          <w:color w:val="505050"/>
+          <w:color w:val="1F497D"/>
           <w:sz w:val="20"/>
         </w:rPr>
         <w:t xml:space="preserve">3.  </w:t>
@@ -1329,20 +1858,20 @@
           <w:i w:val="0"/>
           <w:sz w:val="20"/>
         </w:rPr>
-        <w:t>Plik .pkg pobierze sie — poczekaj az skonczy.</w:t>
+        <w:t>Na dole ekranu pojawi się ciemne okienko z kursorem — to terminal.</w:t>
       </w:r>
     </w:p>
     <w:p>
       <w:pPr>
         <w:spacing w:before="20" w:after="40"/>
-        <w:ind w:left="1247" w:hanging="227"/>
+        <w:ind w:left="850" w:hanging="227"/>
       </w:pPr>
       <w:r>
         <w:rPr>
           <w:rFonts w:ascii="Calibri" w:hAnsi="Calibri"/>
           <w:b/>
           <w:i w:val="0"/>
-          <w:color w:val="505050"/>
+          <w:color w:val="1F497D"/>
           <w:sz w:val="20"/>
         </w:rPr>
         <w:t xml:space="preserve">4.  </w:t>
@@ -1354,20 +1883,20 @@
           <w:i w:val="0"/>
           <w:sz w:val="20"/>
         </w:rPr>
-        <w:t>Otworz pobrany plik (kliknij dwukrotnie).</w:t>
+        <w:t>Kliknij w to okienko żeby je zaznaczyć.</w:t>
       </w:r>
     </w:p>
     <w:p>
       <w:pPr>
         <w:spacing w:before="20" w:after="40"/>
-        <w:ind w:left="1247" w:hanging="227"/>
+        <w:ind w:left="850" w:hanging="227"/>
       </w:pPr>
       <w:r>
         <w:rPr>
           <w:rFonts w:ascii="Calibri" w:hAnsi="Calibri"/>
           <w:b/>
           <w:i w:val="0"/>
-          <w:color w:val="505050"/>
+          <w:color w:val="1F497D"/>
           <w:sz w:val="20"/>
         </w:rPr>
         <w:t xml:space="preserve">5.  </w:t>
@@ -1379,20 +1908,20 @@
           <w:i w:val="0"/>
           <w:sz w:val="20"/>
         </w:rPr>
-        <w:t>Klikaj "Kontynuuj" (Continue) przez kazdy ekran instalatora.</w:t>
+        <w:t>Wpisz dokładnie tę komendę i naciśnij Enter: npm install -g @anthropic-ai/claude-code</w:t>
       </w:r>
     </w:p>
     <w:p>
       <w:pPr>
         <w:spacing w:before="20" w:after="40"/>
-        <w:ind w:left="1247" w:hanging="227"/>
+        <w:ind w:left="850" w:hanging="227"/>
       </w:pPr>
       <w:r>
         <w:rPr>
           <w:rFonts w:ascii="Calibri" w:hAnsi="Calibri"/>
           <w:b/>
           <w:i w:val="0"/>
-          <w:color w:val="505050"/>
+          <w:color w:val="1F497D"/>
           <w:sz w:val="20"/>
         </w:rPr>
         <w:t xml:space="preserve">6.  </w:t>
@@ -1404,20 +1933,20 @@
           <w:i w:val="0"/>
           <w:sz w:val="20"/>
         </w:rPr>
-        <w:t>Na koncu kliknij "Zainstaluj" (Install). Mac moze zapytac o haslo — wpisz swoje haslo do komputera.</w:t>
+        <w:t>Poczekaj — może trwać 1-3 minuty. Zobaczysz dużo tekstu — to normalne.</w:t>
       </w:r>
     </w:p>
     <w:p>
       <w:pPr>
         <w:spacing w:before="20" w:after="40"/>
-        <w:ind w:left="1247" w:hanging="227"/>
+        <w:ind w:left="850" w:hanging="227"/>
       </w:pPr>
       <w:r>
         <w:rPr>
           <w:rFonts w:ascii="Calibri" w:hAnsi="Calibri"/>
           <w:b/>
           <w:i w:val="0"/>
-          <w:color w:val="505050"/>
+          <w:color w:val="1F497D"/>
           <w:sz w:val="20"/>
         </w:rPr>
         <w:t xml:space="preserve">7.  </w:t>
@@ -1429,7 +1958,73 @@
           <w:i w:val="0"/>
           <w:sz w:val="20"/>
         </w:rPr>
-        <w:t>Gotowe! Mozesz zamknac instalator.</w:t>
+        <w:t>Gdy skończy, pojawi się nowa linia z kursorem — to znak że gotowe.</w:t>
+      </w:r>
+    </w:p>
+    <w:p>
+      <w:pPr>
+        <w:spacing w:before="20" w:after="40"/>
+        <w:ind w:left="850" w:hanging="227"/>
+      </w:pPr>
+      <w:r>
+        <w:rPr>
+          <w:rFonts w:ascii="Calibri" w:hAnsi="Calibri"/>
+          <w:b/>
+          <w:i w:val="0"/>
+          <w:color w:val="1F497D"/>
+          <w:sz w:val="20"/>
+        </w:rPr>
+        <w:t xml:space="preserve">8.  </w:t>
+      </w:r>
+      <w:r>
+        <w:rPr>
+          <w:rFonts w:ascii="Calibri" w:hAnsi="Calibri"/>
+          <w:b w:val="0"/>
+          <w:i w:val="0"/>
+          <w:sz w:val="20"/>
+        </w:rPr>
+        <w:t>UWAGA dla Windows: zamiast zsh zobaczysz PowerShell (niebieski tekst) — to normalne, komenda działa tak samo.</w:t>
+      </w:r>
+    </w:p>
+    <w:p>
+      <w:pPr>
+        <w:spacing w:before="120" w:after="40"/>
+        <w:ind w:left="680"/>
+        <w:jc w:val="center"/>
+      </w:pPr>
+      <w:r>
+        <w:drawing>
+          <wp:inline xmlns:a="http://schemas.openxmlformats.org/drawingml/2006/main" xmlns:pic="http://schemas.openxmlformats.org/drawingml/2006/picture">
+            <wp:extent cx="4572000" cy="1178169"/>
+            <wp:docPr id="3" name="Picture 3"/>
+            <wp:cNvGraphicFramePr>
+              <a:graphicFrameLocks noChangeAspect="1"/>
+            </wp:cNvGraphicFramePr>
+            <a:graphic>
+              <a:graphicData uri="http://schemas.openxmlformats.org/drawingml/2006/picture">
+                <pic:pic>
+                  <pic:nvPicPr>
+                    <pic:cNvPr id="0" name="tmp963o3lfq.png"/>
+                    <pic:cNvPicPr/>
+                  </pic:nvPicPr>
+                  <pic:blipFill>
+                    <a:blip r:embed="rId11"/>
+                    <a:stretch>
+                      <a:fillRect/>
+                    </a:stretch>
+                  </pic:blipFill>
+                  <pic:spPr>
+                    <a:xfrm>
+                      <a:off x="0" y="0"/>
+                      <a:ext cx="4572000" cy="1178169"/>
+                    </a:xfrm>
+                    <a:prstGeom prst="rect"/>
+                  </pic:spPr>
+                </pic:pic>
+              </a:graphicData>
+            </a:graphic>
+          </wp:inline>
+        </w:drawing>
       </w:r>
     </w:p>
     <w:p>
@@ -1445,225 +2040,7 @@
           <w:color w:val="646464"/>
           <w:sz w:val="18"/>
         </w:rPr>
-        <w:t xml:space="preserve">  Strona nodejs.org — kliknij zielony przycisk LTS (ten po lewej).</w:t>
-      </w:r>
-    </w:p>
-    <w:p>
-      <w:pPr>
-        <w:spacing w:before="80" w:after="40"/>
-        <w:ind w:left="850"/>
-        <w:pBdr>
-          <w:left w:val="single" w:sz="8" w:space="6" w:color="0078D4"/>
-        </w:pBdr>
-      </w:pPr>
-      <w:r>
-        <w:rPr>
-          <w:rFonts w:ascii="Calibri" w:hAnsi="Calibri"/>
-          <w:b/>
-          <w:i w:val="0"/>
-          <w:sz w:val="20"/>
-        </w:rPr>
-        <w:t>Na Windowsie:</w:t>
-      </w:r>
-    </w:p>
-    <w:p>
-      <w:pPr>
-        <w:spacing w:before="20" w:after="40"/>
-        <w:ind w:left="1247" w:hanging="227"/>
-      </w:pPr>
-      <w:r>
-        <w:rPr>
-          <w:rFonts w:ascii="Calibri" w:hAnsi="Calibri"/>
-          <w:b/>
-          <w:i w:val="0"/>
-          <w:color w:val="0054A6"/>
-          <w:sz w:val="20"/>
-        </w:rPr>
-        <w:t xml:space="preserve">1.  </w:t>
-      </w:r>
-      <w:r>
-        <w:rPr>
-          <w:rFonts w:ascii="Calibri" w:hAnsi="Calibri"/>
-          <w:b w:val="0"/>
-          <w:i w:val="0"/>
-          <w:sz w:val="20"/>
-        </w:rPr>
-        <w:t>Wejdz na strone: nodejs.org</w:t>
-      </w:r>
-    </w:p>
-    <w:p>
-      <w:pPr>
-        <w:spacing w:before="20" w:after="40"/>
-        <w:ind w:left="1247" w:hanging="227"/>
-      </w:pPr>
-      <w:r>
-        <w:rPr>
-          <w:rFonts w:ascii="Calibri" w:hAnsi="Calibri"/>
-          <w:b/>
-          <w:i w:val="0"/>
-          <w:color w:val="0054A6"/>
-          <w:sz w:val="20"/>
-        </w:rPr>
-        <w:t xml:space="preserve">2.  </w:t>
-      </w:r>
-      <w:r>
-        <w:rPr>
-          <w:rFonts w:ascii="Calibri" w:hAnsi="Calibri"/>
-          <w:b w:val="0"/>
-          <w:i w:val="0"/>
-          <w:sz w:val="20"/>
-        </w:rPr>
-        <w:t>Kliknij zielony przycisk "Download Node.js (LTS)" — ten z napisem "Recommended for most users". NIE klikaj "Current".</w:t>
-      </w:r>
-    </w:p>
-    <w:p>
-      <w:pPr>
-        <w:spacing w:before="20" w:after="40"/>
-        <w:ind w:left="1247" w:hanging="227"/>
-      </w:pPr>
-      <w:r>
-        <w:rPr>
-          <w:rFonts w:ascii="Calibri" w:hAnsi="Calibri"/>
-          <w:b/>
-          <w:i w:val="0"/>
-          <w:color w:val="0054A6"/>
-          <w:sz w:val="20"/>
-        </w:rPr>
-        <w:t xml:space="preserve">3.  </w:t>
-      </w:r>
-      <w:r>
-        <w:rPr>
-          <w:rFonts w:ascii="Calibri" w:hAnsi="Calibri"/>
-          <w:b w:val="0"/>
-          <w:i w:val="0"/>
-          <w:sz w:val="20"/>
-        </w:rPr>
-        <w:t>Plik .msi pobierze sie — poczekaj az skonczy.</w:t>
-      </w:r>
-    </w:p>
-    <w:p>
-      <w:pPr>
-        <w:spacing w:before="20" w:after="40"/>
-        <w:ind w:left="1247" w:hanging="227"/>
-      </w:pPr>
-      <w:r>
-        <w:rPr>
-          <w:rFonts w:ascii="Calibri" w:hAnsi="Calibri"/>
-          <w:b/>
-          <w:i w:val="0"/>
-          <w:color w:val="0054A6"/>
-          <w:sz w:val="20"/>
-        </w:rPr>
-        <w:t xml:space="preserve">4.  </w:t>
-      </w:r>
-      <w:r>
-        <w:rPr>
-          <w:rFonts w:ascii="Calibri" w:hAnsi="Calibri"/>
-          <w:b w:val="0"/>
-          <w:i w:val="0"/>
-          <w:sz w:val="20"/>
-        </w:rPr>
-        <w:t>Otworz pobrany plik (kliknij dwukrotnie).</w:t>
-      </w:r>
-    </w:p>
-    <w:p>
-      <w:pPr>
-        <w:spacing w:before="20" w:after="40"/>
-        <w:ind w:left="1247" w:hanging="227"/>
-      </w:pPr>
-      <w:r>
-        <w:rPr>
-          <w:rFonts w:ascii="Calibri" w:hAnsi="Calibri"/>
-          <w:b/>
-          <w:i w:val="0"/>
-          <w:color w:val="0054A6"/>
-          <w:sz w:val="20"/>
-        </w:rPr>
-        <w:t xml:space="preserve">5.  </w:t>
-      </w:r>
-      <w:r>
-        <w:rPr>
-          <w:rFonts w:ascii="Calibri" w:hAnsi="Calibri"/>
-          <w:b w:val="0"/>
-          <w:i w:val="0"/>
-          <w:sz w:val="20"/>
-        </w:rPr>
-        <w:t>Jesli Windows zapyta "Czy chcesz zezwolic..." — kliknij Tak.</w:t>
-      </w:r>
-    </w:p>
-    <w:p>
-      <w:pPr>
-        <w:spacing w:before="20" w:after="40"/>
-        <w:ind w:left="1247" w:hanging="227"/>
-      </w:pPr>
-      <w:r>
-        <w:rPr>
-          <w:rFonts w:ascii="Calibri" w:hAnsi="Calibri"/>
-          <w:b/>
-          <w:i w:val="0"/>
-          <w:color w:val="0054A6"/>
-          <w:sz w:val="20"/>
-        </w:rPr>
-        <w:t xml:space="preserve">6.  </w:t>
-      </w:r>
-      <w:r>
-        <w:rPr>
-          <w:rFonts w:ascii="Calibri" w:hAnsi="Calibri"/>
-          <w:b w:val="0"/>
-          <w:i w:val="0"/>
-          <w:sz w:val="20"/>
-        </w:rPr>
-        <w:t>Klikaj Next przez kolejne ekrany instalatora — nic nie zmieniaj.</w:t>
-      </w:r>
-    </w:p>
-    <w:p>
-      <w:pPr>
-        <w:spacing w:before="20" w:after="40"/>
-        <w:ind w:left="1247" w:hanging="227"/>
-      </w:pPr>
-      <w:r>
-        <w:rPr>
-          <w:rFonts w:ascii="Calibri" w:hAnsi="Calibri"/>
-          <w:b/>
-          <w:i w:val="0"/>
-          <w:color w:val="0054A6"/>
-          <w:sz w:val="20"/>
-        </w:rPr>
-        <w:t xml:space="preserve">7.  </w:t>
-      </w:r>
-      <w:r>
-        <w:rPr>
-          <w:rFonts w:ascii="Calibri" w:hAnsi="Calibri"/>
-          <w:b w:val="0"/>
-          <w:i w:val="0"/>
-          <w:sz w:val="20"/>
-        </w:rPr>
-        <w:t>Na koncu kliknij Install. Moze zapytac o haslo/zgode administratora.</w:t>
-      </w:r>
-    </w:p>
-    <w:p>
-      <w:pPr>
-        <w:spacing w:before="20" w:after="40"/>
-        <w:ind w:left="1247" w:hanging="227"/>
-      </w:pPr>
-      <w:r>
-        <w:rPr>
-          <w:rFonts w:ascii="Calibri" w:hAnsi="Calibri"/>
-          <w:b/>
-          <w:i w:val="0"/>
-          <w:color w:val="0054A6"/>
-          <w:sz w:val="20"/>
-        </w:rPr>
-        <w:t xml:space="preserve">8.  </w:t>
-      </w:r>
-      <w:r>
-        <w:rPr>
-          <w:rFonts w:ascii="Calibri" w:hAnsi="Calibri"/>
-          <w:b w:val="0"/>
-          <w:i w:val="0"/>
-          <w:sz w:val="20"/>
-        </w:rPr>
-        <w:t>Gotowe! Mozesz zamknac instalator.</w:t>
+        <w:t xml:space="preserve">  Mac: ciemny terminal z zielonym tekstem po zainstalowaniu.</w:t>
       </w:r>
     </w:p>
     <w:p>
@@ -1703,7 +2080,7 @@
           <w:i w:val="0"/>
           <w:sz w:val="24"/>
         </w:rPr>
-        <w:t>Krok 3 — Otworz terminal w Windsurf i wpisz jedna komende</w:t>
+        <w:t>Krok 4 — Otwórz folder Onboarding w Windsurf</w:t>
       </w:r>
     </w:p>
     <w:p>
@@ -1719,7 +2096,7 @@
           <w:color w:val="464646"/>
           <w:sz w:val="20"/>
         </w:rPr>
-        <w:t>Terminal to okienko, w ktorym wpisujesz polecenia. W Windsurf jest ukryte na dole ekranu — pokarzemy Ci jak je otworzyc.</w:t>
+        <w:t>Musisz wskazać Windsurfowi folder z plikami onboardingowymi — ten sam folder, z którego czytasz ten dokument.</w:t>
       </w:r>
     </w:p>
     <w:p>
@@ -1744,7 +2121,7 @@
           <w:i w:val="0"/>
           <w:sz w:val="20"/>
         </w:rPr>
-        <w:t>Uruchom Windsurf (jesli jeszcze nie jest otwarty).</w:t>
+        <w:t>W Windsurf kliknij "File" w górnym menu.</w:t>
       </w:r>
     </w:p>
     <w:p>
@@ -1769,7 +2146,7 @@
           <w:i w:val="0"/>
           <w:sz w:val="20"/>
         </w:rPr>
-        <w:t>W gornym menu kliknij "Terminal" a potem "New Terminal". Ewentualnie nacisnij klawisze Ctrl + ` (tylni apostrof — klawisz obok cyfry 1 na klawiaturze).</w:t>
+        <w:t>Kliknij "Open Folder..." (Otwórz folder).</w:t>
       </w:r>
     </w:p>
     <w:p>
@@ -1794,7 +2171,7 @@
           <w:i w:val="0"/>
           <w:sz w:val="20"/>
         </w:rPr>
-        <w:t>Na dole ekranu pojawi sie ciemne okienko z kursorem — to terminal.</w:t>
+        <w:t>Pojawi się okienko do wyboru folderu — znajdź i zaznacz folder "Onboarding".</w:t>
       </w:r>
     </w:p>
     <w:p>
@@ -1819,7 +2196,7 @@
           <w:i w:val="0"/>
           <w:sz w:val="20"/>
         </w:rPr>
-        <w:t>Kliknij w to okienko zeby je zaznaczyc.</w:t>
+        <w:t>Kliknij przycisk "Open" (lub "Otwórz") na dole okienka.</w:t>
       </w:r>
     </w:p>
     <w:p>
@@ -1844,82 +2221,7 @@
           <w:i w:val="0"/>
           <w:sz w:val="20"/>
         </w:rPr>
-        <w:t>Wpisz dokladnie te komende i nacisnij Enter: npm install -g @anthropic-ai/claude-code</w:t>
-      </w:r>
-    </w:p>
-    <w:p>
-      <w:pPr>
-        <w:spacing w:before="20" w:after="40"/>
-        <w:ind w:left="850" w:hanging="227"/>
-      </w:pPr>
-      <w:r>
-        <w:rPr>
-          <w:rFonts w:ascii="Calibri" w:hAnsi="Calibri"/>
-          <w:b/>
-          <w:i w:val="0"/>
-          <w:color w:val="1F497D"/>
-          <w:sz w:val="20"/>
-        </w:rPr>
-        <w:t xml:space="preserve">6.  </w:t>
-      </w:r>
-      <w:r>
-        <w:rPr>
-          <w:rFonts w:ascii="Calibri" w:hAnsi="Calibri"/>
-          <w:b w:val="0"/>
-          <w:i w:val="0"/>
-          <w:sz w:val="20"/>
-        </w:rPr>
-        <w:t>Poczekaj — moze trwac 1-3 minuty. Zobaczysz duzo tekstu — to normalne.</w:t>
-      </w:r>
-    </w:p>
-    <w:p>
-      <w:pPr>
-        <w:spacing w:before="20" w:after="40"/>
-        <w:ind w:left="850" w:hanging="227"/>
-      </w:pPr>
-      <w:r>
-        <w:rPr>
-          <w:rFonts w:ascii="Calibri" w:hAnsi="Calibri"/>
-          <w:b/>
-          <w:i w:val="0"/>
-          <w:color w:val="1F497D"/>
-          <w:sz w:val="20"/>
-        </w:rPr>
-        <w:t xml:space="preserve">7.  </w:t>
-      </w:r>
-      <w:r>
-        <w:rPr>
-          <w:rFonts w:ascii="Calibri" w:hAnsi="Calibri"/>
-          <w:b w:val="0"/>
-          <w:i w:val="0"/>
-          <w:sz w:val="20"/>
-        </w:rPr>
-        <w:t>Gdy skonczy, pojawi sie nowa linia z kursorem — to znak ze gotowe.</w:t>
-      </w:r>
-    </w:p>
-    <w:p>
-      <w:pPr>
-        <w:spacing w:before="20" w:after="40"/>
-        <w:ind w:left="850" w:hanging="227"/>
-      </w:pPr>
-      <w:r>
-        <w:rPr>
-          <w:rFonts w:ascii="Calibri" w:hAnsi="Calibri"/>
-          <w:b/>
-          <w:i w:val="0"/>
-          <w:color w:val="1F497D"/>
-          <w:sz w:val="20"/>
-        </w:rPr>
-        <w:t xml:space="preserve">8.  </w:t>
-      </w:r>
-      <w:r>
-        <w:rPr>
-          <w:rFonts w:ascii="Calibri" w:hAnsi="Calibri"/>
-          <w:b w:val="0"/>
-          <w:i w:val="0"/>
-          <w:sz w:val="20"/>
-        </w:rPr>
-        <w:t>UWAGA dla Windows: zamiast zsh zobaczysz PowerShell (niebieski tekst) — to normalne, komenda dziala tak samo.</w:t>
+        <w:t>Po lewej stronie Windsurf pojawi się lista plików z folderu Onboarding — to znak że zadziałało.</w:t>
       </w:r>
     </w:p>
     <w:p>
@@ -1959,7 +2261,7 @@
           <w:i w:val="0"/>
           <w:sz w:val="24"/>
         </w:rPr>
-        <w:t>Krok 4 — Otworz folder Onboarding w Windsurf</w:t>
+        <w:t>Krok 5 — Uruchom Claude i zaloguj się</w:t>
       </w:r>
     </w:p>
     <w:p>
@@ -1975,7 +2277,7 @@
           <w:color w:val="464646"/>
           <w:sz w:val="20"/>
         </w:rPr>
-        <w:t>Musisz wskazac Windsurfowi folder z plikami onboardingowymi — ten sam folder, z ktorego czytasz ten dokument.</w:t>
+        <w:t>Teraz uruchamiamy samego Claude — asystenta AI. Przy pierwszym uruchomieniu otworzy się przeglądarka żebyś się zalogował.</w:t>
       </w:r>
     </w:p>
     <w:p>
@@ -2000,7 +2302,7 @@
           <w:i w:val="0"/>
           <w:sz w:val="20"/>
         </w:rPr>
-        <w:t>W Windsurf kliknij "File" w gornym menu.</w:t>
+        <w:t>W ciemnym okienku (terminal) na dole Windsurf kliknij żeby je zaznaczyć.</w:t>
       </w:r>
     </w:p>
     <w:p>
@@ -2025,7 +2327,7 @@
           <w:i w:val="0"/>
           <w:sz w:val="20"/>
         </w:rPr>
-        <w:t>Kliknij "Open Folder..." (Otworz folder).</w:t>
+        <w:t>Wpisz: claude  i naciśnij Enter.</w:t>
       </w:r>
     </w:p>
     <w:p>
@@ -2050,7 +2352,7 @@
           <w:i w:val="0"/>
           <w:sz w:val="20"/>
         </w:rPr>
-        <w:t>Pojawi sie okienko do wyboru folderu — znajdz i zaznacz folder "Onboarding".</w:t>
+        <w:t>Claude może zapytać o zgodę na uruchomienie — jeśli zobaczysz pytanie, wpisz Y i Enter.</w:t>
       </w:r>
     </w:p>
     <w:p>
@@ -2075,7 +2377,7 @@
           <w:i w:val="0"/>
           <w:sz w:val="20"/>
         </w:rPr>
-        <w:t>Kliknij przycisk "Open" (lub "Otworz") na dole okienka.</w:t>
+        <w:t>Automatycznie otworzy się przeglądarka z prośbą o zalogowanie. Jeśli nie masz konta Anthropic — kliknij "Sign up" i utwórz je teraz (bezpłatne). Jeśli masz — zaloguj się normalnie.</w:t>
       </w:r>
     </w:p>
     <w:p>
@@ -2100,7 +2402,89 @@
           <w:i w:val="0"/>
           <w:sz w:val="20"/>
         </w:rPr>
-        <w:t>Po lewej stronie Windsurf pojawi sie lista plikow z folderu Onboarding — to znak ze zadzialalo.</w:t>
+        <w:t>Po zalogowaniu wróć do Windsurf — zostaw przeglądarkę otwartą.</w:t>
+      </w:r>
+    </w:p>
+    <w:p>
+      <w:pPr>
+        <w:spacing w:before="20" w:after="40"/>
+        <w:ind w:left="850" w:hanging="227"/>
+      </w:pPr>
+      <w:r>
+        <w:rPr>
+          <w:rFonts w:ascii="Calibri" w:hAnsi="Calibri"/>
+          <w:b/>
+          <w:i w:val="0"/>
+          <w:color w:val="1F497D"/>
+          <w:sz w:val="20"/>
+        </w:rPr>
+        <w:t xml:space="preserve">6.  </w:t>
+      </w:r>
+      <w:r>
+        <w:rPr>
+          <w:rFonts w:ascii="Calibri" w:hAnsi="Calibri"/>
+          <w:b w:val="0"/>
+          <w:i w:val="0"/>
+          <w:sz w:val="20"/>
+        </w:rPr>
+        <w:t>W terminalu zobaczysz że Claude czeka — pojawi się coś w stylu: "Claude Code &gt;"</w:t>
+      </w:r>
+    </w:p>
+    <w:p>
+      <w:pPr>
+        <w:spacing w:before="120" w:after="40"/>
+        <w:ind w:left="680"/>
+        <w:jc w:val="center"/>
+      </w:pPr>
+      <w:r>
+        <w:drawing>
+          <wp:inline xmlns:a="http://schemas.openxmlformats.org/drawingml/2006/main" xmlns:pic="http://schemas.openxmlformats.org/drawingml/2006/picture">
+            <wp:extent cx="4572000" cy="1178169"/>
+            <wp:docPr id="4" name="Picture 4"/>
+            <wp:cNvGraphicFramePr>
+              <a:graphicFrameLocks noChangeAspect="1"/>
+            </wp:cNvGraphicFramePr>
+            <a:graphic>
+              <a:graphicData uri="http://schemas.openxmlformats.org/drawingml/2006/picture">
+                <pic:pic>
+                  <pic:nvPicPr>
+                    <pic:cNvPr id="0" name="tmppqk1p2su.png"/>
+                    <pic:cNvPicPr/>
+                  </pic:nvPicPr>
+                  <pic:blipFill>
+                    <a:blip r:embed="rId12"/>
+                    <a:stretch>
+                      <a:fillRect/>
+                    </a:stretch>
+                  </pic:blipFill>
+                  <pic:spPr>
+                    <a:xfrm>
+                      <a:off x="0" y="0"/>
+                      <a:ext cx="4572000" cy="1178169"/>
+                    </a:xfrm>
+                    <a:prstGeom prst="rect"/>
+                  </pic:spPr>
+                </pic:pic>
+              </a:graphicData>
+            </a:graphic>
+          </wp:inline>
+        </w:drawing>
+      </w:r>
+    </w:p>
+    <w:p>
+      <w:pPr>
+        <w:spacing w:before="40" w:after="120"/>
+        <w:ind w:left="680"/>
+      </w:pPr>
+      <w:r>
+        <w:rPr>
+          <w:rFonts w:ascii="Calibri" w:hAnsi="Calibri"/>
+          <w:b w:val="0"/>
+          <w:i/>
+          <w:color w:val="646464"/>
+          <w:sz w:val="18"/>
+        </w:rPr>
+        <w:t xml:space="preserve">  Tak wygląda uruchomiony Claude w terminalu Windsurf.</w:t>
       </w:r>
     </w:p>
     <w:p>
@@ -2140,7 +2524,7 @@
           <w:i w:val="0"/>
           <w:sz w:val="24"/>
         </w:rPr>
-        <w:t>Krok 5 — Uruchom Claude i zaloguj sie</w:t>
+        <w:t>Krok 6 — Wklej prompt z Części 2 — Claude zajmie się resztą!</w:t>
       </w:r>
     </w:p>
     <w:p>
@@ -2156,7 +2540,7 @@
           <w:color w:val="464646"/>
           <w:sz w:val="20"/>
         </w:rPr>
-        <w:t>Teraz uruchamiamy samego Claude — asystenta AI. Przy pierwszym uruchomieniu otworzy sie przegladarka zebys sie zalogowal.</w:t>
+        <w:t>To ostatni krok który robisz sam. Dajesz Claude instrukcje i od tej chwili on prowadzi Cię przez całą konfigurację — po polsku, krok po kroku, czekając aż każdy krok zrobisz.</w:t>
       </w:r>
     </w:p>
     <w:p>
@@ -2181,7 +2565,7 @@
           <w:i w:val="0"/>
           <w:sz w:val="20"/>
         </w:rPr>
-        <w:t>W ciemnym okienku (terminal) na dole Windsurf kliknij zeby je zaznaczyc.</w:t>
+        <w:t>Przejdź na następną stronę tego dokumentu.</w:t>
       </w:r>
     </w:p>
     <w:p>
@@ -2206,270 +2590,7 @@
           <w:i w:val="0"/>
           <w:sz w:val="20"/>
         </w:rPr>
-        <w:t>Wpisz: claude  i nacisnij Enter.</w:t>
-      </w:r>
-    </w:p>
-    <w:p>
-      <w:pPr>
-        <w:spacing w:before="20" w:after="40"/>
-        <w:ind w:left="850" w:hanging="227"/>
-      </w:pPr>
-      <w:r>
-        <w:rPr>
-          <w:rFonts w:ascii="Calibri" w:hAnsi="Calibri"/>
-          <w:b/>
-          <w:i w:val="0"/>
-          <w:color w:val="1F497D"/>
-          <w:sz w:val="20"/>
-        </w:rPr>
-        <w:t xml:space="preserve">3.  </w:t>
-      </w:r>
-      <w:r>
-        <w:rPr>
-          <w:rFonts w:ascii="Calibri" w:hAnsi="Calibri"/>
-          <w:b w:val="0"/>
-          <w:i w:val="0"/>
-          <w:sz w:val="20"/>
-        </w:rPr>
-        <w:t>Claude moze zapytac o zgode na uruchomienie — jesli zobaczysz pytanie, wpisz Y i Enter.</w:t>
-      </w:r>
-    </w:p>
-    <w:p>
-      <w:pPr>
-        <w:spacing w:before="20" w:after="40"/>
-        <w:ind w:left="850" w:hanging="227"/>
-      </w:pPr>
-      <w:r>
-        <w:rPr>
-          <w:rFonts w:ascii="Calibri" w:hAnsi="Calibri"/>
-          <w:b/>
-          <w:i w:val="0"/>
-          <w:color w:val="1F497D"/>
-          <w:sz w:val="20"/>
-        </w:rPr>
-        <w:t xml:space="preserve">4.  </w:t>
-      </w:r>
-      <w:r>
-        <w:rPr>
-          <w:rFonts w:ascii="Calibri" w:hAnsi="Calibri"/>
-          <w:b w:val="0"/>
-          <w:i w:val="0"/>
-          <w:sz w:val="20"/>
-        </w:rPr>
-        <w:t>Automatycznie otworzy sie przegladarka z prosba o zalogowanie. Jesli nie masz konta Anthropic — kliknij "Sign up" i utworz je teraz (bezplatne). Jesli masz — zaloguj sie normalnie.</w:t>
-      </w:r>
-    </w:p>
-    <w:p>
-      <w:pPr>
-        <w:spacing w:before="20" w:after="40"/>
-        <w:ind w:left="850" w:hanging="227"/>
-      </w:pPr>
-      <w:r>
-        <w:rPr>
-          <w:rFonts w:ascii="Calibri" w:hAnsi="Calibri"/>
-          <w:b/>
-          <w:i w:val="0"/>
-          <w:color w:val="1F497D"/>
-          <w:sz w:val="20"/>
-        </w:rPr>
-        <w:t xml:space="preserve">5.  </w:t>
-      </w:r>
-      <w:r>
-        <w:rPr>
-          <w:rFonts w:ascii="Calibri" w:hAnsi="Calibri"/>
-          <w:b w:val="0"/>
-          <w:i w:val="0"/>
-          <w:sz w:val="20"/>
-        </w:rPr>
-        <w:t>Po zalogowaniu wron do Windsurf — zostaw przegladarke otwarta.</w:t>
-      </w:r>
-    </w:p>
-    <w:p>
-      <w:pPr>
-        <w:spacing w:before="20" w:after="40"/>
-        <w:ind w:left="850" w:hanging="227"/>
-      </w:pPr>
-      <w:r>
-        <w:rPr>
-          <w:rFonts w:ascii="Calibri" w:hAnsi="Calibri"/>
-          <w:b/>
-          <w:i w:val="0"/>
-          <w:color w:val="1F497D"/>
-          <w:sz w:val="20"/>
-        </w:rPr>
-        <w:t xml:space="preserve">6.  </w:t>
-      </w:r>
-      <w:r>
-        <w:rPr>
-          <w:rFonts w:ascii="Calibri" w:hAnsi="Calibri"/>
-          <w:b w:val="0"/>
-          <w:i w:val="0"/>
-          <w:sz w:val="20"/>
-        </w:rPr>
-        <w:t>W terminalu zobaczysz ze Claude czeka — pojawi sie cos w stylu: "Claude Code &gt;"</w:t>
-      </w:r>
-    </w:p>
-    <w:p>
-      <w:pPr>
-        <w:spacing w:before="120" w:after="40"/>
-        <w:ind w:left="680"/>
-        <w:jc w:val="center"/>
-      </w:pPr>
-      <w:r>
-        <w:drawing>
-          <wp:inline xmlns:a="http://schemas.openxmlformats.org/drawingml/2006/main" xmlns:pic="http://schemas.openxmlformats.org/drawingml/2006/picture">
-            <wp:extent cx="4572000" cy="1178169"/>
-            <wp:docPr id="3" name="Picture 3"/>
-            <wp:cNvGraphicFramePr>
-              <a:graphicFrameLocks noChangeAspect="1"/>
-            </wp:cNvGraphicFramePr>
-            <a:graphic>
-              <a:graphicData uri="http://schemas.openxmlformats.org/drawingml/2006/picture">
-                <pic:pic>
-                  <pic:nvPicPr>
-                    <pic:cNvPr id="0" name="tmpg6ewzmlo.png"/>
-                    <pic:cNvPicPr/>
-                  </pic:nvPicPr>
-                  <pic:blipFill>
-                    <a:blip r:embed="rId11"/>
-                    <a:stretch>
-                      <a:fillRect/>
-                    </a:stretch>
-                  </pic:blipFill>
-                  <pic:spPr>
-                    <a:xfrm>
-                      <a:off x="0" y="0"/>
-                      <a:ext cx="4572000" cy="1178169"/>
-                    </a:xfrm>
-                    <a:prstGeom prst="rect"/>
-                  </pic:spPr>
-                </pic:pic>
-              </a:graphicData>
-            </a:graphic>
-          </wp:inline>
-        </w:drawing>
-      </w:r>
-    </w:p>
-    <w:p>
-      <w:pPr>
-        <w:spacing w:before="40" w:after="120"/>
-        <w:ind w:left="680"/>
-      </w:pPr>
-      <w:r>
-        <w:rPr>
-          <w:rFonts w:ascii="Calibri" w:hAnsi="Calibri"/>
-          <w:b w:val="0"/>
-          <w:i/>
-          <w:color w:val="646464"/>
-          <w:sz w:val="18"/>
-        </w:rPr>
-        <w:t xml:space="preserve">  Tak wyglada uruchomiony Claude w terminalu Windsurf.</w:t>
-      </w:r>
-    </w:p>
-    <w:p>
-      <w:pPr>
-        <w:spacing w:before="240" w:after="60"/>
-      </w:pPr>
-      <w:r>
-        <w:fldChar w:fldCharType="begin">
-          <w:ffData>
-            <w:name w:val=""/>
-            <w:enabled/>
-            <w:calcOnExit w:val="0"/>
-            <w:checkBox>
-              <w:sizeAuto/>
-              <w:default w:val="0"/>
-              <w:checked w:val="0"/>
-            </w:checkBox>
-          </w:ffData>
-        </w:fldChar>
-      </w:r>
-      <w:r>
-        <w:instrText xml:space="preserve"> FORMCHECKBOX </w:instrText>
-      </w:r>
-      <w:r>
-        <w:fldChar w:fldCharType="separate"/>
-      </w:r>
-      <w:r>
-        <w:fldChar w:fldCharType="end"/>
-      </w:r>
-      <w:r>
-        <w:t xml:space="preserve">  </w:t>
-      </w:r>
-      <w:r>
-        <w:rPr>
-          <w:rFonts w:ascii="Calibri" w:hAnsi="Calibri"/>
-          <w:b/>
-          <w:i w:val="0"/>
-          <w:sz w:val="24"/>
-        </w:rPr>
-        <w:t>Krok 6 — Wklej prompt z Czesci 2 — Claude zajmie sie reszta!</w:t>
-      </w:r>
-    </w:p>
-    <w:p>
-      <w:pPr>
-        <w:spacing w:before="40" w:after="80"/>
-        <w:ind w:left="680"/>
-      </w:pPr>
-      <w:r>
-        <w:rPr>
-          <w:rFonts w:ascii="Calibri" w:hAnsi="Calibri"/>
-          <w:b w:val="0"/>
-          <w:i w:val="0"/>
-          <w:color w:val="464646"/>
-          <w:sz w:val="20"/>
-        </w:rPr>
-        <w:t>To ostatni krok ktory robisz sam. Dajesz Claude instrukcje i od tej chwili on prowadzi Cie przez cala konfiguracje — po polsku, krok po kroku, czekajac az kazdy krok zrobisz.</w:t>
-      </w:r>
-    </w:p>
-    <w:p>
-      <w:pPr>
-        <w:spacing w:before="20" w:after="40"/>
-        <w:ind w:left="850" w:hanging="227"/>
-      </w:pPr>
-      <w:r>
-        <w:rPr>
-          <w:rFonts w:ascii="Calibri" w:hAnsi="Calibri"/>
-          <w:b/>
-          <w:i w:val="0"/>
-          <w:color w:val="1F497D"/>
-          <w:sz w:val="20"/>
-        </w:rPr>
-        <w:t xml:space="preserve">1.  </w:t>
-      </w:r>
-      <w:r>
-        <w:rPr>
-          <w:rFonts w:ascii="Calibri" w:hAnsi="Calibri"/>
-          <w:b w:val="0"/>
-          <w:i w:val="0"/>
-          <w:sz w:val="20"/>
-        </w:rPr>
-        <w:t>Przejdz na nastepna strone tego dokumentu.</w:t>
-      </w:r>
-    </w:p>
-    <w:p>
-      <w:pPr>
-        <w:spacing w:before="20" w:after="40"/>
-        <w:ind w:left="850" w:hanging="227"/>
-      </w:pPr>
-      <w:r>
-        <w:rPr>
-          <w:rFonts w:ascii="Calibri" w:hAnsi="Calibri"/>
-          <w:b/>
-          <w:i w:val="0"/>
-          <w:color w:val="1F497D"/>
-          <w:sz w:val="20"/>
-        </w:rPr>
-        <w:t xml:space="preserve">2.  </w:t>
-      </w:r>
-      <w:r>
-        <w:rPr>
-          <w:rFonts w:ascii="Calibri" w:hAnsi="Calibri"/>
-          <w:b w:val="0"/>
-          <w:i w:val="0"/>
-          <w:sz w:val="20"/>
-        </w:rPr>
-        <w:t>Znajdz swoj system — "Jesli masz Maca" lub "Jesli masz Windowsa" — i zaznacz CALY tekst w niebieskiej ramce dla swojego systemu.</w:t>
+        <w:t>Znajdź swój system — "Jeśli masz Maca" lub "Jeśli masz Windowsa" — i zaznacz CAŁY tekst w niebieskiej ramce dla swojego systemu.</w:t>
       </w:r>
     </w:p>
     <w:p>
@@ -2519,7 +2640,7 @@
           <w:i w:val="0"/>
           <w:sz w:val="20"/>
         </w:rPr>
-        <w:t>Wron do Windsurf i kliknij w ciemne okienko terminala.</w:t>
+        <w:t>Wróć do Windsurf i kliknij w ciemne okienko terminala.</w:t>
       </w:r>
     </w:p>
     <w:p>
@@ -2569,7 +2690,7 @@
           <w:i w:val="0"/>
           <w:sz w:val="20"/>
         </w:rPr>
-        <w:t>Nacisnij Enter.</w:t>
+        <w:t>Naciśnij Enter.</w:t>
       </w:r>
     </w:p>
     <w:p>
@@ -2594,7 +2715,7 @@
           <w:i w:val="0"/>
           <w:sz w:val="20"/>
         </w:rPr>
-        <w:t>Claude zacznie pisac do Ciebie i przeprowadzi Cie przez kazdy nastepny krok. Wystarczy ze bedziesz odpowiadac "gotowe" gdy skonczysz kazdy krok.</w:t>
+        <w:t>Claude zacznie pisać do Ciebie i przeprowadzi Cię przez każdy następny krok. Wystarczy że będziesz odpowiadać "gotowe" gdy skończysz każdy krok.</w:t>
       </w:r>
     </w:p>
     <w:p>
@@ -2618,7 +2739,7 @@
           <w:color w:val="1F497D"/>
           <w:sz w:val="28"/>
         </w:rPr>
-        <w:t>Czesc 2 — Tekst do wklejenia do Claude</w:t>
+        <w:t>Część 2 — Tekst do wklejenia do Claude</w:t>
       </w:r>
     </w:p>
     <w:p>
@@ -2629,7 +2750,7 @@
           <w:i w:val="0"/>
           <w:sz w:val="20"/>
         </w:rPr>
-        <w:t>Znajdz swoj system ponizej. Zaznacz CALY tekst w niebieskiej ramce, skopiuj (Cmd+C na Macu / Ctrl+C na Windowsie) i wklej do czarnego okienka w Windsurf gdzie dziala Claude (Cmd+V na Macu / Ctrl+V na Windowsie). Nacisnij Enter. Claude zacznie rozmawiac z Toba i przeprowadzi Cie przez cala reszte.</w:t>
+        <w:t>Znajdź swój system poniżej. Zaznacz CAŁY tekst w niebieskiej ramce, skopiuj (Cmd+C na Macu / Ctrl+C na Windowsie) i wklej do czarnego okienka w Windsurf gdzie działa Claude (Cmd+V na Macu / Ctrl+V na Windowsie). Naciśnij Enter. Claude zacznie rozmawiać z Tobą i przeprowadzi Cię przez całą resztę.</w:t>
       </w:r>
     </w:p>
     <w:p>
@@ -2644,7 +2765,7 @@
           <w:color w:val="3C3C3C"/>
           <w:sz w:val="22"/>
         </w:rPr>
-        <w:t>Jesli masz Maca — skopiuj to:</w:t>
+        <w:t>Jeśli masz Maca — skopiuj to:</w:t>
       </w:r>
     </w:p>
     <w:p>
@@ -2666,57 +2787,57 @@
           <w:i w:val="0"/>
           <w:sz w:val="16"/>
         </w:rPr>
-        <w:t>Przeprowadz mnie przez konfiguracje srodowiska Claude Code.</w:t>
+        <w:t>Przeprowadź mnie przez konfigurację środowiska Claude Code.</w:t>
         <w:br/>
         <w:br/>
-        <w:t>Jestem nowym uzytkownikiem. Wlasnie zainstalowalem Windsurf i Claude Code CLI,</w:t>
+        <w:t>Jestem nowym użytkownikiem. Właśnie zainstalowałem Windsurf i Claude Code CLI,</w:t>
         <w:br/>
-        <w:t>jestem zalogowany. Pracuje w folderze Onboarding — zawiera podfolder setup/</w:t>
+        <w:t>jestem zalogowany. Pracuję w folderze Onboarding — zawiera podfolder setup/</w:t>
         <w:br/>
         <w:t>z gotowymi plikami do skopiowania.</w:t>
         <w:br/>
         <w:br/>
-        <w:t>Zasady dla kazdego kroku:</w:t>
+        <w:t>Zasady dla każdego kroku:</w:t>
         <w:br/>
-        <w:t>- Tlumacz prosto, bez zargonu technicznego — jakbys mowil do osoby ktora</w:t>
+        <w:t>- Tłumacz prosto, bez żargonu technicznego — jakbyś mówił do osoby która</w:t>
         <w:br/>
-        <w:t xml:space="preserve">  nigdy nie programowala</w:t>
+        <w:t xml:space="preserve">  nigdy nie programowała</w:t>
         <w:br/>
-        <w:t>- Podawaj JEDNA komende lub akcje na raz</w:t>
+        <w:t>- Podawaj JEDNĄ komendę lub akcję na raz</w:t>
         <w:br/>
-        <w:t>- Czekaj az powiem "gotowe" zanim przejdziesz do nastepnego kroku</w:t>
+        <w:t>- Czekaj aż powiem "gotowe" zanim przejdziesz do następnego kroku</w:t>
         <w:br/>
-        <w:t>- Po kazdym kroku sprawdz czy zadzialalo</w:t>
+        <w:t>- Po każdym kroku sprawdź czy zadziałało</w:t>
         <w:br/>
-        <w:t>- Jesli cos sie nie uda — pomoz mi to naprawic zanim pojdziemy dalej</w:t>
+        <w:t>- Jeśli coś się nie uda — pomóż mi to naprawić zanim pójdziemy dalej</w:t>
         <w:br/>
         <w:br/>
-        <w:t>CZESC A — Instalacja brakujacych narzedzi</w:t>
+        <w:t>CZĘŚĆ A — Instalacja brakujących narzędzi</w:t>
         <w:br/>
         <w:br/>
-        <w:t>1. Sprawdz czy mam Homebrew: brew --version</w:t>
+        <w:t>1. Sprawdź czy mam Homebrew: brew --version</w:t>
         <w:br/>
-        <w:t xml:space="preserve">   Jesli nie ma — zainstaluj. (Homebrew to sklep z narzediami dla Maca)</w:t>
+        <w:t xml:space="preserve">   Jeśli nie ma — zainstaluj. (Homebrew to sklep z narzędziami dla Maca)</w:t>
         <w:br/>
         <w:t>2. Zainstaluj gh i jq: brew install gh jq</w:t>
         <w:br/>
-        <w:t xml:space="preserve">   (gh = do laczenia z GitHub, jq = pomocnik konfiguracyjny)</w:t>
+        <w:t xml:space="preserve">   (gh = do łączenia z GitHub, jq = pomocnik konfiguracyjny)</w:t>
         <w:br/>
         <w:t>3. Zaloguj mnie do GitHub: gh auth login</w:t>
         <w:br/>
-        <w:t xml:space="preserve">   Wybierz: GitHub.com -&gt; HTTPS -&gt; zaloguj przez przegladarke</w:t>
+        <w:t xml:space="preserve">   Wybierz: GitHub.com -&gt; HTTPS -&gt; zaloguj przez przeglądarkę</w:t>
         <w:br/>
         <w:br/>
-        <w:t>CZESC B — Konfiguracja Claude</w:t>
+        <w:t>CZĘŚĆ B — Konfiguracja Claude</w:t>
         <w:br/>
         <w:br/>
-        <w:t>4. Utworz foldery: ~/.claude/skills/  ~/.claude/hooks/  ~/.claude/memory/</w:t>
+        <w:t>4. Utwórz foldery: ~/.claude/skills/  ~/.claude/hooks/  ~/.claude/memory/</w:t>
         <w:br/>
         <w:t>5. Skopiuj skille z setup/skills/ do ~/.claude/skills/</w:t>
         <w:br/>
         <w:t xml:space="preserve">   (state-start, catchup, setup-new-project)</w:t>
         <w:br/>
-        <w:t>6. Skopiuj hook bezpieczenstwa: setup/hooks/security-scan.py -&gt; ~/.claude/hooks/</w:t>
+        <w:t>6. Skopiuj hook bezpieczeństwa: setup/hooks/security-scan.py -&gt; ~/.claude/hooks/</w:t>
         <w:br/>
         <w:t xml:space="preserve">   Nadaj uprawnienia: chmod +x</w:t>
         <w:br/>
@@ -2726,37 +2847,37 @@
         <w:br/>
         <w:t>8. Wygeneruj plik konfiguracyjny ~/.claude/settings.json</w:t>
         <w:br/>
-        <w:t xml:space="preserve">   z ustawieniami hooka i status baru (uzyj $HOME zamiast ~ przy sciezkach)</w:t>
+        <w:t xml:space="preserve">   z ustawieniami hooka i status baru (użyj $HOME zamiast ~ przy ścieżkach)</w:t>
         <w:br/>
         <w:t>9. Zapytaj mnie o:</w:t>
         <w:br/>
-        <w:t xml:space="preserve">   - w jakim jezyku chce rozmawiac z AI (np. polski)</w:t>
+        <w:t xml:space="preserve">   - w jakim języku chcę rozmawiać z AI (np. polski)</w:t>
         <w:br/>
-        <w:t xml:space="preserve">   - moj GitHub username</w:t>
+        <w:t xml:space="preserve">   - mój GitHub username</w:t>
         <w:br/>
-        <w:t xml:space="preserve">   - gdzie trzymam foldery projektow (np. ~/Projects/)</w:t>
+        <w:t xml:space="preserve">   - gdzie trzymam foldery projektów (np. ~/Projects/)</w:t>
         <w:br/>
         <w:t xml:space="preserve">   Potem skopiuj setup/global-claude-template.md -&gt; ~/.claude/CLAUDE.md</w:t>
         <w:br/>
-        <w:t xml:space="preserve">   i uzupelnij moje dane w miejscach oznaczonych [[...]]</w:t>
+        <w:t xml:space="preserve">   i uzupełnij moje dane w miejscach oznaczonych [[...]]</w:t>
         <w:br/>
         <w:t>10. W pliku ~/.claude/skills/setup-new-project/SKILL.md</w:t>
         <w:br/>
-        <w:t xml:space="preserve">    zamien GITHUB_USERNAME na moj GitHub username</w:t>
+        <w:t xml:space="preserve">    zamień GITHUB_USERNAME na mój GitHub username</w:t>
         <w:br/>
-        <w:t>11. Weryfikacja koncowa: sprawdz ze wszystkie pliki istnieja,</w:t>
+        <w:t>11. Weryfikacja końcowa: sprawdź że wszystkie pliki istnieją,</w:t>
         <w:br/>
-        <w:t xml:space="preserve">    pokaz zawartosc settings.json, przetestuj komende /state-start</w:t>
+        <w:t xml:space="preserve">    pokaż zawartość settings.json, przetestuj komendę /state-start</w:t>
         <w:br/>
         <w:br/>
-        <w:t>Na koncu wytlumacz mi jak stworzyc swoj pierwszy projekt:</w:t>
+        <w:t>Na końcu wytłumacz mi jak stworzyć swój pierwszy projekt:</w:t>
         <w:br/>
-        <w:t>- jak skopiowac folder Onboarding jako szablon</w:t>
+        <w:t>- jak skopiować folder Onboarding jako szablon</w:t>
         <w:br/>
-        <w:t>- jak uruchomic /setup-new-project zeby stworzyc repo na GitHub</w:t>
+        <w:t>- jak uruchomić /setup-new-project żeby stworzyć repo na GitHub</w:t>
         <w:br/>
         <w:br/>
-        <w:t>Pelny opis kazdego kroku: setup/onboarding-prompt.md</w:t>
+        <w:t>Pełny opis każdego kroku: setup/onboarding-prompt.md</w:t>
       </w:r>
     </w:p>
     <w:p>
@@ -2771,7 +2892,7 @@
           <w:color w:val="0054A6"/>
           <w:sz w:val="22"/>
         </w:rPr>
-        <w:t>Jesli masz Windowsa — skopiuj to:</w:t>
+        <w:t>Jeśli masz Windowsa — skopiuj to:</w:t>
       </w:r>
     </w:p>
     <w:p>
@@ -2937,7 +3058,7 @@
           <w:color w:val="808080"/>
           <w:sz w:val="18"/>
         </w:rPr>
-        <w:t>Szczegolowy opis kazdego kroku konfiguracji: setup/onboarding-prompt.md</w:t>
+        <w:t>Szczegółowy opis każdego kroku konfiguracji: setup/onboarding-prompt.md</w:t>
       </w:r>
     </w:p>
     <w:p>
@@ -2961,7 +3082,7 @@
           <w:color w:val="1F497D"/>
           <w:sz w:val="28"/>
         </w:rPr>
-        <w:t>Co dalej? — po zakonczeniu konfiguracji</w:t>
+        <w:t>Co dalej? — po zakończeniu konfiguracji</w:t>
       </w:r>
     </w:p>
     <w:p>
@@ -2975,7 +3096,7 @@
           <w:i w:val="0"/>
           <w:sz w:val="20"/>
         </w:rPr>
-        <w:t>Gratulacje! Masz skonfigurowane srodowisko. Oto co mozesz teraz robic:</w:t>
+        <w:t>Gratulacje! Masz skonfigurowane środowisko. Oto co możesz teraz robić:</w:t>
       </w:r>
     </w:p>
     <w:p>
@@ -2998,7 +3119,7 @@
           <w:color w:val="1F497D"/>
           <w:sz w:val="20"/>
         </w:rPr>
-        <w:t xml:space="preserve">Stworz pierwszy projekt  </w:t>
+        <w:t xml:space="preserve">Stwórz pierwszy projekt  </w:t>
       </w:r>
       <w:r>
         <w:rPr>
@@ -3008,7 +3129,7 @@
           <w:color w:val="464646"/>
           <w:sz w:val="20"/>
         </w:rPr>
-        <w:t>— wpisz /setup-new-project do Claude i on zajmie sie reszta</w:t>
+        <w:t>— wpisz /setup-new-project do Claude i on zajmie się resztą</w:t>
       </w:r>
     </w:p>
     <w:p>
@@ -3064,7 +3185,7 @@
           <w:color w:val="1F497D"/>
           <w:sz w:val="20"/>
         </w:rPr>
-        <w:t xml:space="preserve">Gdy za duzo rozmow  </w:t>
+        <w:t xml:space="preserve">Gdy za dużo rozmów  </w:t>
       </w:r>
       <w:r>
         <w:rPr>
@@ -3074,7 +3195,7 @@
           <w:color w:val="464646"/>
           <w:sz w:val="20"/>
         </w:rPr>
-        <w:t>— wpisz /state-start zeby Claude pamietat gdzie skonczyles, potem /clear</w:t>
+        <w:t>— wpisz /state-start żeby Claude pamiętał gdzie skończyłeś, potem /clear</w:t>
       </w:r>
     </w:p>
     <w:p>
@@ -3097,7 +3218,7 @@
           <w:color w:val="1F497D"/>
           <w:sz w:val="20"/>
         </w:rPr>
-        <w:t xml:space="preserve">Wron po przerwie  </w:t>
+        <w:t xml:space="preserve">Wróć po przerwie  </w:t>
       </w:r>
       <w:r>
         <w:rPr>
@@ -3107,7 +3228,7 @@
           <w:color w:val="464646"/>
           <w:sz w:val="20"/>
         </w:rPr>
-        <w:t>— wpisz /catchup zeby Claude przypominal sobie co robiliście</w:t>
+        <w:t>— wpisz /catchup żeby Claude przypomniał sobie co robiliście</w:t>
       </w:r>
     </w:p>
     <w:p>

</xml_diff>

<commit_message>
[fix] Popraw backslash \U w HANDOFF_PROMPT (SyntaxError), regeneruj docx
Co-Authored-By: Claude Sonnet 4.6 <noreply@anthropic.com>
</commit_message>
<xml_diff>
--- a/docs/output/onboarding.docx
+++ b/docs/output/onboarding.docx
@@ -896,7 +896,7 @@
                     <a:graphicData uri="http://schemas.openxmlformats.org/drawingml/2006/picture">
                       <pic:pic>
                         <pic:nvPicPr>
-                          <pic:cNvPr id="0" name="tmp6khqsfoi.png"/>
+                          <pic:cNvPr id="0" name="tmp22hrw3ef.png"/>
                           <pic:cNvPicPr/>
                         </pic:nvPicPr>
                         <pic:blipFill>
@@ -1180,7 +1180,7 @@
                     <a:graphicData uri="http://schemas.openxmlformats.org/drawingml/2006/picture">
                       <pic:pic>
                         <pic:nvPicPr>
-                          <pic:cNvPr id="0" name="tmpd8kbikua.png"/>
+                          <pic:cNvPr id="0" name="tmphzq771tj.png"/>
                           <pic:cNvPicPr/>
                         </pic:nvPicPr>
                         <pic:blipFill>
@@ -2004,7 +2004,7 @@
               <a:graphicData uri="http://schemas.openxmlformats.org/drawingml/2006/picture">
                 <pic:pic>
                   <pic:nvPicPr>
-                    <pic:cNvPr id="0" name="tmp963o3lfq.png"/>
+                    <pic:cNvPr id="0" name="tmph2n_l4g_.png"/>
                     <pic:cNvPicPr/>
                   </pic:nvPicPr>
                   <pic:blipFill>
@@ -2448,7 +2448,7 @@
               <a:graphicData uri="http://schemas.openxmlformats.org/drawingml/2006/picture">
                 <pic:pic>
                   <pic:nvPicPr>
-                    <pic:cNvPr id="0" name="tmppqk1p2su.png"/>
+                    <pic:cNvPr id="0" name="tmpz2ojrb5l.png"/>
                     <pic:cNvPicPr/>
                   </pic:nvPicPr>
                   <pic:blipFill>
@@ -2590,7 +2590,7 @@
           <w:i w:val="0"/>
           <w:sz w:val="20"/>
         </w:rPr>
-        <w:t>Znajdź swój system — "Jeśli masz Maca" lub "Jeśli masz Windowsa" — i zaznacz CAŁY tekst w niebieskiej ramce dla swojego systemu.</w:t>
+        <w:t>Zaznacz CAŁY tekst w niebieskiej ramce.</w:t>
       </w:r>
     </w:p>
     <w:p>
@@ -2615,7 +2615,7 @@
           <w:i w:val="0"/>
           <w:sz w:val="20"/>
         </w:rPr>
-        <w:t>(Mac) Skopiuj: Cmd+C  |  (Windows) Skopiuj: Ctrl+C</w:t>
+        <w:t>Skopiuj go: Cmd+C na Macu  lub  Ctrl+C na Windowsie.</w:t>
       </w:r>
     </w:p>
     <w:p>
@@ -2665,7 +2665,7 @@
           <w:i w:val="0"/>
           <w:sz w:val="20"/>
         </w:rPr>
-        <w:t>(Mac) Wklej: Cmd+V  |  (Windows) Wklej: Ctrl+V</w:t>
+        <w:t>Wklej: Cmd+V na Macu  lub  Ctrl+V na Windowsie.</w:t>
       </w:r>
     </w:p>
     <w:p>
@@ -2750,22 +2750,7 @@
           <w:i w:val="0"/>
           <w:sz w:val="20"/>
         </w:rPr>
-        <w:t>Znajdź swój system poniżej. Zaznacz CAŁY tekst w niebieskiej ramce, skopiuj (Cmd+C na Macu / Ctrl+C na Windowsie) i wklej do czarnego okienka w Windsurf gdzie działa Claude (Cmd+V na Macu / Ctrl+V na Windowsie). Naciśnij Enter. Claude zacznie rozmawiać z Tobą i przeprowadzi Cię przez całą resztę.</w:t>
-      </w:r>
-    </w:p>
-    <w:p>
-      <w:pPr>
-        <w:spacing w:before="200" w:after="80"/>
-      </w:pPr>
-      <w:r>
-        <w:rPr>
-          <w:rFonts w:ascii="Calibri" w:hAnsi="Calibri"/>
-          <w:b/>
-          <w:i w:val="0"/>
-          <w:color w:val="3C3C3C"/>
-          <w:sz w:val="22"/>
-        </w:rPr>
-        <w:t>Jeśli masz Maca — skopiuj to:</w:t>
+        <w:t>Zaznacz CAŁY tekst w niebieskiej ramce poniżej, skopiuj (Cmd+C na Macu / Ctrl+C na Windowsie) i wklej do czarnego okienka w Windsurf gdzie działa Claude (Cmd+V na Macu / Ctrl+V na Windowsie). Naciśnij Enter. Claude wykryje Twój system i przeprowadzi Cię przez całą resztę.</w:t>
       </w:r>
     </w:p>
     <w:p>
@@ -2789,261 +2774,161 @@
         </w:rPr>
         <w:t>Przeprowadź mnie przez konfigurację środowiska Claude Code.</w:t>
         <w:br/>
+        <w:t>Jestem nowym użytkownikiem — właśnie zainstalowałem Windsurf i Claude Code CLI,</w:t>
         <w:br/>
-        <w:t>Jestem nowym użytkownikiem. Właśnie zainstalowałem Windsurf i Claude Code CLI,</w:t>
-        <w:br/>
-        <w:t>jestem zalogowany. Pracuję w folderze Onboarding — zawiera podfolder setup/</w:t>
-        <w:br/>
-        <w:t>z gotowymi plikami do skopiowania.</w:t>
+        <w:t>jestem zalogowany i pracuję w folderze Onboarding (zawiera podfolder setup/).</w:t>
         <w:br/>
         <w:br/>
-        <w:t>Zasady dla każdego kroku:</w:t>
+        <w:t>Zasady: tłumacz prosto bez żargonu, jedna komenda na raz, czekaj na "gotowe",</w:t>
         <w:br/>
-        <w:t>- Tłumacz prosto, bez żargonu technicznego — jakbyś mówił do osoby która</w:t>
-        <w:br/>
-        <w:t xml:space="preserve">  nigdy nie programowała</w:t>
-        <w:br/>
-        <w:t>- Podawaj JEDNĄ komendę lub akcję na raz</w:t>
-        <w:br/>
-        <w:t>- Czekaj aż powiem "gotowe" zanim przejdziesz do następnego kroku</w:t>
-        <w:br/>
-        <w:t>- Po każdym kroku sprawdź czy zadziałało</w:t>
-        <w:br/>
-        <w:t>- Jeśli coś się nie uda — pomóż mi to naprawić zanim pójdziemy dalej</w:t>
+        <w:t>sprawdzaj po każdym kroku, napraw błędy zanim przejdziesz dalej.</w:t>
         <w:br/>
         <w:br/>
-        <w:t>CZĘŚĆ A — Instalacja brakujących narzędzi</w:t>
+        <w:t>KROK 0 — Wykryj mój system: uruchom `uname -s` (macOS → Darwin) lub sprawdź</w:t>
+        <w:br/>
+        <w:t>czy jesteś w PowerShell (Windows). Przez całą resztę używaj właściwych komend.</w:t>
         <w:br/>
         <w:br/>
-        <w:t>1. Sprawdź czy mam Homebrew: brew --version</w:t>
+        <w:t>CZĘŚĆ A — Narzędzia</w:t>
         <w:br/>
-        <w:t xml:space="preserve">   Jeśli nie ma — zainstaluj. (Homebrew to sklep z narzędziami dla Maca)</w:t>
         <w:br/>
-        <w:t>2. Zainstaluj gh i jq: brew install gh jq</w:t>
+        <w:t>1. Sprawdź `gh --version` i `jq --version`. Jeśli brak:</w:t>
         <w:br/>
-        <w:t xml:space="preserve">   (gh = do łączenia z GitHub, jq = pomocnik konfiguracyjny)</w:t>
+        <w:t xml:space="preserve">   macOS: sprawdź Homebrew (brew --version), zainstaluj jeśli brak,</w:t>
         <w:br/>
-        <w:t>3. Zaloguj mnie do GitHub: gh auth login</w:t>
+        <w:t xml:space="preserve">          potem: brew install gh jq</w:t>
         <w:br/>
-        <w:t xml:space="preserve">   Wybierz: GitHub.com -&gt; HTTPS -&gt; zaloguj przez przeglądarkę</w:t>
+        <w:t xml:space="preserve">   Windows: winget install GitHub.cli + winget install jqlang.jq</w:t>
+        <w:br/>
+        <w:t xml:space="preserve">            (potem zamknij i otwórz nowy terminal)</w:t>
+        <w:br/>
+        <w:br/>
+        <w:t>2. Zapytaj czy mam konto github.com (jeśli nie — powiedz żeby założyć).</w:t>
+        <w:br/>
+        <w:t xml:space="preserve">   Następnie: gh auth login → GitHub.com → HTTPS → przez przeglądarkę</w:t>
+        <w:br/>
+        <w:t xml:space="preserve">   Sprawdź: gh auth status</w:t>
         <w:br/>
         <w:br/>
         <w:t>CZĘŚĆ B — Konfiguracja Claude</w:t>
         <w:br/>
         <w:br/>
-        <w:t>4. Utwórz foldery: ~/.claude/skills/  ~/.claude/hooks/  ~/.claude/memory/</w:t>
+        <w:t>3. Utwórz foldery:</w:t>
         <w:br/>
-        <w:t>5. Skopiuj skille z setup/skills/ do ~/.claude/skills/</w:t>
+        <w:t xml:space="preserve">   macOS:   mkdir -p ~/.claude/skills ~/.claude/hooks ~/.claude/memory</w:t>
         <w:br/>
-        <w:t xml:space="preserve">   (state-start, catchup, setup-new-project)</w:t>
+        <w:t xml:space="preserve">   Windows: New-Item -ItemType Directory -Force "$HOME/.claude/skills",</w:t>
         <w:br/>
-        <w:t>6. Skopiuj hook bezpieczeństwa: setup/hooks/security-scan.py -&gt; ~/.claude/hooks/</w:t>
-        <w:br/>
-        <w:t xml:space="preserve">   Nadaj uprawnienia: chmod +x</w:t>
-        <w:br/>
-        <w:t>7. Skopiuj status bar: setup/statusline-command.sh -&gt; ~/.claude/</w:t>
-        <w:br/>
-        <w:t xml:space="preserve">   Nadaj uprawnienia: chmod +x</w:t>
-        <w:br/>
-        <w:t>8. Wygeneruj plik konfiguracyjny ~/.claude/settings.json</w:t>
-        <w:br/>
-        <w:t xml:space="preserve">   z ustawieniami hooka i status baru (użyj $HOME zamiast ~ przy ścieżkach)</w:t>
-        <w:br/>
-        <w:t>9. Zapytaj mnie o:</w:t>
-        <w:br/>
-        <w:t xml:space="preserve">   - w jakim języku chcę rozmawiać z AI (np. polski)</w:t>
-        <w:br/>
-        <w:t xml:space="preserve">   - mój GitHub username</w:t>
-        <w:br/>
-        <w:t xml:space="preserve">   - gdzie trzymam foldery projektów (np. ~/Projects/)</w:t>
-        <w:br/>
-        <w:t xml:space="preserve">   Potem skopiuj setup/global-claude-template.md -&gt; ~/.claude/CLAUDE.md</w:t>
-        <w:br/>
-        <w:t xml:space="preserve">   i uzupełnij moje dane w miejscach oznaczonych [[...]]</w:t>
-        <w:br/>
-        <w:t>10. W pliku ~/.claude/skills/setup-new-project/SKILL.md</w:t>
-        <w:br/>
-        <w:t xml:space="preserve">    zamień GITHUB_USERNAME na mój GitHub username</w:t>
-        <w:br/>
-        <w:t>11. Weryfikacja końcowa: sprawdź że wszystkie pliki istnieją,</w:t>
-        <w:br/>
-        <w:t xml:space="preserve">    pokaż zawartość settings.json, przetestuj komendę /state-start</w:t>
+        <w:t xml:space="preserve">            "$HOME/.claude/hooks","$HOME/.claude/memory"</w:t>
         <w:br/>
         <w:br/>
-        <w:t>Na końcu wytłumacz mi jak stworzyć swój pierwszy projekt:</w:t>
+        <w:t>4. Skopiuj skille z setup/skills/ do ~/.claude/skills/:</w:t>
         <w:br/>
-        <w:t>- jak skopiować folder Onboarding jako szablon</w:t>
+        <w:t xml:space="preserve">   macOS:   cp -r setup/skills/* ~/.claude/skills/</w:t>
         <w:br/>
-        <w:t>- jak uruchomić /setup-new-project żeby stworzyć repo na GitHub</w:t>
+        <w:t xml:space="preserve">   Windows: Copy-Item -Recurse setup\skills\* "$HOME\.claude\skills"</w:t>
+        <w:br/>
+        <w:t xml:space="preserve">   Sprawdź: ls ~/.claude/skills/ → state-start, catchup, setup-new-project</w:t>
         <w:br/>
         <w:br/>
-        <w:t>Pełny opis każdego kroku: setup/onboarding-prompt.md</w:t>
-      </w:r>
-    </w:p>
-    <w:p>
-      <w:pPr>
-        <w:spacing w:before="240" w:after="80"/>
-      </w:pPr>
-      <w:r>
-        <w:rPr>
-          <w:rFonts w:ascii="Calibri" w:hAnsi="Calibri"/>
-          <w:b/>
-          <w:i w:val="0"/>
-          <w:color w:val="0054A6"/>
-          <w:sz w:val="22"/>
-        </w:rPr>
-        <w:t>Jeśli masz Windowsa — skopiuj to:</w:t>
-      </w:r>
-    </w:p>
-    <w:p>
-      <w:pPr>
-        <w:spacing w:before="160" w:after="160"/>
-        <w:ind w:left="283" w:right="283"/>
-        <w:shd w:val="clear" w:color="auto" w:fill="EFF3FB"/>
-        <w:pBdr>
-          <w:top w:val="single" w:sz="4" w:space="4" w:color="4472C4"/>
-          <w:bottom w:val="single" w:sz="4" w:space="4" w:color="4472C4"/>
-          <w:left w:val="single" w:sz="4" w:space="4" w:color="4472C4"/>
-          <w:right w:val="single" w:sz="4" w:space="4" w:color="4472C4"/>
-        </w:pBdr>
-      </w:pPr>
-      <w:r>
-        <w:rPr>
-          <w:rFonts w:ascii="Courier New" w:hAnsi="Courier New"/>
-          <w:b w:val="0"/>
-          <w:i w:val="0"/>
-          <w:sz w:val="16"/>
-        </w:rPr>
-        <w:t>Przeprowadź mnie przez konfigurację środowiska Claude Code.</w:t>
+        <w:t>5. Skopiuj security hook:</w:t>
+        <w:br/>
+        <w:t xml:space="preserve">   macOS:   cp setup/hooks/security-scan.py ~/.claude/hooks/</w:t>
+        <w:br/>
+        <w:t xml:space="preserve">            chmod +x ~/.claude/hooks/security-scan.py</w:t>
+        <w:br/>
+        <w:t xml:space="preserve">   Windows: Copy-Item setup\hooks\security-scan.py "$HOME\.claude\hooks"</w:t>
         <w:br/>
         <w:br/>
-        <w:t>Jestem nowym użytkownikiem na WINDOWS 10/11. Właśnie zainstalowałem Windsurf</w:t>
+        <w:t>6. Skopiuj statusline:</w:t>
         <w:br/>
-        <w:t>i Claude Code CLI, jestem zalogowany. Pracuję w folderze Onboarding — zawiera</w:t>
+        <w:t xml:space="preserve">   macOS:   cp setup/statusline-command.sh ~/.claude/</w:t>
         <w:br/>
-        <w:t>podfolder setup/ z gotowymi plikami do skopiowania.</w:t>
+        <w:t xml:space="preserve">            chmod +x ~/.claude/statusline-command.sh</w:t>
+        <w:br/>
+        <w:t xml:space="preserve">   Windows: Copy-Item setup\statusline-command.sh "$HOME\.claude"</w:t>
         <w:br/>
         <w:br/>
-        <w:t>Zasady dla każdego kroku:</w:t>
+        <w:t>7. Wygeneruj ~/.claude/settings.json z absolutnymi ścieżkami (NIE ~):</w:t>
         <w:br/>
-        <w:t>- Tłumacz prosto, bez żargonu — jakbyś mówił do osoby która nigdy nie programowała</w:t>
+        <w:t xml:space="preserve">   macOS (bash heredoc — $HOME rozwinie się automatycznie):</w:t>
         <w:br/>
-        <w:t>- Używaj komend dla Windows (PowerShell), NIE dla macOS</w:t>
+        <w:t xml:space="preserve">     cat &gt; ~/.claude/settings.json &lt;&lt; EOF</w:t>
         <w:br/>
-        <w:t>- Jedna komenda na raz, czekaj na 'gotowe', sprawdzaj po każdym kroku</w:t>
+        <w:t xml:space="preserve">     { "model": "sonnet",</w:t>
+        <w:br/>
+        <w:t xml:space="preserve">       "statusLine": {"type":"command",</w:t>
+        <w:br/>
+        <w:t xml:space="preserve">         "command":"bash $HOME/.claude/statusline-command.sh"},</w:t>
+        <w:br/>
+        <w:t xml:space="preserve">       "hooks": {"PreToolUse": [{"matcher":"Write|Edit|Bash",</w:t>
+        <w:br/>
+        <w:t xml:space="preserve">         "hooks":[{"type":"command",</w:t>
+        <w:br/>
+        <w:t xml:space="preserve">           "command":"python3 $HOME/.claude/hooks/security-scan.py"}]}]} }</w:t>
+        <w:br/>
+        <w:t xml:space="preserve">     EOF</w:t>
+        <w:br/>
+        <w:t xml:space="preserve">   Windows (PowerShell):</w:t>
+        <w:br/>
+        <w:t xml:space="preserve">     $h = $env:USERPROFILE</w:t>
+        <w:br/>
+        <w:t xml:space="preserve">     @"{ "model":"sonnet",</w:t>
+        <w:br/>
+        <w:t xml:space="preserve">       "statusLine":{"type":"command","command":"bash $h/.claude/statusline-command.sh"},</w:t>
+        <w:br/>
+        <w:t xml:space="preserve">       "hooks":{"PreToolUse":[{"matcher":"Write|Edit|Bash",</w:t>
+        <w:br/>
+        <w:t xml:space="preserve">         "hooks":[{"type":"command",</w:t>
+        <w:br/>
+        <w:t xml:space="preserve">           "command":"python3 $h/.claude/hooks/security-scan.py"}]}]} }"@ |</w:t>
+        <w:br/>
+        <w:t xml:space="preserve">     Set-Content "$HOME\.claude\settings.json"</w:t>
+        <w:br/>
+        <w:t xml:space="preserve">   Sprawdź: ścieżki muszą być absolutne np. /Users/... lub C:/Users/...</w:t>
         <w:br/>
         <w:br/>
-        <w:t>CZĘŚĆ A — Instalacja narzędzi (jeśli brakuje):</w:t>
+        <w:t>8. Skonfiguruj CLAUDE.md — zapytaj mnie o:</w:t>
+        <w:br/>
+        <w:t xml:space="preserve">   język pracy z AI / GitHub username / ścieżka do projektów</w:t>
+        <w:br/>
+        <w:t xml:space="preserve">   Skopiuj setup/global-claude-template.md → ~/.claude/CLAUDE.md</w:t>
+        <w:br/>
+        <w:t xml:space="preserve">   i uzupełnij wszystkie placeholdery [[...]].</w:t>
         <w:br/>
         <w:br/>
-        <w:t>1. Sprawdź: winget --version</w:t>
+        <w:t>9. Zaktualizuj setup-new-project:</w:t>
         <w:br/>
-        <w:t xml:space="preserve">   Jeśli brak — powiedz żeby zainstalować 'App Installer' z Microsoft Store.</w:t>
+        <w:t xml:space="preserve">   W ~/.claude/skills/setup-new-project/SKILL.md zamień GITHUB_USERNAME</w:t>
         <w:br/>
-        <w:t>2. Zainstaluj narzędzia:</w:t>
-        <w:br/>
-        <w:t xml:space="preserve">   winget install GitHub.cli</w:t>
-        <w:br/>
-        <w:t xml:space="preserve">   winget install jqlang.jq</w:t>
-        <w:br/>
-        <w:t>3. Zamknij i otwórz nowy terminal w Windsurf (żeby narzędzia były widoczne).</w:t>
-        <w:br/>
-        <w:t>4. Zapytaj czy user ma konto github.com. Jeśli nie — powiedz żeby założył (bezpłatne).</w:t>
-        <w:br/>
-        <w:t xml:space="preserve">   Potem: gh auth login  (GitHub.com -&gt; HTTPS -&gt; zaloguj przez przeglądarkę)</w:t>
+        <w:t xml:space="preserve">   na mój username.</w:t>
         <w:br/>
         <w:br/>
-        <w:t>CZĘŚĆ B — Konfiguracja Claude:</w:t>
+        <w:t>CZĘŚĆ C — Weryfikacja końcowa</w:t>
         <w:br/>
         <w:br/>
-        <w:t>5. Utwórz foldery konfiguracyjne:</w:t>
+        <w:t>Sprawdź każdy punkt i podaj wynik jako listę z: OK lub BŁĄD:</w:t>
         <w:br/>
-        <w:t xml:space="preserve">   New-Item -ItemType Directory -Force $HOME/.claude/skills</w:t>
+        <w:t>1. ls ~/.claude/skills/ → state-start, catchup, setup-new-project</w:t>
         <w:br/>
-        <w:t xml:space="preserve">   New-Item -ItemType Directory -Force $HOME/.claude/hooks</w:t>
+        <w:t>2. ls ~/.claude/hooks/ → security-scan.py</w:t>
         <w:br/>
-        <w:t xml:space="preserve">   New-Item -ItemType Directory -Force $HOME/.claude/memory</w:t>
+        <w:t>3. ls ~/.claude/ → statusline-command.sh, settings.json, CLAUDE.md</w:t>
         <w:br/>
-        <w:t>6. Skopiuj skille z setup/skills/ do $HOME/.claude/skills/</w:t>
+        <w:t>4. Zawartość settings.json → ścieżki absolutne (nie ~)</w:t>
         <w:br/>
-        <w:t xml:space="preserve">   (state-start, catchup, setup-new-project)</w:t>
+        <w:t>5. gh auth status → GitHub zalogowany</w:t>
         <w:br/>
-        <w:t>7. Skopiuj hook: setup/hooks/security-scan.py -&gt; $HOME/.claude/hooks/</w:t>
-        <w:br/>
-        <w:t>8. Skopiuj status bar: setup/statusline-command.sh -&gt; $HOME/.claude/</w:t>
-        <w:br/>
-        <w:t>9. Wygeneruj $HOME/.claude/settings.json z DOKŁADNIE taką strukturą:</w:t>
-        <w:br/>
-        <w:t xml:space="preserve">   (użyj $env:USERPROFILE żeby ścieżki były absolutne)</w:t>
+        <w:t>6. Uruchom /state-start → plik .claude/session-state.md zapisany</w:t>
         <w:br/>
         <w:br/>
-        <w:t xml:space="preserve">   $home = $env:USERPROFILE</w:t>
+        <w:t>Jeśli wszystko OK → powiedz "Środowisko gotowe!" i wyjaśnij w skrócie:</w:t>
         <w:br/>
-        <w:t xml:space="preserve">   $json = @"</w:t>
+        <w:t>- jak stworzyć pierwszy projekt (/setup-new-project)</w:t>
         <w:br/>
-        <w:t xml:space="preserve">   {</w:t>
+        <w:t>- kiedy używać /state-start i /catchup</w:t>
         <w:br/>
-        <w:t xml:space="preserve">     "model": "sonnet",</w:t>
-        <w:br/>
-        <w:t xml:space="preserve">     "statusLine": {</w:t>
-        <w:br/>
-        <w:t xml:space="preserve">       "type": "command",</w:t>
-        <w:br/>
-        <w:t xml:space="preserve">       "command": "bash $home/.claude/statusline-command.sh"</w:t>
-        <w:br/>
-        <w:t xml:space="preserve">     },</w:t>
-        <w:br/>
-        <w:t xml:space="preserve">     "hooks": {</w:t>
-        <w:br/>
-        <w:t xml:space="preserve">       "PreToolUse": [{</w:t>
-        <w:br/>
-        <w:t xml:space="preserve">         "matcher": "Write|Edit|Bash",</w:t>
-        <w:br/>
-        <w:t xml:space="preserve">         "hooks": [{ "type": "command",</w:t>
-        <w:br/>
-        <w:t xml:space="preserve">           "command": "python3 $home/.claude/hooks/security-scan.py" }]</w:t>
-        <w:br/>
-        <w:t xml:space="preserve">       }]</w:t>
-        <w:br/>
-        <w:t xml:space="preserve">     }</w:t>
-        <w:br/>
-        <w:t xml:space="preserve">   }</w:t>
-        <w:br/>
-        <w:t xml:space="preserve">   "@</w:t>
-        <w:br/>
-        <w:t xml:space="preserve">   $json | Set-Content $HOME/.claude/settings.json</w:t>
-        <w:br/>
-        <w:br/>
-        <w:t xml:space="preserve">   Sprawdź: Get-Content $HOME/.claude/settings.json</w:t>
-        <w:br/>
-        <w:t xml:space="preserve">   Ścieżki muszą zawierać pełną ścieżkę (C:\Users\...), nie ~.</w:t>
-        <w:br/>
-        <w:br/>
-        <w:t>10. Zapytaj o: język AI, GitHub username, ścieżka projektów.</w:t>
-        <w:br/>
-        <w:t xml:space="preserve">    Skopiuj setup/global-claude-template.md -&gt; $HOME/.claude/CLAUDE.md</w:t>
-        <w:br/>
-        <w:t xml:space="preserve">    i wypełnij miejsca oznaczone [[...]] moimi danymi.</w:t>
-        <w:br/>
-        <w:t>11. W $HOME/.claude/skills/setup-new-project/SKILL.md</w:t>
-        <w:br/>
-        <w:t xml:space="preserve">    zamień GITHUB_USERNAME na mój GitHub username.</w:t>
-        <w:br/>
-        <w:t>12. Weryfikacja końcowa:</w:t>
-        <w:br/>
-        <w:t xml:space="preserve">    Get-ChildItem $HOME/.claude/skills/</w:t>
-        <w:br/>
-        <w:t xml:space="preserve">    Get-Content $HOME/.claude/settings.json</w:t>
-        <w:br/>
-        <w:t xml:space="preserve">    Przetestuj /state-start — powinien zapisać stan sesji.</w:t>
-        <w:br/>
-        <w:br/>
-        <w:t>Na końcu powiedz jak stworzyć pierwszy projekt (/setup-new-project)</w:t>
-        <w:br/>
-        <w:t>i wytłumacz kiedy używać /state-start i /catchup.</w:t>
-        <w:br/>
-        <w:br/>
-        <w:t>Pełny opis kroków: setup/onboarding-prompt.md</w:t>
+        <w:t>Jeśli cokolwiek nie OK → napraw zanim zakończysz.</w:t>
       </w:r>
     </w:p>
     <w:p>

</xml_diff>